<commit_message>
Fundamentação teórica e objetivos
</commit_message>
<xml_diff>
--- a/relatorio.docx
+++ b/relatorio.docx
@@ -28,7 +28,7 @@
       <w:bookmarkStart w:id="9" w:name="_Toc223286530"/>
       <w:bookmarkStart w:id="10" w:name="_Toc1089226879"/>
       <w:bookmarkStart w:id="11" w:name="_Toc223680199"/>
-      <w:bookmarkStart w:id="12" w:name="_Toc225966497"/>
+      <w:bookmarkStart w:id="12" w:name="_Toc226397504"/>
       <w:r>
         <w:rPr>
           <w:rFonts w:ascii="Times New Roman" w:eastAsia="Times New Roman" w:hAnsi="Times New Roman" w:cs="Times New Roman"/>
@@ -147,7 +147,7 @@
           <w:szCs w:val="32"/>
         </w:rPr>
       </w:pPr>
-      <w:bookmarkStart w:id="13" w:name="_Toc225966498"/>
+      <w:bookmarkStart w:id="13" w:name="_Toc226397505"/>
       <w:r>
         <w:rPr>
           <w:rFonts w:ascii="Times New Roman" w:eastAsia="Times New Roman" w:hAnsi="Times New Roman" w:cs="Times New Roman"/>
@@ -544,7 +544,7 @@
     <w:sdt>
       <w:sdtPr>
         <w:rPr>
-          <w:rFonts w:ascii="Times New Roman" w:eastAsiaTheme="minorEastAsia" w:hAnsi="Times New Roman" w:cs="Times New Roman"/>
+          <w:rFonts w:asciiTheme="minorHAnsi" w:eastAsiaTheme="minorEastAsia" w:hAnsiTheme="minorHAnsi" w:cstheme="minorBidi"/>
           <w:color w:val="auto"/>
           <w:sz w:val="24"/>
           <w:szCs w:val="24"/>
@@ -563,9 +563,8 @@
             <w:pStyle w:val="TOCHeading"/>
             <w:jc w:val="center"/>
             <w:rPr>
-              <w:rFonts w:ascii="Times New Roman" w:hAnsi="Times New Roman" w:cs="Times New Roman"/>
-              <w:sz w:val="24"/>
-              <w:szCs w:val="24"/>
+              <w:rFonts w:hint="eastAsia"/>
+              <w:noProof/>
             </w:rPr>
           </w:pPr>
           <w:r>
@@ -576,40 +575,13 @@
             </w:rPr>
             <w:t>Sumário</w:t>
           </w:r>
-        </w:p>
-        <w:p>
-          <w:pPr>
-            <w:pStyle w:val="TOCHeading"/>
-            <w:jc w:val="center"/>
-            <w:rPr>
-              <w:rFonts w:ascii="Times New Roman" w:hAnsi="Times New Roman" w:cs="Times New Roman"/>
-              <w:noProof/>
-              <w:sz w:val="24"/>
-              <w:szCs w:val="24"/>
-            </w:rPr>
-          </w:pPr>
           <w:r>
-            <w:rPr>
-              <w:rFonts w:ascii="Times New Roman" w:hAnsi="Times New Roman" w:cs="Times New Roman"/>
-              <w:sz w:val="24"/>
-              <w:szCs w:val="24"/>
-            </w:rPr>
             <w:fldChar w:fldCharType="begin"/>
           </w:r>
           <w:r>
-            <w:rPr>
-              <w:rFonts w:ascii="Times New Roman" w:hAnsi="Times New Roman" w:cs="Times New Roman"/>
-              <w:sz w:val="24"/>
-              <w:szCs w:val="24"/>
-            </w:rPr>
             <w:instrText>TOC \o "1-2" \z \u \h</w:instrText>
           </w:r>
           <w:r>
-            <w:rPr>
-              <w:rFonts w:ascii="Times New Roman" w:hAnsi="Times New Roman" w:cs="Times New Roman"/>
-              <w:sz w:val="24"/>
-              <w:szCs w:val="24"/>
-            </w:rPr>
             <w:fldChar w:fldCharType="separate"/>
           </w:r>
         </w:p>
@@ -620,12 +592,14 @@
               <w:tab w:val="right" w:leader="dot" w:pos="9016"/>
             </w:tabs>
             <w:rPr>
-              <w:rFonts w:ascii="Times New Roman" w:eastAsiaTheme="minorEastAsia" w:hAnsi="Times New Roman" w:cs="Times New Roman"/>
+              <w:rFonts w:eastAsiaTheme="minorEastAsia"/>
               <w:noProof/>
+              <w:sz w:val="22"/>
+              <w:szCs w:val="22"/>
               <w:lang w:eastAsia="pt-BR"/>
             </w:rPr>
           </w:pPr>
-          <w:hyperlink w:anchor="_Toc225966499" w:history="1">
+          <w:hyperlink w:anchor="_Toc226397506" w:history="1">
             <w:r>
               <w:rPr>
                 <w:rStyle w:val="Hyperlink"/>
@@ -636,7 +610,6 @@
             </w:r>
             <w:r>
               <w:rPr>
-                <w:rFonts w:ascii="Times New Roman" w:hAnsi="Times New Roman" w:cs="Times New Roman"/>
                 <w:noProof/>
                 <w:webHidden/>
               </w:rPr>
@@ -644,7 +617,6 @@
             </w:r>
             <w:r>
               <w:rPr>
-                <w:rFonts w:ascii="Times New Roman" w:hAnsi="Times New Roman" w:cs="Times New Roman"/>
                 <w:noProof/>
                 <w:webHidden/>
               </w:rPr>
@@ -652,22 +624,19 @@
             </w:r>
             <w:r>
               <w:rPr>
-                <w:rFonts w:ascii="Times New Roman" w:hAnsi="Times New Roman" w:cs="Times New Roman"/>
                 <w:noProof/>
                 <w:webHidden/>
               </w:rPr>
-              <w:instrText xml:space="preserve"> PAGEREF _Toc225966499 \h </w:instrText>
+              <w:instrText xml:space="preserve"> PAGEREF _Toc226397506 \h </w:instrText>
             </w:r>
             <w:r>
               <w:rPr>
-                <w:rFonts w:ascii="Times New Roman" w:hAnsi="Times New Roman" w:cs="Times New Roman"/>
                 <w:noProof/>
                 <w:webHidden/>
               </w:rPr>
             </w:r>
             <w:r>
               <w:rPr>
-                <w:rFonts w:ascii="Times New Roman" w:hAnsi="Times New Roman" w:cs="Times New Roman"/>
                 <w:noProof/>
                 <w:webHidden/>
               </w:rPr>
@@ -675,7 +644,6 @@
             </w:r>
             <w:r>
               <w:rPr>
-                <w:rFonts w:ascii="Times New Roman" w:hAnsi="Times New Roman" w:cs="Times New Roman"/>
                 <w:noProof/>
                 <w:webHidden/>
               </w:rPr>
@@ -683,7 +651,6 @@
             </w:r>
             <w:r>
               <w:rPr>
-                <w:rFonts w:ascii="Times New Roman" w:hAnsi="Times New Roman" w:cs="Times New Roman"/>
                 <w:noProof/>
                 <w:webHidden/>
               </w:rPr>
@@ -698,12 +665,14 @@
               <w:tab w:val="right" w:leader="dot" w:pos="9016"/>
             </w:tabs>
             <w:rPr>
-              <w:rFonts w:ascii="Times New Roman" w:eastAsiaTheme="minorEastAsia" w:hAnsi="Times New Roman" w:cs="Times New Roman"/>
+              <w:rFonts w:eastAsiaTheme="minorEastAsia"/>
               <w:noProof/>
+              <w:sz w:val="22"/>
+              <w:szCs w:val="22"/>
               <w:lang w:eastAsia="pt-BR"/>
             </w:rPr>
           </w:pPr>
-          <w:hyperlink w:anchor="_Toc225966500" w:history="1">
+          <w:hyperlink w:anchor="_Toc226397507" w:history="1">
             <w:r>
               <w:rPr>
                 <w:rStyle w:val="Hyperlink"/>
@@ -714,7 +683,6 @@
             </w:r>
             <w:r>
               <w:rPr>
-                <w:rFonts w:ascii="Times New Roman" w:hAnsi="Times New Roman" w:cs="Times New Roman"/>
                 <w:noProof/>
                 <w:webHidden/>
               </w:rPr>
@@ -722,7 +690,6 @@
             </w:r>
             <w:r>
               <w:rPr>
-                <w:rFonts w:ascii="Times New Roman" w:hAnsi="Times New Roman" w:cs="Times New Roman"/>
                 <w:noProof/>
                 <w:webHidden/>
               </w:rPr>
@@ -730,22 +697,19 @@
             </w:r>
             <w:r>
               <w:rPr>
-                <w:rFonts w:ascii="Times New Roman" w:hAnsi="Times New Roman" w:cs="Times New Roman"/>
                 <w:noProof/>
                 <w:webHidden/>
               </w:rPr>
-              <w:instrText xml:space="preserve"> PAGEREF _Toc225966500 \h </w:instrText>
+              <w:instrText xml:space="preserve"> PAGEREF _Toc226397507 \h </w:instrText>
             </w:r>
             <w:r>
               <w:rPr>
-                <w:rFonts w:ascii="Times New Roman" w:hAnsi="Times New Roman" w:cs="Times New Roman"/>
                 <w:noProof/>
                 <w:webHidden/>
               </w:rPr>
             </w:r>
             <w:r>
               <w:rPr>
-                <w:rFonts w:ascii="Times New Roman" w:hAnsi="Times New Roman" w:cs="Times New Roman"/>
                 <w:noProof/>
                 <w:webHidden/>
               </w:rPr>
@@ -753,7 +717,6 @@
             </w:r>
             <w:r>
               <w:rPr>
-                <w:rFonts w:ascii="Times New Roman" w:hAnsi="Times New Roman" w:cs="Times New Roman"/>
                 <w:noProof/>
                 <w:webHidden/>
               </w:rPr>
@@ -761,7 +724,6 @@
             </w:r>
             <w:r>
               <w:rPr>
-                <w:rFonts w:ascii="Times New Roman" w:hAnsi="Times New Roman" w:cs="Times New Roman"/>
                 <w:noProof/>
                 <w:webHidden/>
               </w:rPr>
@@ -776,12 +738,87 @@
               <w:tab w:val="right" w:leader="dot" w:pos="9016"/>
             </w:tabs>
             <w:rPr>
-              <w:rFonts w:ascii="Times New Roman" w:eastAsiaTheme="minorEastAsia" w:hAnsi="Times New Roman" w:cs="Times New Roman"/>
+              <w:rFonts w:eastAsiaTheme="minorEastAsia"/>
               <w:noProof/>
+              <w:sz w:val="22"/>
+              <w:szCs w:val="22"/>
               <w:lang w:eastAsia="pt-BR"/>
             </w:rPr>
           </w:pPr>
-          <w:hyperlink w:anchor="_Toc225966501" w:history="1">
+          <w:hyperlink w:anchor="_Toc226397508" w:history="1">
+            <w:r>
+              <w:rPr>
+                <w:rStyle w:val="Hyperlink"/>
+                <w:rFonts w:ascii="Times New Roman" w:hAnsi="Times New Roman" w:cs="Times New Roman"/>
+                <w:noProof/>
+              </w:rPr>
+              <w:t>3 Objetivos</w:t>
+            </w:r>
+            <w:r>
+              <w:rPr>
+                <w:noProof/>
+                <w:webHidden/>
+              </w:rPr>
+              <w:tab/>
+            </w:r>
+            <w:r>
+              <w:rPr>
+                <w:noProof/>
+                <w:webHidden/>
+              </w:rPr>
+              <w:fldChar w:fldCharType="begin"/>
+            </w:r>
+            <w:r>
+              <w:rPr>
+                <w:noProof/>
+                <w:webHidden/>
+              </w:rPr>
+              <w:instrText xml:space="preserve"> PAGEREF _Toc226397508 \h </w:instrText>
+            </w:r>
+            <w:r>
+              <w:rPr>
+                <w:noProof/>
+                <w:webHidden/>
+              </w:rPr>
+            </w:r>
+            <w:r>
+              <w:rPr>
+                <w:noProof/>
+                <w:webHidden/>
+              </w:rPr>
+              <w:fldChar w:fldCharType="separate"/>
+            </w:r>
+            <w:r>
+              <w:rPr>
+                <w:noProof/>
+                <w:webHidden/>
+              </w:rPr>
+              <w:t>5</w:t>
+            </w:r>
+            <w:r>
+              <w:rPr>
+                <w:noProof/>
+                <w:webHidden/>
+              </w:rPr>
+              <w:fldChar w:fldCharType="end"/>
+            </w:r>
+          </w:hyperlink>
+        </w:p>
+        <w:p>
+          <w:pPr>
+            <w:pStyle w:val="TOC1"/>
+            <w:tabs>
+              <w:tab w:val="right" w:leader="dot" w:pos="9016"/>
+            </w:tabs>
+            <w:rPr>
+              <w:rFonts w:eastAsiaTheme="minorEastAsia"/>
+              <w:noProof/>
+              <w:sz w:val="22"/>
+              <w:szCs w:val="22"/>
+              <w:lang w:eastAsia="pt-BR"/>
+            </w:rPr>
+          </w:pPr>
+          <w:hyperlink w:anchor="_Toc226397509" w:history="1">
             <w:r>
               <w:rPr>
                 <w:rStyle w:val="Hyperlink"/>
@@ -795,7 +832,6 @@
             </w:r>
             <w:r>
               <w:rPr>
-                <w:rFonts w:ascii="Times New Roman" w:hAnsi="Times New Roman" w:cs="Times New Roman"/>
                 <w:noProof/>
                 <w:webHidden/>
               </w:rPr>
@@ -803,7 +839,6 @@
             </w:r>
             <w:r>
               <w:rPr>
-                <w:rFonts w:ascii="Times New Roman" w:hAnsi="Times New Roman" w:cs="Times New Roman"/>
                 <w:noProof/>
                 <w:webHidden/>
               </w:rPr>
@@ -811,22 +846,19 @@
             </w:r>
             <w:r>
               <w:rPr>
-                <w:rFonts w:ascii="Times New Roman" w:hAnsi="Times New Roman" w:cs="Times New Roman"/>
                 <w:noProof/>
                 <w:webHidden/>
               </w:rPr>
-              <w:instrText xml:space="preserve"> PAGEREF _Toc225966501 \h </w:instrText>
+              <w:instrText xml:space="preserve"> PAGEREF _Toc226397509 \h </w:instrText>
             </w:r>
             <w:r>
               <w:rPr>
-                <w:rFonts w:ascii="Times New Roman" w:hAnsi="Times New Roman" w:cs="Times New Roman"/>
                 <w:noProof/>
                 <w:webHidden/>
               </w:rPr>
             </w:r>
             <w:r>
               <w:rPr>
-                <w:rFonts w:ascii="Times New Roman" w:hAnsi="Times New Roman" w:cs="Times New Roman"/>
                 <w:noProof/>
                 <w:webHidden/>
               </w:rPr>
@@ -834,15 +866,13 @@
             </w:r>
             <w:r>
               <w:rPr>
-                <w:rFonts w:ascii="Times New Roman" w:hAnsi="Times New Roman" w:cs="Times New Roman"/>
                 <w:noProof/>
                 <w:webHidden/>
               </w:rPr>
-              <w:t>4</w:t>
+              <w:t>6</w:t>
             </w:r>
             <w:r>
               <w:rPr>
-                <w:rFonts w:ascii="Times New Roman" w:hAnsi="Times New Roman" w:cs="Times New Roman"/>
                 <w:noProof/>
                 <w:webHidden/>
               </w:rPr>
@@ -857,23 +887,30 @@
               <w:tab w:val="right" w:leader="dot" w:pos="9015"/>
             </w:tabs>
             <w:rPr>
-              <w:rFonts w:ascii="Times New Roman" w:eastAsiaTheme="minorEastAsia" w:hAnsi="Times New Roman" w:cs="Times New Roman"/>
+              <w:rFonts w:eastAsiaTheme="minorEastAsia" w:hint="eastAsia"/>
             </w:rPr>
           </w:pPr>
           <w:r>
-            <w:rPr>
-              <w:rFonts w:ascii="Times New Roman" w:hAnsi="Times New Roman" w:cs="Times New Roman"/>
-            </w:rPr>
             <w:fldChar w:fldCharType="end"/>
           </w:r>
         </w:p>
       </w:sdtContent>
     </w:sdt>
-    <w:p/>
+    <w:p>
+      <w:pPr>
+        <w:pStyle w:val="Heading1"/>
+        <w:rPr>
+          <w:rFonts w:ascii="Times New Roman" w:hAnsi="Times New Roman" w:cs="Times New Roman"/>
+          <w:sz w:val="24"/>
+          <w:szCs w:val="24"/>
+        </w:rPr>
+      </w:pPr>
+      <w:bookmarkStart w:id="14" w:name="_Toc226397506"/>
+    </w:p>
     <w:p/>
     <w:p>
-      <w:bookmarkStart w:id="14" w:name="_GoBack"/>
-      <w:bookmarkEnd w:id="14"/>
+      <w:bookmarkStart w:id="15" w:name="_GoBack"/>
+      <w:bookmarkEnd w:id="15"/>
     </w:p>
     <w:p/>
     <w:p/>
@@ -887,15 +924,13 @@
     <w:p/>
     <w:p/>
     <w:p/>
-    <w:p/>
-    <w:p/>
-    <w:p/>
-    <w:p/>
-    <w:p/>
     <w:p>
       <w:pPr>
-        <w:rPr>
-          <w:rFonts w:hint="eastAsia"/>
+        <w:pStyle w:val="Heading1"/>
+        <w:rPr>
+          <w:rFonts w:ascii="Times New Roman" w:hAnsi="Times New Roman" w:cs="Times New Roman"/>
+          <w:sz w:val="24"/>
+          <w:szCs w:val="24"/>
         </w:rPr>
       </w:pPr>
     </w:p>
@@ -908,20 +943,48 @@
           <w:szCs w:val="24"/>
         </w:rPr>
       </w:pPr>
-      <w:bookmarkStart w:id="15" w:name="_Toc225966499"/>
-      <w:r>
+    </w:p>
+    <w:p>
+      <w:pPr>
+        <w:pStyle w:val="Heading1"/>
         <w:rPr>
           <w:rFonts w:ascii="Times New Roman" w:hAnsi="Times New Roman" w:cs="Times New Roman"/>
           <w:sz w:val="24"/>
           <w:szCs w:val="24"/>
         </w:rPr>
-        <w:lastRenderedPageBreak/>
-        <w:t>1 Introdução</w:t>
-      </w:r>
-      <w:bookmarkEnd w:id="15"/>
+      </w:pPr>
     </w:p>
     <w:p>
       <w:pPr>
+        <w:pStyle w:val="Heading1"/>
+        <w:rPr>
+          <w:rFonts w:ascii="Times New Roman" w:hAnsi="Times New Roman" w:cs="Times New Roman"/>
+          <w:sz w:val="24"/>
+          <w:szCs w:val="24"/>
+        </w:rPr>
+      </w:pPr>
+    </w:p>
+    <w:p>
+      <w:pPr>
+        <w:pStyle w:val="Heading1"/>
+        <w:rPr>
+          <w:rFonts w:ascii="Times New Roman" w:hAnsi="Times New Roman" w:cs="Times New Roman"/>
+          <w:sz w:val="24"/>
+          <w:szCs w:val="24"/>
+        </w:rPr>
+      </w:pPr>
+      <w:r>
+        <w:rPr>
+          <w:rFonts w:ascii="Times New Roman" w:hAnsi="Times New Roman" w:cs="Times New Roman"/>
+          <w:sz w:val="24"/>
+          <w:szCs w:val="24"/>
+        </w:rPr>
+        <w:t>1 Introdução</w:t>
+      </w:r>
+      <w:bookmarkEnd w:id="14"/>
+    </w:p>
+    <w:p>
+      <w:pPr>
         <w:spacing w:before="240" w:after="240"/>
         <w:jc w:val="both"/>
         <w:rPr>
@@ -1092,7 +1155,7 @@
           <w:szCs w:val="24"/>
         </w:rPr>
       </w:pPr>
-      <w:bookmarkStart w:id="16" w:name="_Toc225966500"/>
+      <w:bookmarkStart w:id="16" w:name="_Toc226397507"/>
       <w:r>
         <w:rPr>
           <w:rFonts w:ascii="Times New Roman" w:hAnsi="Times New Roman" w:cs="Times New Roman"/>
@@ -1110,6 +1173,1582 @@
         <w:t>eórica</w:t>
       </w:r>
       <w:bookmarkEnd w:id="16"/>
+    </w:p>
+    <w:p>
+      <w:pPr>
+        <w:spacing w:after="240"/>
+        <w:jc w:val="both"/>
+        <w:rPr>
+          <w:rFonts w:ascii="Times New Roman" w:eastAsia="Times New Roman" w:hAnsi="Times New Roman" w:cs="Times New Roman"/>
+          <w:lang w:eastAsia="pt-BR"/>
+        </w:rPr>
+      </w:pPr>
+      <w:r>
+        <w:rPr>
+          <w:rFonts w:ascii="Times New Roman" w:hAnsi="Times New Roman" w:cs="Times New Roman"/>
+        </w:rPr>
+        <w:t xml:space="preserve">A Inteligência Artificial </w:t>
+      </w:r>
+      <w:r>
+        <w:rPr>
+          <w:rFonts w:ascii="Times New Roman" w:hAnsi="Times New Roman" w:cs="Times New Roman"/>
+        </w:rPr>
+        <w:t xml:space="preserve">é um campo da Computação que </w:t>
+      </w:r>
+      <w:r>
+        <w:rPr>
+          <w:rFonts w:ascii="Times New Roman" w:hAnsi="Times New Roman" w:cs="Times New Roman"/>
+        </w:rPr>
+        <w:t xml:space="preserve">consiste </w:t>
+      </w:r>
+      <w:r>
+        <w:rPr>
+          <w:rFonts w:ascii="Times New Roman" w:hAnsi="Times New Roman" w:cs="Times New Roman"/>
+        </w:rPr>
+        <w:t>no desenvolvimento de</w:t>
+      </w:r>
+      <w:r>
+        <w:rPr>
+          <w:rFonts w:ascii="Times New Roman" w:hAnsi="Times New Roman" w:cs="Times New Roman"/>
+        </w:rPr>
+        <w:t xml:space="preserve"> sistemas capazes de simular habilidades cognitivas humanas, como raciocínio, aprendizado e </w:t>
+      </w:r>
+      <w:r>
+        <w:rPr>
+          <w:rFonts w:ascii="Times New Roman" w:hAnsi="Times New Roman" w:cs="Times New Roman"/>
+        </w:rPr>
+        <w:lastRenderedPageBreak/>
+        <w:t xml:space="preserve">tomada de decisão. </w:t>
+      </w:r>
+      <w:r>
+        <w:rPr>
+          <w:rFonts w:ascii="Times New Roman" w:hAnsi="Times New Roman" w:cs="Times New Roman"/>
+        </w:rPr>
+        <w:t>Esses sistemas utilizam dados de entrada, organizados em conjuntos de dados (</w:t>
+      </w:r>
+      <w:r>
+        <w:rPr>
+          <w:rFonts w:ascii="Times New Roman" w:hAnsi="Times New Roman" w:cs="Times New Roman"/>
+          <w:i/>
+        </w:rPr>
+        <w:t>datasets</w:t>
+      </w:r>
+      <w:r>
+        <w:rPr>
+          <w:rFonts w:ascii="Times New Roman" w:hAnsi="Times New Roman" w:cs="Times New Roman"/>
+        </w:rPr>
+        <w:t>), a partir dos quais s</w:t>
+      </w:r>
+      <w:r>
+        <w:rPr>
+          <w:rFonts w:ascii="Times New Roman" w:hAnsi="Times New Roman" w:cs="Times New Roman" w:hint="cs"/>
+        </w:rPr>
+        <w:t>ã</w:t>
+      </w:r>
+      <w:r>
+        <w:rPr>
+          <w:rFonts w:ascii="Times New Roman" w:hAnsi="Times New Roman" w:cs="Times New Roman"/>
+        </w:rPr>
+        <w:t>o capazes de aprender e adaptar seu comportamento conforme novas informa</w:t>
+      </w:r>
+      <w:r>
+        <w:rPr>
+          <w:rFonts w:ascii="Times New Roman" w:hAnsi="Times New Roman" w:cs="Times New Roman" w:hint="cs"/>
+        </w:rPr>
+        <w:t>çõ</w:t>
+      </w:r>
+      <w:r>
+        <w:rPr>
+          <w:rFonts w:ascii="Times New Roman" w:hAnsi="Times New Roman" w:cs="Times New Roman"/>
+        </w:rPr>
+        <w:t>es s</w:t>
+      </w:r>
+      <w:r>
+        <w:rPr>
+          <w:rFonts w:ascii="Times New Roman" w:hAnsi="Times New Roman" w:cs="Times New Roman" w:hint="cs"/>
+        </w:rPr>
+        <w:t>ã</w:t>
+      </w:r>
+      <w:r>
+        <w:rPr>
+          <w:rFonts w:ascii="Times New Roman" w:hAnsi="Times New Roman" w:cs="Times New Roman"/>
+        </w:rPr>
+        <w:t xml:space="preserve">o processadas. </w:t>
+      </w:r>
+      <w:r>
+        <w:rPr>
+          <w:rFonts w:ascii="Times New Roman" w:hAnsi="Times New Roman" w:cs="Times New Roman"/>
+        </w:rPr>
+        <w:t xml:space="preserve">Esse conceito </w:t>
+      </w:r>
+      <w:r>
+        <w:rPr>
+          <w:rFonts w:ascii="Times New Roman" w:hAnsi="Times New Roman" w:cs="Times New Roman" w:hint="cs"/>
+        </w:rPr>
+        <w:t>é</w:t>
+      </w:r>
+      <w:r>
+        <w:rPr>
+          <w:rFonts w:ascii="Times New Roman" w:hAnsi="Times New Roman" w:cs="Times New Roman"/>
+        </w:rPr>
+        <w:t xml:space="preserve"> conhecido como Aprendizado de M</w:t>
+      </w:r>
+      <w:r>
+        <w:rPr>
+          <w:rFonts w:ascii="Times New Roman" w:hAnsi="Times New Roman" w:cs="Times New Roman" w:hint="cs"/>
+        </w:rPr>
+        <w:t>á</w:t>
+      </w:r>
+      <w:r>
+        <w:rPr>
+          <w:rFonts w:ascii="Times New Roman" w:hAnsi="Times New Roman" w:cs="Times New Roman"/>
+        </w:rPr>
+        <w:t>quina (</w:t>
+      </w:r>
+      <w:r>
+        <w:rPr>
+          <w:rFonts w:ascii="Times New Roman" w:hAnsi="Times New Roman" w:cs="Times New Roman"/>
+          <w:i/>
+        </w:rPr>
+        <w:t>Machine Learning</w:t>
+      </w:r>
+      <w:r>
+        <w:rPr>
+          <w:rFonts w:ascii="Times New Roman" w:hAnsi="Times New Roman" w:cs="Times New Roman"/>
+        </w:rPr>
+        <w:t>)</w:t>
+      </w:r>
+      <w:r>
+        <w:rPr>
+          <w:rFonts w:ascii="Times New Roman" w:eastAsia="Times New Roman" w:hAnsi="Times New Roman" w:cs="Times New Roman"/>
+          <w:lang w:eastAsia="pt-BR"/>
+        </w:rPr>
+        <w:t>.</w:t>
+      </w:r>
+      <w:r>
+        <w:rPr>
+          <w:rFonts w:ascii="Times New Roman" w:eastAsia="Times New Roman" w:hAnsi="Times New Roman" w:cs="Times New Roman"/>
+          <w:lang w:eastAsia="pt-BR"/>
+        </w:rPr>
+        <w:t xml:space="preserve"> </w:t>
+      </w:r>
+      <w:r>
+        <w:rPr>
+          <w:rFonts w:ascii="Times New Roman" w:eastAsia="Times New Roman" w:hAnsi="Times New Roman" w:cs="Times New Roman"/>
+          <w:lang w:eastAsia="pt-BR"/>
+        </w:rPr>
+        <w:t xml:space="preserve">Um de seus subconjuntos </w:t>
+      </w:r>
+      <w:r>
+        <w:rPr>
+          <w:rFonts w:ascii="Times New Roman" w:eastAsia="Times New Roman" w:hAnsi="Times New Roman" w:cs="Times New Roman" w:hint="cs"/>
+          <w:lang w:eastAsia="pt-BR"/>
+        </w:rPr>
+        <w:t>é</w:t>
+      </w:r>
+      <w:r>
+        <w:rPr>
+          <w:rFonts w:ascii="Times New Roman" w:eastAsia="Times New Roman" w:hAnsi="Times New Roman" w:cs="Times New Roman"/>
+          <w:lang w:eastAsia="pt-BR"/>
+        </w:rPr>
+        <w:t xml:space="preserve"> o Aprendizado Profundo (</w:t>
+      </w:r>
+      <w:r>
+        <w:rPr>
+          <w:rFonts w:ascii="Times New Roman" w:eastAsia="Times New Roman" w:hAnsi="Times New Roman" w:cs="Times New Roman"/>
+          <w:i/>
+          <w:lang w:eastAsia="pt-BR"/>
+        </w:rPr>
+        <w:t>Deep Learning</w:t>
+      </w:r>
+      <w:r>
+        <w:rPr>
+          <w:rFonts w:ascii="Times New Roman" w:eastAsia="Times New Roman" w:hAnsi="Times New Roman" w:cs="Times New Roman"/>
+          <w:lang w:eastAsia="pt-BR"/>
+        </w:rPr>
+        <w:t>),</w:t>
+      </w:r>
+      <w:r>
+        <w:rPr>
+          <w:rFonts w:ascii="Times New Roman" w:eastAsia="Times New Roman" w:hAnsi="Times New Roman" w:cs="Times New Roman"/>
+          <w:lang w:eastAsia="pt-BR"/>
+        </w:rPr>
+        <w:t xml:space="preserve"> </w:t>
+      </w:r>
+      <w:r>
+        <w:rPr>
+          <w:rFonts w:ascii="Times New Roman" w:eastAsia="Times New Roman" w:hAnsi="Times New Roman" w:cs="Times New Roman"/>
+          <w:lang w:eastAsia="pt-BR"/>
+        </w:rPr>
+        <w:t>caracterizado</w:t>
+      </w:r>
+      <w:r>
+        <w:rPr>
+          <w:rFonts w:ascii="Times New Roman" w:eastAsia="Times New Roman" w:hAnsi="Times New Roman" w:cs="Times New Roman"/>
+          <w:lang w:eastAsia="pt-BR"/>
+        </w:rPr>
+        <w:t xml:space="preserve"> pelo uso de </w:t>
+      </w:r>
+      <w:r>
+        <w:rPr>
+          <w:rFonts w:ascii="Times New Roman" w:eastAsia="Times New Roman" w:hAnsi="Times New Roman" w:cs="Times New Roman"/>
+          <w:lang w:eastAsia="pt-BR"/>
+        </w:rPr>
+        <w:t>Redes Neurais A</w:t>
+      </w:r>
+      <w:r>
+        <w:rPr>
+          <w:rFonts w:ascii="Times New Roman" w:eastAsia="Times New Roman" w:hAnsi="Times New Roman" w:cs="Times New Roman"/>
+          <w:lang w:eastAsia="pt-BR"/>
+        </w:rPr>
+        <w:t>rtificiais</w:t>
+      </w:r>
+      <w:r>
+        <w:rPr>
+          <w:rFonts w:ascii="Times New Roman" w:eastAsia="Times New Roman" w:hAnsi="Times New Roman" w:cs="Times New Roman"/>
+          <w:lang w:eastAsia="pt-BR"/>
+        </w:rPr>
+        <w:t xml:space="preserve"> (RNA</w:t>
+      </w:r>
+      <w:r>
+        <w:rPr>
+          <w:rFonts w:ascii="Times New Roman" w:eastAsia="Times New Roman" w:hAnsi="Times New Roman" w:cs="Times New Roman"/>
+          <w:lang w:eastAsia="pt-BR"/>
+        </w:rPr>
+        <w:t>s</w:t>
+      </w:r>
+      <w:r>
+        <w:rPr>
+          <w:rFonts w:ascii="Times New Roman" w:eastAsia="Times New Roman" w:hAnsi="Times New Roman" w:cs="Times New Roman"/>
+          <w:lang w:eastAsia="pt-BR"/>
+        </w:rPr>
+        <w:t>)</w:t>
+      </w:r>
+      <w:r>
+        <w:rPr>
+          <w:rFonts w:ascii="Times New Roman" w:eastAsia="Times New Roman" w:hAnsi="Times New Roman" w:cs="Times New Roman"/>
+          <w:lang w:eastAsia="pt-BR"/>
+        </w:rPr>
+        <w:t>. E</w:t>
+      </w:r>
+      <w:r>
+        <w:rPr>
+          <w:rFonts w:ascii="Times New Roman" w:eastAsia="Times New Roman" w:hAnsi="Times New Roman" w:cs="Times New Roman"/>
+          <w:lang w:eastAsia="pt-BR"/>
+        </w:rPr>
+        <w:t xml:space="preserve">ssas redes possuem elevada capacidade de aprendizado e são amplamente utilizadas em aplicações </w:t>
+      </w:r>
+      <w:r>
+        <w:rPr>
+          <w:rFonts w:ascii="Times New Roman" w:eastAsia="Times New Roman" w:hAnsi="Times New Roman" w:cs="Times New Roman"/>
+          <w:lang w:eastAsia="pt-BR"/>
+        </w:rPr>
+        <w:t xml:space="preserve">como reconhecimento de imagens, </w:t>
+      </w:r>
+      <w:r>
+        <w:rPr>
+          <w:rFonts w:ascii="Times New Roman" w:eastAsia="Times New Roman" w:hAnsi="Times New Roman" w:cs="Times New Roman"/>
+          <w:lang w:eastAsia="pt-BR"/>
+        </w:rPr>
+        <w:t xml:space="preserve">reconhecimento </w:t>
+      </w:r>
+      <w:r>
+        <w:rPr>
+          <w:rFonts w:ascii="Times New Roman" w:eastAsia="Times New Roman" w:hAnsi="Times New Roman" w:cs="Times New Roman"/>
+          <w:lang w:eastAsia="pt-BR"/>
+        </w:rPr>
+        <w:t>de voz e processamento de linguagem natural [3].</w:t>
+      </w:r>
+    </w:p>
+    <w:p>
+      <w:pPr>
+        <w:spacing w:before="100" w:beforeAutospacing="1" w:after="100" w:afterAutospacing="1" w:line="240" w:lineRule="auto"/>
+        <w:jc w:val="both"/>
+        <w:rPr>
+          <w:rFonts w:ascii="Times New Roman" w:eastAsia="Times New Roman" w:hAnsi="Times New Roman" w:cs="Times New Roman"/>
+          <w:lang w:eastAsia="pt-BR"/>
+        </w:rPr>
+      </w:pPr>
+      <w:r>
+        <w:rPr>
+          <w:rFonts w:ascii="Times New Roman" w:eastAsia="Times New Roman" w:hAnsi="Times New Roman" w:cs="Times New Roman"/>
+          <w:lang w:eastAsia="pt-BR"/>
+        </w:rPr>
+        <w:t xml:space="preserve">De forma geral, uma RNA é constituída por camadas de neurônios organizadas em três tipos principais: camada de entrada, camadas ocultas e camada de saída. </w:t>
+      </w:r>
+      <w:r>
+        <w:rPr>
+          <w:rFonts w:ascii="Times New Roman" w:eastAsia="Times New Roman" w:hAnsi="Times New Roman" w:cs="Times New Roman"/>
+          <w:lang w:eastAsia="pt-BR"/>
+        </w:rPr>
+        <w:t>Cada neur</w:t>
+      </w:r>
+      <w:r>
+        <w:rPr>
+          <w:rFonts w:ascii="Times New Roman" w:eastAsia="Times New Roman" w:hAnsi="Times New Roman" w:cs="Times New Roman" w:hint="cs"/>
+          <w:lang w:eastAsia="pt-BR"/>
+        </w:rPr>
+        <w:t>ô</w:t>
+      </w:r>
+      <w:r>
+        <w:rPr>
+          <w:rFonts w:ascii="Times New Roman" w:eastAsia="Times New Roman" w:hAnsi="Times New Roman" w:cs="Times New Roman"/>
+          <w:lang w:eastAsia="pt-BR"/>
+        </w:rPr>
+        <w:t>nio artificial realiza uma opera</w:t>
+      </w:r>
+      <w:r>
+        <w:rPr>
+          <w:rFonts w:ascii="Times New Roman" w:eastAsia="Times New Roman" w:hAnsi="Times New Roman" w:cs="Times New Roman" w:hint="cs"/>
+          <w:lang w:eastAsia="pt-BR"/>
+        </w:rPr>
+        <w:t>çã</w:t>
+      </w:r>
+      <w:r>
+        <w:rPr>
+          <w:rFonts w:ascii="Times New Roman" w:eastAsia="Times New Roman" w:hAnsi="Times New Roman" w:cs="Times New Roman"/>
+          <w:lang w:eastAsia="pt-BR"/>
+        </w:rPr>
+        <w:t>o composta por tr</w:t>
+      </w:r>
+      <w:r>
+        <w:rPr>
+          <w:rFonts w:ascii="Times New Roman" w:eastAsia="Times New Roman" w:hAnsi="Times New Roman" w:cs="Times New Roman" w:hint="cs"/>
+          <w:lang w:eastAsia="pt-BR"/>
+        </w:rPr>
+        <w:t>ê</w:t>
+      </w:r>
+      <w:r>
+        <w:rPr>
+          <w:rFonts w:ascii="Times New Roman" w:eastAsia="Times New Roman" w:hAnsi="Times New Roman" w:cs="Times New Roman"/>
+          <w:lang w:eastAsia="pt-BR"/>
+        </w:rPr>
+        <w:t>s etapas principais: combina</w:t>
+      </w:r>
+      <w:r>
+        <w:rPr>
+          <w:rFonts w:ascii="Times New Roman" w:eastAsia="Times New Roman" w:hAnsi="Times New Roman" w:cs="Times New Roman" w:hint="cs"/>
+          <w:lang w:eastAsia="pt-BR"/>
+        </w:rPr>
+        <w:t>çã</w:t>
+      </w:r>
+      <w:r>
+        <w:rPr>
+          <w:rFonts w:ascii="Times New Roman" w:eastAsia="Times New Roman" w:hAnsi="Times New Roman" w:cs="Times New Roman"/>
+          <w:lang w:eastAsia="pt-BR"/>
+        </w:rPr>
+        <w:t>o linear das entradas, na qual s</w:t>
+      </w:r>
+      <w:r>
+        <w:rPr>
+          <w:rFonts w:ascii="Times New Roman" w:eastAsia="Times New Roman" w:hAnsi="Times New Roman" w:cs="Times New Roman" w:hint="cs"/>
+          <w:lang w:eastAsia="pt-BR"/>
+        </w:rPr>
+        <w:t>ã</w:t>
+      </w:r>
+      <w:r>
+        <w:rPr>
+          <w:rFonts w:ascii="Times New Roman" w:eastAsia="Times New Roman" w:hAnsi="Times New Roman" w:cs="Times New Roman"/>
+          <w:lang w:eastAsia="pt-BR"/>
+        </w:rPr>
+        <w:t>o aplicados os pesos sin</w:t>
+      </w:r>
+      <w:r>
+        <w:rPr>
+          <w:rFonts w:ascii="Times New Roman" w:eastAsia="Times New Roman" w:hAnsi="Times New Roman" w:cs="Times New Roman" w:hint="cs"/>
+          <w:lang w:eastAsia="pt-BR"/>
+        </w:rPr>
+        <w:t>á</w:t>
+      </w:r>
+      <w:r>
+        <w:rPr>
+          <w:rFonts w:ascii="Times New Roman" w:eastAsia="Times New Roman" w:hAnsi="Times New Roman" w:cs="Times New Roman"/>
+          <w:lang w:eastAsia="pt-BR"/>
+        </w:rPr>
+        <w:t>pticos; adi</w:t>
+      </w:r>
+      <w:r>
+        <w:rPr>
+          <w:rFonts w:ascii="Times New Roman" w:eastAsia="Times New Roman" w:hAnsi="Times New Roman" w:cs="Times New Roman" w:hint="cs"/>
+          <w:lang w:eastAsia="pt-BR"/>
+        </w:rPr>
+        <w:t>çã</w:t>
+      </w:r>
+      <w:r>
+        <w:rPr>
+          <w:rFonts w:ascii="Times New Roman" w:eastAsia="Times New Roman" w:hAnsi="Times New Roman" w:cs="Times New Roman"/>
+          <w:lang w:eastAsia="pt-BR"/>
+        </w:rPr>
+        <w:t>o de um termo de polariza</w:t>
+      </w:r>
+      <w:r>
+        <w:rPr>
+          <w:rFonts w:ascii="Times New Roman" w:eastAsia="Times New Roman" w:hAnsi="Times New Roman" w:cs="Times New Roman" w:hint="cs"/>
+          <w:lang w:eastAsia="pt-BR"/>
+        </w:rPr>
+        <w:t>çã</w:t>
+      </w:r>
+      <w:r>
+        <w:rPr>
+          <w:rFonts w:ascii="Times New Roman" w:eastAsia="Times New Roman" w:hAnsi="Times New Roman" w:cs="Times New Roman"/>
+          <w:lang w:eastAsia="pt-BR"/>
+        </w:rPr>
+        <w:t>o (</w:t>
+      </w:r>
+      <w:r>
+        <w:rPr>
+          <w:rFonts w:ascii="Times New Roman" w:eastAsia="Times New Roman" w:hAnsi="Times New Roman" w:cs="Times New Roman"/>
+          <w:i/>
+          <w:lang w:eastAsia="pt-BR"/>
+        </w:rPr>
+        <w:t>bias</w:t>
+      </w:r>
+      <w:r>
+        <w:rPr>
+          <w:rFonts w:ascii="Times New Roman" w:eastAsia="Times New Roman" w:hAnsi="Times New Roman" w:cs="Times New Roman"/>
+          <w:lang w:eastAsia="pt-BR"/>
+        </w:rPr>
+        <w:t>); e aplica</w:t>
+      </w:r>
+      <w:r>
+        <w:rPr>
+          <w:rFonts w:ascii="Times New Roman" w:eastAsia="Times New Roman" w:hAnsi="Times New Roman" w:cs="Times New Roman" w:hint="cs"/>
+          <w:lang w:eastAsia="pt-BR"/>
+        </w:rPr>
+        <w:t>çã</w:t>
+      </w:r>
+      <w:r>
+        <w:rPr>
+          <w:rFonts w:ascii="Times New Roman" w:eastAsia="Times New Roman" w:hAnsi="Times New Roman" w:cs="Times New Roman"/>
+          <w:lang w:eastAsia="pt-BR"/>
+        </w:rPr>
+        <w:t>o de uma fun</w:t>
+      </w:r>
+      <w:r>
+        <w:rPr>
+          <w:rFonts w:ascii="Times New Roman" w:eastAsia="Times New Roman" w:hAnsi="Times New Roman" w:cs="Times New Roman" w:hint="cs"/>
+          <w:lang w:eastAsia="pt-BR"/>
+        </w:rPr>
+        <w:t>çã</w:t>
+      </w:r>
+      <w:r>
+        <w:rPr>
+          <w:rFonts w:ascii="Times New Roman" w:eastAsia="Times New Roman" w:hAnsi="Times New Roman" w:cs="Times New Roman"/>
+          <w:lang w:eastAsia="pt-BR"/>
+        </w:rPr>
+        <w:t>o de ativa</w:t>
+      </w:r>
+      <w:r>
+        <w:rPr>
+          <w:rFonts w:ascii="Times New Roman" w:eastAsia="Times New Roman" w:hAnsi="Times New Roman" w:cs="Times New Roman" w:hint="cs"/>
+          <w:lang w:eastAsia="pt-BR"/>
+        </w:rPr>
+        <w:t>çã</w:t>
+      </w:r>
+      <w:r>
+        <w:rPr>
+          <w:rFonts w:ascii="Times New Roman" w:eastAsia="Times New Roman" w:hAnsi="Times New Roman" w:cs="Times New Roman"/>
+          <w:lang w:eastAsia="pt-BR"/>
+        </w:rPr>
+        <w:t>o</w:t>
+      </w:r>
+      <w:r>
+        <w:rPr>
+          <w:rFonts w:ascii="Times New Roman" w:eastAsia="Times New Roman" w:hAnsi="Times New Roman" w:cs="Times New Roman"/>
+          <w:lang w:eastAsia="pt-BR"/>
+        </w:rPr>
+        <w:t>. Matematicamente, a saída de um neurônio pode ser descrita como:</w:t>
+      </w:r>
+    </w:p>
+    <w:p>
+      <w:pPr>
+        <w:spacing w:before="100" w:beforeAutospacing="1" w:after="100" w:afterAutospacing="1" w:line="240" w:lineRule="auto"/>
+        <w:jc w:val="both"/>
+        <w:rPr>
+          <w:rFonts w:ascii="Times New Roman" w:eastAsia="Times New Roman" w:hAnsi="Times New Roman" w:cs="Times New Roman"/>
+          <w:lang w:eastAsia="pt-BR"/>
+        </w:rPr>
+      </w:pPr>
+      <m:oMathPara>
+        <m:oMath>
+          <m:sSub>
+            <m:sSubPr>
+              <m:ctrlPr>
+                <w:rPr>
+                  <w:rFonts w:ascii="Cambria Math" w:eastAsia="Times New Roman" w:hAnsi="Cambria Math" w:cs="Times New Roman"/>
+                  <w:lang w:eastAsia="pt-BR"/>
+                </w:rPr>
+              </m:ctrlPr>
+            </m:sSubPr>
+            <m:e>
+              <m:r>
+                <w:rPr>
+                  <w:rFonts w:ascii="Cambria Math" w:eastAsia="Times New Roman" w:hAnsi="Cambria Math" w:cs="Times New Roman"/>
+                  <w:lang w:eastAsia="pt-BR"/>
+                </w:rPr>
+                <m:t>y</m:t>
+              </m:r>
+            </m:e>
+            <m:sub>
+              <m:r>
+                <w:rPr>
+                  <w:rFonts w:ascii="Cambria Math" w:eastAsia="Times New Roman" w:hAnsi="Cambria Math" w:cs="Times New Roman"/>
+                  <w:lang w:eastAsia="pt-BR"/>
+                </w:rPr>
+                <m:t>k</m:t>
+              </m:r>
+            </m:sub>
+          </m:sSub>
+          <m:r>
+            <w:rPr>
+              <w:rFonts w:ascii="Cambria Math" w:eastAsia="Cambria Math" w:hAnsi="Cambria Math" w:cs="Cambria Math"/>
+              <w:lang w:eastAsia="pt-BR"/>
+            </w:rPr>
+            <m:t>=AF</m:t>
+          </m:r>
+          <m:d>
+            <m:dPr>
+              <m:ctrlPr>
+                <w:rPr>
+                  <w:rFonts w:ascii="Cambria Math" w:eastAsia="Cambria Math" w:hAnsi="Cambria Math" w:cs="Cambria Math"/>
+                  <w:i/>
+                  <w:lang w:eastAsia="pt-BR"/>
+                </w:rPr>
+              </m:ctrlPr>
+            </m:dPr>
+            <m:e>
+              <m:nary>
+                <m:naryPr>
+                  <m:chr m:val="∑"/>
+                  <m:grow m:val="1"/>
+                  <m:ctrlPr>
+                    <w:rPr>
+                      <w:rFonts w:ascii="Cambria Math" w:eastAsia="Times New Roman" w:hAnsi="Cambria Math" w:cs="Times New Roman"/>
+                      <w:lang w:eastAsia="pt-BR"/>
+                    </w:rPr>
+                  </m:ctrlPr>
+                </m:naryPr>
+                <m:sub>
+                  <m:r>
+                    <w:rPr>
+                      <w:rFonts w:ascii="Cambria Math" w:eastAsia="Cambria Math" w:hAnsi="Cambria Math" w:cs="Cambria Math"/>
+                      <w:lang w:eastAsia="pt-BR"/>
+                    </w:rPr>
+                    <m:t>i=1</m:t>
+                  </m:r>
+                </m:sub>
+                <m:sup>
+                  <m:r>
+                    <w:rPr>
+                      <w:rFonts w:ascii="Cambria Math" w:eastAsia="Cambria Math" w:hAnsi="Cambria Math" w:cs="Cambria Math"/>
+                      <w:lang w:eastAsia="pt-BR"/>
+                    </w:rPr>
+                    <m:t>n</m:t>
+                  </m:r>
+                </m:sup>
+                <m:e>
+                  <m:sSub>
+                    <m:sSubPr>
+                      <m:ctrlPr>
+                        <w:rPr>
+                          <w:rFonts w:ascii="Cambria Math" w:eastAsia="Times New Roman" w:hAnsi="Cambria Math" w:cs="Times New Roman"/>
+                          <w:lang w:eastAsia="pt-BR"/>
+                        </w:rPr>
+                      </m:ctrlPr>
+                    </m:sSubPr>
+                    <m:e>
+                      <m:r>
+                        <w:rPr>
+                          <w:rFonts w:ascii="Cambria Math" w:eastAsia="Times New Roman" w:hAnsi="Cambria Math" w:cs="Times New Roman"/>
+                          <w:lang w:eastAsia="pt-BR"/>
+                        </w:rPr>
+                        <m:t>(y</m:t>
+                      </m:r>
+                    </m:e>
+                    <m:sub>
+                      <m:r>
+                        <w:rPr>
+                          <w:rFonts w:ascii="Cambria Math" w:eastAsia="Times New Roman" w:hAnsi="Cambria Math" w:cs="Times New Roman"/>
+                          <w:lang w:eastAsia="pt-BR"/>
+                        </w:rPr>
+                        <m:t>i</m:t>
+                      </m:r>
+                    </m:sub>
+                  </m:sSub>
+                  <m:r>
+                    <w:rPr>
+                      <w:rFonts w:ascii="Cambria Math" w:eastAsia="Times New Roman" w:hAnsi="Cambria Math" w:cs="Times New Roman"/>
+                      <w:lang w:eastAsia="pt-BR"/>
+                    </w:rPr>
+                    <m:t>.</m:t>
+                  </m:r>
+                  <m:sSub>
+                    <m:sSubPr>
+                      <m:ctrlPr>
+                        <w:rPr>
+                          <w:rFonts w:ascii="Cambria Math" w:eastAsia="Times New Roman" w:hAnsi="Cambria Math" w:cs="Times New Roman"/>
+                          <w:lang w:eastAsia="pt-BR"/>
+                        </w:rPr>
+                      </m:ctrlPr>
+                    </m:sSubPr>
+                    <m:e>
+                      <m:r>
+                        <w:rPr>
+                          <w:rFonts w:ascii="Cambria Math" w:eastAsia="Times New Roman" w:hAnsi="Cambria Math" w:cs="Times New Roman"/>
+                          <w:lang w:eastAsia="pt-BR"/>
+                        </w:rPr>
+                        <m:t>w</m:t>
+                      </m:r>
+                    </m:e>
+                    <m:sub>
+                      <m:r>
+                        <w:rPr>
+                          <w:rFonts w:ascii="Cambria Math" w:eastAsia="Times New Roman" w:hAnsi="Cambria Math" w:cs="Times New Roman"/>
+                          <w:lang w:eastAsia="pt-BR"/>
+                        </w:rPr>
+                        <m:t>ki</m:t>
+                      </m:r>
+                    </m:sub>
+                  </m:sSub>
+                </m:e>
+              </m:nary>
+              <m:ctrlPr>
+                <w:rPr>
+                  <w:rFonts w:ascii="Cambria Math" w:eastAsia="Times New Roman" w:hAnsi="Cambria Math" w:cs="Times New Roman"/>
+                  <w:i/>
+                  <w:lang w:eastAsia="pt-BR"/>
+                </w:rPr>
+              </m:ctrlPr>
+            </m:e>
+          </m:d>
+          <m:r>
+            <w:rPr>
+              <w:rFonts w:ascii="Cambria Math" w:eastAsia="Times New Roman" w:hAnsi="Cambria Math" w:cs="Times New Roman"/>
+              <w:lang w:eastAsia="pt-BR"/>
+            </w:rPr>
+            <m:t>+</m:t>
+          </m:r>
+          <m:sSub>
+            <m:sSubPr>
+              <m:ctrlPr>
+                <w:rPr>
+                  <w:rFonts w:ascii="Cambria Math" w:eastAsia="Times New Roman" w:hAnsi="Cambria Math" w:cs="Times New Roman"/>
+                  <w:lang w:eastAsia="pt-BR"/>
+                </w:rPr>
+              </m:ctrlPr>
+            </m:sSubPr>
+            <m:e>
+              <m:r>
+                <w:rPr>
+                  <w:rFonts w:ascii="Cambria Math" w:eastAsia="Times New Roman" w:hAnsi="Cambria Math" w:cs="Times New Roman"/>
+                  <w:lang w:eastAsia="pt-BR"/>
+                </w:rPr>
+                <m:t>b</m:t>
+              </m:r>
+            </m:e>
+            <m:sub>
+              <m:r>
+                <w:rPr>
+                  <w:rFonts w:ascii="Cambria Math" w:eastAsia="Times New Roman" w:hAnsi="Cambria Math" w:cs="Times New Roman"/>
+                  <w:lang w:eastAsia="pt-BR"/>
+                </w:rPr>
+                <m:t>k</m:t>
+              </m:r>
+            </m:sub>
+          </m:sSub>
+          <m:r>
+            <w:rPr>
+              <w:rFonts w:ascii="Cambria Math" w:eastAsia="Times New Roman" w:hAnsi="Cambria Math" w:cs="Times New Roman"/>
+              <w:lang w:eastAsia="pt-BR"/>
+            </w:rPr>
+            <m:t>)</m:t>
+          </m:r>
+        </m:oMath>
+      </m:oMathPara>
+    </w:p>
+    <w:p>
+      <w:pPr>
+        <w:spacing w:before="100" w:beforeAutospacing="1" w:after="100" w:afterAutospacing="1" w:line="240" w:lineRule="auto"/>
+        <w:jc w:val="both"/>
+        <w:rPr>
+          <w:rFonts w:ascii="Times New Roman" w:eastAsia="Times New Roman" w:hAnsi="Times New Roman" w:cs="Times New Roman"/>
+          <w:lang w:eastAsia="pt-BR"/>
+        </w:rPr>
+      </w:pPr>
+      <w:r>
+        <w:rPr>
+          <w:rFonts w:ascii="Times New Roman" w:hAnsi="Times New Roman" w:cs="Times New Roman"/>
+        </w:rPr>
+        <w:t>O</w:t>
+      </w:r>
+      <w:r>
+        <w:rPr>
+          <w:rFonts w:ascii="Times New Roman" w:hAnsi="Times New Roman" w:cs="Times New Roman"/>
+        </w:rPr>
+        <w:t xml:space="preserve">nde </w:t>
+      </w:r>
+      <m:oMath>
+        <m:sSub>
+          <m:sSubPr>
+            <m:ctrlPr>
+              <w:rPr>
+                <w:rFonts w:ascii="Cambria Math" w:eastAsia="Times New Roman" w:hAnsi="Cambria Math" w:cs="Times New Roman"/>
+                <w:lang w:eastAsia="pt-BR"/>
+              </w:rPr>
+            </m:ctrlPr>
+          </m:sSubPr>
+          <m:e>
+            <m:r>
+              <w:rPr>
+                <w:rFonts w:ascii="Cambria Math" w:eastAsia="Times New Roman" w:hAnsi="Cambria Math" w:cs="Times New Roman"/>
+                <w:lang w:eastAsia="pt-BR"/>
+              </w:rPr>
+              <m:t>y</m:t>
+            </m:r>
+          </m:e>
+          <m:sub>
+            <m:r>
+              <w:rPr>
+                <w:rFonts w:ascii="Cambria Math" w:eastAsia="Times New Roman" w:hAnsi="Cambria Math" w:cs="Times New Roman"/>
+                <w:lang w:eastAsia="pt-BR"/>
+              </w:rPr>
+              <m:t>i</m:t>
+            </m:r>
+          </m:sub>
+        </m:sSub>
+      </m:oMath>
+      <w:r>
+        <w:rPr>
+          <w:rStyle w:val="vlist-s"/>
+          <w:rFonts w:ascii="Times New Roman" w:hAnsi="Times New Roman" w:cs="Times New Roman"/>
+        </w:rPr>
+        <w:t>​</w:t>
+      </w:r>
+      <w:r>
+        <w:rPr>
+          <w:rFonts w:ascii="Times New Roman" w:hAnsi="Times New Roman" w:cs="Times New Roman"/>
+        </w:rPr>
+        <w:t xml:space="preserve"> representa as entradas do neurônio, </w:t>
+      </w:r>
+      <m:oMath>
+        <m:sSub>
+          <m:sSubPr>
+            <m:ctrlPr>
+              <w:rPr>
+                <w:rFonts w:ascii="Cambria Math" w:eastAsia="Times New Roman" w:hAnsi="Cambria Math" w:cs="Times New Roman"/>
+                <w:lang w:eastAsia="pt-BR"/>
+              </w:rPr>
+            </m:ctrlPr>
+          </m:sSubPr>
+          <m:e>
+            <m:r>
+              <w:rPr>
+                <w:rFonts w:ascii="Cambria Math" w:eastAsia="Times New Roman" w:hAnsi="Cambria Math" w:cs="Times New Roman"/>
+                <w:lang w:eastAsia="pt-BR"/>
+              </w:rPr>
+              <m:t>w</m:t>
+            </m:r>
+          </m:e>
+          <m:sub>
+            <m:r>
+              <w:rPr>
+                <w:rFonts w:ascii="Cambria Math" w:eastAsia="Times New Roman" w:hAnsi="Cambria Math" w:cs="Times New Roman"/>
+                <w:lang w:eastAsia="pt-BR"/>
+              </w:rPr>
+              <m:t>ki</m:t>
+            </m:r>
+          </m:sub>
+        </m:sSub>
+        <m:r>
+          <w:rPr>
+            <w:rFonts w:ascii="Cambria Math" w:eastAsia="Times New Roman" w:hAnsi="Cambria Math" w:cs="Times New Roman"/>
+            <w:lang w:eastAsia="pt-BR"/>
+          </w:rPr>
+          <m:t xml:space="preserve"> </m:t>
+        </m:r>
+      </m:oMath>
+      <w:r>
+        <w:rPr>
+          <w:rFonts w:ascii="Times New Roman" w:hAnsi="Times New Roman" w:cs="Times New Roman"/>
+        </w:rPr>
+        <w:t xml:space="preserve">corresponde aos pesos sinápticos associados a cada conexão, </w:t>
+      </w:r>
+      <m:oMath>
+        <m:sSub>
+          <m:sSubPr>
+            <m:ctrlPr>
+              <w:rPr>
+                <w:rFonts w:ascii="Cambria Math" w:eastAsia="Times New Roman" w:hAnsi="Cambria Math" w:cs="Times New Roman"/>
+                <w:lang w:eastAsia="pt-BR"/>
+              </w:rPr>
+            </m:ctrlPr>
+          </m:sSubPr>
+          <m:e>
+            <m:r>
+              <w:rPr>
+                <w:rFonts w:ascii="Cambria Math" w:eastAsia="Times New Roman" w:hAnsi="Cambria Math" w:cs="Times New Roman"/>
+                <w:lang w:eastAsia="pt-BR"/>
+              </w:rPr>
+              <m:t>b</m:t>
+            </m:r>
+          </m:e>
+          <m:sub>
+            <m:r>
+              <w:rPr>
+                <w:rFonts w:ascii="Cambria Math" w:eastAsia="Times New Roman" w:hAnsi="Cambria Math" w:cs="Times New Roman"/>
+                <w:lang w:eastAsia="pt-BR"/>
+              </w:rPr>
+              <m:t>k</m:t>
+            </m:r>
+          </m:sub>
+        </m:sSub>
+      </m:oMath>
+      <w:r>
+        <w:rPr>
+          <w:rStyle w:val="vlist-s"/>
+          <w:rFonts w:ascii="Times New Roman" w:hAnsi="Times New Roman" w:cs="Times New Roman"/>
+        </w:rPr>
+        <w:t>​</w:t>
+      </w:r>
+      <w:r>
+        <w:rPr>
+          <w:rFonts w:ascii="Times New Roman" w:hAnsi="Times New Roman" w:cs="Times New Roman"/>
+        </w:rPr>
+        <w:t xml:space="preserve"> é o termo de </w:t>
+      </w:r>
+      <w:r>
+        <w:rPr>
+          <w:rStyle w:val="Emphasis"/>
+          <w:rFonts w:ascii="Times New Roman" w:hAnsi="Times New Roman" w:cs="Times New Roman"/>
+        </w:rPr>
+        <w:t>bias</w:t>
+      </w:r>
+      <w:r>
+        <w:rPr>
+          <w:rFonts w:ascii="Times New Roman" w:hAnsi="Times New Roman" w:cs="Times New Roman"/>
+        </w:rPr>
+        <w:t xml:space="preserve"> e </w:t>
+      </w:r>
+      <w:r>
+        <w:rPr>
+          <w:rStyle w:val="katex-mathml"/>
+          <w:rFonts w:ascii="Times New Roman" w:hAnsi="Times New Roman" w:cs="Times New Roman"/>
+        </w:rPr>
+        <w:t xml:space="preserve">AF </w:t>
+      </w:r>
+      <w:r>
+        <w:rPr>
+          <w:rFonts w:ascii="Times New Roman" w:hAnsi="Times New Roman" w:cs="Times New Roman"/>
+        </w:rPr>
+        <w:t>representa a função de ativação aplicada ao resultado da soma ponderada [4].</w:t>
+      </w:r>
+    </w:p>
+    <w:p>
+      <w:pPr>
+        <w:spacing w:before="100" w:beforeAutospacing="1" w:after="100" w:afterAutospacing="1" w:line="240" w:lineRule="auto"/>
+        <w:jc w:val="both"/>
+        <w:rPr>
+          <w:rFonts w:ascii="Times New Roman" w:hAnsi="Times New Roman" w:cs="Times New Roman"/>
+        </w:rPr>
+      </w:pPr>
+      <w:r>
+        <w:rPr>
+          <w:rFonts w:ascii="Times New Roman" w:eastAsia="Times New Roman" w:hAnsi="Times New Roman" w:cs="Times New Roman"/>
+          <w:lang w:eastAsia="pt-BR"/>
+        </w:rPr>
+        <w:t>Contudo, t</w:t>
+      </w:r>
+      <w:r>
+        <w:rPr>
+          <w:rFonts w:ascii="Times New Roman" w:hAnsi="Times New Roman" w:cs="Times New Roman"/>
+        </w:rPr>
+        <w:t>arefas</w:t>
+      </w:r>
+      <w:r>
+        <w:rPr>
+          <w:rFonts w:ascii="Times New Roman" w:hAnsi="Times New Roman" w:cs="Times New Roman"/>
+        </w:rPr>
+        <w:t xml:space="preserve"> como reconhecimento de imagens e</w:t>
+      </w:r>
+      <w:r>
+        <w:rPr>
+          <w:rFonts w:ascii="Times New Roman" w:hAnsi="Times New Roman" w:cs="Times New Roman"/>
+        </w:rPr>
+        <w:t xml:space="preserve"> processamento de linguagem natural exigem alto desempenho aliado à eficiência energética, o que representa um desafio significativo para arquiteturas tradicion</w:t>
+      </w:r>
+      <w:r>
+        <w:rPr>
+          <w:rFonts w:ascii="Times New Roman" w:hAnsi="Times New Roman" w:cs="Times New Roman"/>
+        </w:rPr>
+        <w:t xml:space="preserve">ais de propósito geral, como aquelas </w:t>
+      </w:r>
+      <w:r>
+        <w:rPr>
+          <w:rFonts w:ascii="Times New Roman" w:hAnsi="Times New Roman" w:cs="Times New Roman"/>
+        </w:rPr>
+        <w:t xml:space="preserve">que utilizam </w:t>
+      </w:r>
+      <w:r>
+        <w:rPr>
+          <w:rFonts w:ascii="Times New Roman" w:hAnsi="Times New Roman" w:cs="Times New Roman"/>
+        </w:rPr>
+        <w:t>Unidades Centrais de P</w:t>
+      </w:r>
+      <w:r>
+        <w:rPr>
+          <w:rFonts w:ascii="Times New Roman" w:hAnsi="Times New Roman" w:cs="Times New Roman"/>
+        </w:rPr>
+        <w:t>rocessament</w:t>
+      </w:r>
+      <w:r>
+        <w:rPr>
+          <w:rFonts w:ascii="Times New Roman" w:hAnsi="Times New Roman" w:cs="Times New Roman"/>
+        </w:rPr>
+        <w:t>o (</w:t>
+      </w:r>
+      <w:r>
+        <w:rPr>
+          <w:rFonts w:ascii="Times New Roman" w:hAnsi="Times New Roman" w:cs="Times New Roman"/>
+          <w:i/>
+        </w:rPr>
+        <w:t>Central Processing Unit</w:t>
+      </w:r>
+      <w:r>
+        <w:rPr>
+          <w:rFonts w:ascii="Times New Roman" w:hAnsi="Times New Roman" w:cs="Times New Roman"/>
+          <w:i/>
+        </w:rPr>
+        <w:t>s</w:t>
+      </w:r>
+      <w:r>
+        <w:rPr>
+          <w:rFonts w:ascii="Times New Roman" w:hAnsi="Times New Roman" w:cs="Times New Roman"/>
+        </w:rPr>
+        <w:t xml:space="preserve"> - CPU</w:t>
+      </w:r>
+      <w:r>
+        <w:rPr>
+          <w:rFonts w:ascii="Times New Roman" w:hAnsi="Times New Roman" w:cs="Times New Roman"/>
+        </w:rPr>
+        <w:t>s</w:t>
+      </w:r>
+      <w:r>
+        <w:rPr>
+          <w:rFonts w:ascii="Times New Roman" w:hAnsi="Times New Roman" w:cs="Times New Roman"/>
+        </w:rPr>
+        <w:t xml:space="preserve">). Embora </w:t>
+      </w:r>
+      <w:r>
+        <w:rPr>
+          <w:rFonts w:ascii="Times New Roman" w:hAnsi="Times New Roman" w:cs="Times New Roman"/>
+        </w:rPr>
+        <w:t>Unidades de Processamento G</w:t>
+      </w:r>
+      <w:r>
+        <w:rPr>
+          <w:rFonts w:ascii="Times New Roman" w:hAnsi="Times New Roman" w:cs="Times New Roman"/>
+        </w:rPr>
+        <w:t>r</w:t>
+      </w:r>
+      <w:r>
+        <w:rPr>
+          <w:rFonts w:ascii="Times New Roman" w:hAnsi="Times New Roman" w:cs="Times New Roman" w:hint="cs"/>
+        </w:rPr>
+        <w:t>á</w:t>
+      </w:r>
+      <w:r>
+        <w:rPr>
+          <w:rFonts w:ascii="Times New Roman" w:hAnsi="Times New Roman" w:cs="Times New Roman"/>
+        </w:rPr>
+        <w:t>fico</w:t>
+      </w:r>
+      <w:r>
+        <w:rPr>
+          <w:rFonts w:ascii="Times New Roman" w:hAnsi="Times New Roman" w:cs="Times New Roman"/>
+        </w:rPr>
+        <w:t xml:space="preserve"> (</w:t>
+      </w:r>
+      <w:r>
+        <w:rPr>
+          <w:rFonts w:ascii="Times New Roman" w:hAnsi="Times New Roman" w:cs="Times New Roman"/>
+          <w:i/>
+        </w:rPr>
+        <w:t>Graphics Processing Units</w:t>
+      </w:r>
+      <w:r>
+        <w:rPr>
+          <w:rFonts w:ascii="Times New Roman" w:hAnsi="Times New Roman" w:cs="Times New Roman"/>
+        </w:rPr>
+        <w:t xml:space="preserve"> - GPUs)</w:t>
+      </w:r>
+      <w:r>
+        <w:rPr>
+          <w:rFonts w:ascii="Times New Roman" w:hAnsi="Times New Roman" w:cs="Times New Roman"/>
+        </w:rPr>
+        <w:t xml:space="preserve"> sejam amplamente utilizadas para acelerar operações paralelas, especialmente </w:t>
+      </w:r>
+      <w:r>
+        <w:rPr>
+          <w:rFonts w:ascii="Times New Roman" w:hAnsi="Times New Roman" w:cs="Times New Roman"/>
+        </w:rPr>
+        <w:t>no</w:t>
+      </w:r>
+      <w:r>
+        <w:rPr>
+          <w:rFonts w:ascii="Times New Roman" w:hAnsi="Times New Roman" w:cs="Times New Roman"/>
+        </w:rPr>
+        <w:t xml:space="preserve"> treinamento de redes neurais, ainda </w:t>
+      </w:r>
+      <w:r>
+        <w:rPr>
+          <w:rFonts w:ascii="Times New Roman" w:hAnsi="Times New Roman" w:cs="Times New Roman"/>
+        </w:rPr>
+        <w:t>apresentam</w:t>
+      </w:r>
+      <w:r>
+        <w:rPr>
+          <w:rFonts w:ascii="Times New Roman" w:hAnsi="Times New Roman" w:cs="Times New Roman"/>
+        </w:rPr>
+        <w:t xml:space="preserve"> </w:t>
+      </w:r>
+      <w:r>
+        <w:rPr>
+          <w:rFonts w:ascii="Times New Roman" w:hAnsi="Times New Roman" w:cs="Times New Roman"/>
+        </w:rPr>
+        <w:t xml:space="preserve">limitações relacionadas ao consumo de energia e à eficiência em aplicações embarcadas. </w:t>
+      </w:r>
+      <w:r>
+        <w:rPr>
+          <w:rFonts w:ascii="Times New Roman" w:hAnsi="Times New Roman" w:cs="Times New Roman"/>
+        </w:rPr>
+        <w:t>Diante desse cen</w:t>
+      </w:r>
+      <w:r>
+        <w:rPr>
+          <w:rFonts w:ascii="Times New Roman" w:hAnsi="Times New Roman" w:cs="Times New Roman" w:hint="cs"/>
+        </w:rPr>
+        <w:t>á</w:t>
+      </w:r>
+      <w:r>
+        <w:rPr>
+          <w:rFonts w:ascii="Times New Roman" w:hAnsi="Times New Roman" w:cs="Times New Roman"/>
+        </w:rPr>
+        <w:t>rio</w:t>
+      </w:r>
+      <w:r>
+        <w:rPr>
+          <w:rFonts w:ascii="Times New Roman" w:hAnsi="Times New Roman" w:cs="Times New Roman"/>
+        </w:rPr>
+        <w:t xml:space="preserve">, </w:t>
+      </w:r>
+      <w:r>
+        <w:rPr>
+          <w:rFonts w:ascii="Times New Roman" w:hAnsi="Times New Roman" w:cs="Times New Roman"/>
+        </w:rPr>
+        <w:t>surgiram</w:t>
+      </w:r>
+      <w:r>
+        <w:rPr>
+          <w:rFonts w:ascii="Times New Roman" w:hAnsi="Times New Roman" w:cs="Times New Roman"/>
+        </w:rPr>
+        <w:t xml:space="preserve"> os aceleradores de </w:t>
+      </w:r>
+      <w:r>
+        <w:rPr>
+          <w:rFonts w:ascii="Times New Roman" w:hAnsi="Times New Roman" w:cs="Times New Roman"/>
+          <w:i/>
+        </w:rPr>
+        <w:t>hardware</w:t>
+      </w:r>
+      <w:r>
+        <w:rPr>
+          <w:rFonts w:ascii="Times New Roman" w:hAnsi="Times New Roman" w:cs="Times New Roman"/>
+        </w:rPr>
+        <w:t xml:space="preserve"> dedicados à IA, projetados especificamente para otimizar operações características de algoritmos de aprendizado de máquina. Entre </w:t>
+      </w:r>
+      <w:r>
+        <w:rPr>
+          <w:rFonts w:ascii="Times New Roman" w:hAnsi="Times New Roman" w:cs="Times New Roman"/>
+        </w:rPr>
+        <w:t>esses</w:t>
+      </w:r>
+      <w:r>
+        <w:rPr>
+          <w:rFonts w:ascii="Times New Roman" w:hAnsi="Times New Roman" w:cs="Times New Roman"/>
+        </w:rPr>
+        <w:t xml:space="preserve"> aceleradores, destacam-se as </w:t>
+      </w:r>
+      <w:r>
+        <w:rPr>
+          <w:rFonts w:ascii="Times New Roman" w:hAnsi="Times New Roman" w:cs="Times New Roman"/>
+        </w:rPr>
+        <w:t>NPUs</w:t>
+      </w:r>
+      <w:r>
+        <w:rPr>
+          <w:rFonts w:ascii="Times New Roman" w:hAnsi="Times New Roman" w:cs="Times New Roman"/>
+        </w:rPr>
+        <w:t xml:space="preserve">, que consistem em arquiteturas </w:t>
+      </w:r>
+      <w:r>
+        <w:rPr>
+          <w:rFonts w:ascii="Times New Roman" w:hAnsi="Times New Roman" w:cs="Times New Roman"/>
+        </w:rPr>
+        <w:t xml:space="preserve">desenvolvidas </w:t>
+      </w:r>
+      <w:r>
+        <w:rPr>
+          <w:rFonts w:ascii="Times New Roman" w:hAnsi="Times New Roman" w:cs="Times New Roman"/>
+        </w:rPr>
+        <w:t>para a execu</w:t>
+      </w:r>
+      <w:r>
+        <w:rPr>
+          <w:rFonts w:ascii="Times New Roman" w:hAnsi="Times New Roman" w:cs="Times New Roman" w:hint="cs"/>
+        </w:rPr>
+        <w:t>çã</w:t>
+      </w:r>
+      <w:r>
+        <w:rPr>
+          <w:rFonts w:ascii="Times New Roman" w:hAnsi="Times New Roman" w:cs="Times New Roman"/>
+        </w:rPr>
+        <w:t xml:space="preserve">o eficiente de </w:t>
+      </w:r>
+      <w:r>
+        <w:rPr>
+          <w:rFonts w:ascii="Times New Roman" w:hAnsi="Times New Roman" w:cs="Times New Roman"/>
+        </w:rPr>
+        <w:t>RNAs</w:t>
+      </w:r>
+      <w:r>
+        <w:rPr>
+          <w:rFonts w:ascii="Times New Roman" w:hAnsi="Times New Roman" w:cs="Times New Roman"/>
+        </w:rPr>
+        <w:t>. Diferentemente das CPUs, que possuem arquitetura de propósito geral, e das GPUs, que são otimizadas para paralelismo massivo, as NPUs são especializadas em operações matriciais e tensoriais, fundamentais para o funcionamento de modelos de aprendizado profundo</w:t>
+      </w:r>
+      <w:r>
+        <w:rPr>
+          <w:rFonts w:ascii="Times New Roman" w:hAnsi="Times New Roman" w:cs="Times New Roman"/>
+        </w:rPr>
+        <w:t xml:space="preserve"> [5]</w:t>
+      </w:r>
+      <w:r>
+        <w:rPr>
+          <w:rFonts w:ascii="Times New Roman" w:hAnsi="Times New Roman" w:cs="Times New Roman"/>
+        </w:rPr>
+        <w:t>.</w:t>
+      </w:r>
+    </w:p>
+    <w:p>
+      <w:pPr>
+        <w:pStyle w:val="NormalWeb"/>
+        <w:jc w:val="both"/>
+      </w:pPr>
+      <w:r>
+        <w:t xml:space="preserve">O </w:t>
+      </w:r>
+      <w:r>
+        <w:rPr>
+          <w:i/>
+        </w:rPr>
+        <w:t>dataset</w:t>
+      </w:r>
+      <w:r>
+        <w:t xml:space="preserve"> </w:t>
+      </w:r>
+      <w:r>
+        <w:rPr>
+          <w:i/>
+        </w:rPr>
+        <w:t>Modified National Institute of Standards and Technology</w:t>
+      </w:r>
+      <w:r>
+        <w:t xml:space="preserve"> (MNIST)</w:t>
+      </w:r>
+      <w:r>
+        <w:t xml:space="preserve"> é amplamente utilizado na literatura como referência para avaliação de algoritmos de aprendizado de máquina e arquiteturas de </w:t>
+      </w:r>
+      <w:r>
+        <w:rPr>
+          <w:i/>
+        </w:rPr>
+        <w:t>hardware</w:t>
+      </w:r>
+      <w:r>
+        <w:t xml:space="preserve"> voltadas à classificação de imagens. Ele é composto por 70.000 imagens de dígitos manuscritos, variando de 0 a 9, sendo 60.000 destinadas ao treinamento e 10.000 para teste. Cada imagem possui dimensão de 28×28 </w:t>
+      </w:r>
+      <w:r>
+        <w:rPr>
+          <w:i/>
+        </w:rPr>
+        <w:t>pixels</w:t>
+      </w:r>
+      <w:r>
+        <w:t xml:space="preserve"> em escala de cinza, o que resulta em um conjunto de dados relativamente simples e padronizado, ideal para experimentação e validação de modelos [6].</w:t>
+      </w:r>
+    </w:p>
+    <w:p>
+      <w:pPr>
+        <w:pStyle w:val="NormalWeb"/>
+        <w:jc w:val="both"/>
+      </w:pPr>
+      <w:r>
+        <w:t xml:space="preserve">A implementação de sistemas digitais complexos requer ferramentas e metodologias que permitam descrever, simular e validar o comportamento do </w:t>
+      </w:r>
+      <w:r>
+        <w:rPr>
+          <w:i/>
+        </w:rPr>
+        <w:t>hardware</w:t>
+      </w:r>
+      <w:r>
+        <w:t xml:space="preserve"> antes de sua fabricação ou síntese. </w:t>
+      </w:r>
+      <w:r>
+        <w:t>Diante dessas considerações</w:t>
+      </w:r>
+      <w:r>
+        <w:t xml:space="preserve">, as linguagens de descrição de </w:t>
+      </w:r>
+      <w:r>
+        <w:rPr>
+          <w:i/>
+        </w:rPr>
+        <w:t>hardware</w:t>
+      </w:r>
+      <w:r>
+        <w:t xml:space="preserve"> (</w:t>
+      </w:r>
+      <w:r>
+        <w:rPr>
+          <w:rStyle w:val="Emphasis"/>
+        </w:rPr>
+        <w:t>Hardware Description Languages</w:t>
+      </w:r>
+      <w:r>
+        <w:t xml:space="preserve"> – HDLs) desempenham um papel fundamental, sendo utilizadas para </w:t>
+      </w:r>
+      <w:r>
+        <w:lastRenderedPageBreak/>
+        <w:t xml:space="preserve">modelar circuitos digitais em diferentes níveis de abstração. Entre essas linguagens, destaca-se o Verilog, amplamente adotado na indústria e na academia para o desenvolvimento de sistemas </w:t>
+      </w:r>
+      <w:r>
+        <w:t>digitais e circuitos integrados, permitindo</w:t>
+      </w:r>
+      <w:r>
+        <w:t xml:space="preserve"> a modelagem desde o nível comportamental até o nível de transferência de registradores (</w:t>
+      </w:r>
+      <w:r>
+        <w:rPr>
+          <w:rStyle w:val="Emphasis"/>
+        </w:rPr>
+        <w:t>Register Transfer Level</w:t>
+      </w:r>
+      <w:r>
+        <w:t xml:space="preserve"> – RTL) [7].</w:t>
+      </w:r>
+    </w:p>
+    <w:p>
+      <w:pPr>
+        <w:pStyle w:val="NormalWeb"/>
+        <w:jc w:val="both"/>
+      </w:pPr>
+      <w:r>
+        <w:t xml:space="preserve">Neste contexto, a integração entre RNAs, aceleradores de </w:t>
+      </w:r>
+      <w:r>
+        <w:rPr>
+          <w:i/>
+        </w:rPr>
+        <w:t>hardware</w:t>
+      </w:r>
+      <w:r>
+        <w:t xml:space="preserve"> e a implementação em linguagem Verilog possibilita o desenvolvimento de sistemas capazes de executar tarefas de IA com maior eficiência, desempenho e baixo consumo energético. A adoção de arquiteturas especializadas, como as NPUs, aliada ao uso do </w:t>
+      </w:r>
+      <w:r>
+        <w:rPr>
+          <w:i/>
+        </w:rPr>
+        <w:t>dataset</w:t>
+      </w:r>
+      <w:r>
+        <w:t xml:space="preserve"> MNIST como </w:t>
+      </w:r>
+      <w:r>
+        <w:rPr>
+          <w:i/>
+        </w:rPr>
+        <w:t>benchmark</w:t>
+      </w:r>
+      <w:r>
+        <w:t xml:space="preserve"> de validação, permite a criação de soluções otimizadas para inferência em </w:t>
+      </w:r>
+      <w:r>
+        <w:rPr>
+          <w:i/>
+        </w:rPr>
+        <w:t>hardware</w:t>
+      </w:r>
+      <w:r>
+        <w:t xml:space="preserve"> digital. </w:t>
+      </w:r>
+    </w:p>
+    <w:p>
+      <w:pPr>
+        <w:pStyle w:val="Heading1"/>
+        <w:rPr>
+          <w:rFonts w:ascii="Times New Roman" w:hAnsi="Times New Roman" w:cs="Times New Roman"/>
+          <w:sz w:val="24"/>
+          <w:szCs w:val="24"/>
+        </w:rPr>
+      </w:pPr>
+      <w:bookmarkStart w:id="17" w:name="_Toc226397508"/>
+      <w:r>
+        <w:rPr>
+          <w:rFonts w:ascii="Times New Roman" w:hAnsi="Times New Roman" w:cs="Times New Roman"/>
+          <w:sz w:val="24"/>
+          <w:szCs w:val="24"/>
+        </w:rPr>
+        <w:t>3 Objetivos</w:t>
+      </w:r>
+      <w:bookmarkEnd w:id="17"/>
+    </w:p>
+    <w:p>
+      <w:pPr>
+        <w:jc w:val="both"/>
+        <w:rPr>
+          <w:rFonts w:ascii="Times New Roman" w:hAnsi="Times New Roman" w:cs="Times New Roman"/>
+        </w:rPr>
+      </w:pPr>
+      <w:r>
+        <w:rPr>
+          <w:rFonts w:ascii="Times New Roman" w:hAnsi="Times New Roman" w:cs="Times New Roman"/>
+        </w:rPr>
+        <w:t>Este trabalho tem como objetivo o desenvolvimento e a verificação funcional de uma NPU voltada para a classificação de dígitos manuscritos, utilizando a linguagem Verilog. O projeto busca demonstrar, de forma prática, a aplicação de conceito</w:t>
+      </w:r>
+      <w:r>
+        <w:rPr>
+          <w:rFonts w:ascii="Times New Roman" w:hAnsi="Times New Roman" w:cs="Times New Roman"/>
+        </w:rPr>
+        <w:t xml:space="preserve">s modernos </w:t>
+      </w:r>
+      <w:r>
+        <w:rPr>
+          <w:rFonts w:ascii="Times New Roman" w:hAnsi="Times New Roman" w:cs="Times New Roman"/>
+        </w:rPr>
+        <w:t xml:space="preserve">de aceleração de </w:t>
+      </w:r>
+      <w:r>
+        <w:rPr>
+          <w:rFonts w:ascii="Times New Roman" w:hAnsi="Times New Roman" w:cs="Times New Roman"/>
+          <w:i/>
+        </w:rPr>
+        <w:t>hardware</w:t>
+      </w:r>
+      <w:r>
+        <w:rPr>
+          <w:rFonts w:ascii="Times New Roman" w:hAnsi="Times New Roman" w:cs="Times New Roman"/>
+        </w:rPr>
+        <w:t xml:space="preserve"> dedicada à IA</w:t>
+      </w:r>
+      <w:r>
+        <w:rPr>
+          <w:rFonts w:ascii="Times New Roman" w:hAnsi="Times New Roman" w:cs="Times New Roman"/>
+        </w:rPr>
+        <w:t xml:space="preserve">, </w:t>
+      </w:r>
+      <w:r>
+        <w:rPr>
+          <w:rFonts w:ascii="Times New Roman" w:hAnsi="Times New Roman" w:cs="Times New Roman"/>
+        </w:rPr>
+        <w:t xml:space="preserve">explorando o uso de arquiteturas especializadas para execução eficiente de tarefas de inferência. </w:t>
+      </w:r>
+    </w:p>
+    <w:p>
+      <w:pPr>
+        <w:spacing w:before="240" w:after="240"/>
+        <w:jc w:val="both"/>
+        <w:rPr>
+          <w:rFonts w:ascii="Times New Roman" w:hAnsi="Times New Roman" w:cs="Times New Roman"/>
+        </w:rPr>
+      </w:pPr>
+      <w:r>
+        <w:rPr>
+          <w:rFonts w:ascii="Times New Roman" w:hAnsi="Times New Roman" w:cs="Times New Roman"/>
+        </w:rPr>
+        <w:t>De forma complementar, pretende-se projetar uma arquitetura de NPU modular, composta por</w:t>
+      </w:r>
+      <w:r>
+        <w:rPr>
+          <w:rFonts w:ascii="Times New Roman" w:hAnsi="Times New Roman" w:cs="Times New Roman"/>
+        </w:rPr>
+        <w:t xml:space="preserve">: </w:t>
+      </w:r>
+      <w:r>
+        <w:rPr>
+          <w:rFonts w:ascii="Times New Roman" w:hAnsi="Times New Roman" w:cs="Times New Roman"/>
+          <w:highlight w:val="yellow"/>
+        </w:rPr>
+        <w:t>LISTAR COMPONENTES AQUI</w:t>
+      </w:r>
+      <w:r>
+        <w:rPr>
+          <w:rFonts w:ascii="Times New Roman" w:hAnsi="Times New Roman" w:cs="Times New Roman"/>
+        </w:rPr>
+        <w:t xml:space="preserve">. </w:t>
+      </w:r>
+      <w:r>
+        <w:rPr>
+          <w:rFonts w:ascii="Times New Roman" w:hAnsi="Times New Roman" w:cs="Times New Roman"/>
+        </w:rPr>
+        <w:t>Essa</w:t>
+      </w:r>
+      <w:r>
+        <w:rPr>
+          <w:rFonts w:ascii="Times New Roman" w:hAnsi="Times New Roman" w:cs="Times New Roman"/>
+        </w:rPr>
+        <w:t xml:space="preserve"> arquitetura será desenvolvida de modo a permitir a implementação de um classificador capaz de processar imagens do </w:t>
+      </w:r>
+      <w:r>
+        <w:rPr>
+          <w:rFonts w:ascii="Times New Roman" w:hAnsi="Times New Roman" w:cs="Times New Roman"/>
+          <w:i/>
+        </w:rPr>
+        <w:t>dataset</w:t>
+      </w:r>
+      <w:r>
+        <w:rPr>
+          <w:rFonts w:ascii="Times New Roman" w:hAnsi="Times New Roman" w:cs="Times New Roman"/>
+        </w:rPr>
+        <w:t xml:space="preserve"> MNIST, realizando a predição dos dígitos de entrada.</w:t>
+      </w:r>
+    </w:p>
+    <w:p>
+      <w:pPr>
+        <w:pStyle w:val="NormalWeb"/>
+        <w:jc w:val="both"/>
+      </w:pPr>
+      <w:r>
+        <w:t>Al</w:t>
+      </w:r>
+      <w:r>
+        <w:rPr>
+          <w:rFonts w:hint="cs"/>
+        </w:rPr>
+        <w:t>é</w:t>
+      </w:r>
+      <w:r>
+        <w:t>m disso, pretende-se realizar a verifica</w:t>
+      </w:r>
+      <w:r>
+        <w:rPr>
+          <w:rFonts w:hint="cs"/>
+        </w:rPr>
+        <w:t>çã</w:t>
+      </w:r>
+      <w:r>
+        <w:t>o funcional da NPU por meio de simula</w:t>
+      </w:r>
+      <w:r>
+        <w:rPr>
+          <w:rFonts w:hint="cs"/>
+        </w:rPr>
+        <w:t>çõ</w:t>
+      </w:r>
+      <w:r>
+        <w:t>es, validando o correto funcionamento dos m</w:t>
+      </w:r>
+      <w:r>
+        <w:rPr>
+          <w:rFonts w:hint="cs"/>
+        </w:rPr>
+        <w:t>ó</w:t>
+      </w:r>
+      <w:r>
+        <w:t>dulos individuais e da integra</w:t>
+      </w:r>
+      <w:r>
+        <w:rPr>
+          <w:rFonts w:hint="cs"/>
+        </w:rPr>
+        <w:t>çã</w:t>
+      </w:r>
+      <w:r>
+        <w:t>o do sistema como um todo, bem como comparando os resultados obtidos com valores de refer</w:t>
+      </w:r>
+      <w:r>
+        <w:rPr>
+          <w:rFonts w:hint="cs"/>
+        </w:rPr>
+        <w:t>ê</w:t>
+      </w:r>
+      <w:r>
+        <w:t>ncia previamente gerados em modelos equivalentes implementados em linguagem Python.</w:t>
+      </w:r>
+    </w:p>
+    <w:p>
+      <w:pPr>
+        <w:pStyle w:val="NormalWeb"/>
+        <w:jc w:val="both"/>
+      </w:pPr>
+      <w:r>
+        <w:t xml:space="preserve">Por fim, o projeto tem como finalidade documentar todas as etapas de desenvolvimento e verificação, incluindo a descrição da arquitetura proposta, </w:t>
+      </w:r>
+      <w:r>
+        <w:t>os componentes utilizados</w:t>
+      </w:r>
+      <w:r>
+        <w:t xml:space="preserve">, os métodos de implementação, os testes realizados e os resultados obtidos, contribuindo para a compreensão e </w:t>
+      </w:r>
+      <w:r>
+        <w:t>manutenção</w:t>
+      </w:r>
+      <w:r>
+        <w:t xml:space="preserve"> do sistema proposto</w:t>
+      </w:r>
+      <w:r>
+        <w:t>.</w:t>
+      </w:r>
+    </w:p>
+    <w:p>
+      <w:pPr>
+        <w:spacing w:after="240"/>
+        <w:rPr>
+          <w:rFonts w:ascii="Times New Roman" w:hAnsi="Times New Roman" w:cs="Times New Roman"/>
+        </w:rPr>
+      </w:pPr>
+    </w:p>
+    <w:p>
+      <w:pPr>
+        <w:spacing w:after="240"/>
+        <w:rPr>
+          <w:rFonts w:ascii="Times New Roman" w:hAnsi="Times New Roman" w:cs="Times New Roman"/>
+        </w:rPr>
+      </w:pPr>
+    </w:p>
+    <w:p>
+      <w:pPr>
+        <w:spacing w:after="240"/>
+        <w:rPr>
+          <w:rFonts w:ascii="Times New Roman" w:hAnsi="Times New Roman" w:cs="Times New Roman"/>
+        </w:rPr>
+      </w:pPr>
+    </w:p>
+    <w:p>
+      <w:pPr>
+        <w:spacing w:after="240"/>
+        <w:rPr>
+          <w:rFonts w:ascii="Times New Roman" w:hAnsi="Times New Roman" w:cs="Times New Roman"/>
+        </w:rPr>
+      </w:pPr>
+    </w:p>
+    <w:p>
+      <w:pPr>
+        <w:spacing w:after="240"/>
+        <w:rPr>
+          <w:rFonts w:ascii="Times New Roman" w:hAnsi="Times New Roman" w:cs="Times New Roman"/>
+        </w:rPr>
+      </w:pPr>
     </w:p>
     <w:p>
       <w:pPr>
@@ -1173,7 +2812,7 @@
           <w:szCs w:val="24"/>
         </w:rPr>
       </w:pPr>
-      <w:bookmarkStart w:id="17" w:name="_Toc225966501"/>
+      <w:bookmarkStart w:id="18" w:name="_Toc226397509"/>
       <w:r>
         <w:rPr>
           <w:rFonts w:ascii="Times New Roman" w:hAnsi="Times New Roman" w:cs="Times New Roman"/>
@@ -1184,10 +2823,9 @@
           <w:sz w:val="24"/>
           <w:szCs w:val="24"/>
         </w:rPr>
-        <w:lastRenderedPageBreak/>
         <w:t>Referências bibliográficas</w:t>
       </w:r>
-      <w:bookmarkEnd w:id="17"/>
+      <w:bookmarkEnd w:id="18"/>
     </w:p>
     <w:p>
       <w:pPr>
@@ -1214,7 +2852,19 @@
         <w:rPr>
           <w:rFonts w:ascii="Times New Roman" w:eastAsia="Times New Roman" w:hAnsi="Times New Roman" w:cs="Times New Roman"/>
         </w:rPr>
-        <w:t>Donghyeon Han and Hoi-Jun Yoo</w:t>
+        <w:t xml:space="preserve">Donghyeon Han </w:t>
+      </w:r>
+      <w:r>
+        <w:rPr>
+          <w:rFonts w:ascii="Times New Roman" w:eastAsia="Times New Roman" w:hAnsi="Times New Roman" w:cs="Times New Roman"/>
+        </w:rPr>
+        <w:t>e</w:t>
+      </w:r>
+      <w:r>
+        <w:rPr>
+          <w:rFonts w:ascii="Times New Roman" w:eastAsia="Times New Roman" w:hAnsi="Times New Roman" w:cs="Times New Roman"/>
+        </w:rPr>
+        <w:t xml:space="preserve"> Hoi-Jun Yoo</w:t>
       </w:r>
       <w:r>
         <w:rPr>
@@ -1252,7 +2902,6 @@
         <w:jc w:val="both"/>
         <w:rPr>
           <w:rFonts w:ascii="Times New Roman" w:hAnsi="Times New Roman" w:cs="Times New Roman"/>
-          <w:lang w:val="en-US"/>
         </w:rPr>
       </w:pPr>
       <w:r>
@@ -1298,22 +2947,474 @@
           <w:rFonts w:ascii="Times New Roman" w:hAnsi="Times New Roman" w:cs="Times New Roman"/>
           <w:lang w:val="en-US"/>
         </w:rPr>
-        <w:t xml:space="preserve">. Institute of Physics Publishing, 2025. </w:t>
-      </w:r>
-      <w:r>
-        <w:rPr>
-          <w:rFonts w:ascii="Times New Roman" w:hAnsi="Times New Roman" w:cs="Times New Roman"/>
+        <w:t xml:space="preserve">. </w:t>
+      </w:r>
+      <w:r>
+        <w:rPr>
+          <w:rFonts w:ascii="Times New Roman" w:hAnsi="Times New Roman" w:cs="Times New Roman"/>
+        </w:rPr>
+        <w:t xml:space="preserve">Institute of Physics Publishing, 2025. </w:t>
+      </w:r>
+      <w:hyperlink r:id="rId8" w:history="1">
+        <w:r>
+          <w:rPr>
+            <w:rStyle w:val="Hyperlink"/>
+            <w:rFonts w:ascii="Times New Roman" w:hAnsi="Times New Roman" w:cs="Times New Roman"/>
+          </w:rPr>
+          <w:t>https://doi.org/10.1088/978-0-7503-6259-7</w:t>
+        </w:r>
+      </w:hyperlink>
+      <w:r>
+        <w:rPr>
+          <w:rFonts w:ascii="Times New Roman" w:hAnsi="Times New Roman" w:cs="Times New Roman"/>
+        </w:rPr>
+        <w:t>.</w:t>
+      </w:r>
+    </w:p>
+    <w:p>
+      <w:pPr>
+        <w:jc w:val="both"/>
+        <w:rPr>
+          <w:rFonts w:ascii="Times New Roman" w:eastAsia="Times New Roman" w:hAnsi="Times New Roman" w:cs="Times New Roman"/>
+        </w:rPr>
+      </w:pPr>
+      <w:r>
+        <w:rPr>
+          <w:rFonts w:ascii="Times New Roman" w:eastAsia="Times New Roman" w:hAnsi="Times New Roman" w:cs="Times New Roman"/>
+        </w:rPr>
+        <w:t>[</w:t>
+      </w:r>
+      <w:r>
+        <w:rPr>
+          <w:rFonts w:ascii="Times New Roman" w:eastAsia="Times New Roman" w:hAnsi="Times New Roman" w:cs="Times New Roman"/>
+        </w:rPr>
+        <w:t>3</w:t>
+      </w:r>
+      <w:r>
+        <w:rPr>
+          <w:rFonts w:ascii="Times New Roman" w:eastAsia="Times New Roman" w:hAnsi="Times New Roman" w:cs="Times New Roman"/>
+        </w:rPr>
+        <w:t xml:space="preserve">] </w:t>
+      </w:r>
+      <w:r>
+        <w:rPr>
+          <w:rFonts w:ascii="Times New Roman" w:eastAsia="Times New Roman" w:hAnsi="Times New Roman" w:cs="Times New Roman"/>
+        </w:rPr>
+        <w:t>Associação Brasileira de Tecnologia Educacional.</w:t>
+      </w:r>
+      <w:r>
+        <w:rPr>
+          <w:rFonts w:ascii="Times New Roman" w:eastAsia="Times New Roman" w:hAnsi="Times New Roman" w:cs="Times New Roman"/>
+        </w:rPr>
+        <w:t xml:space="preserve"> </w:t>
+      </w:r>
+      <w:r>
+        <w:rPr>
+          <w:rFonts w:ascii="Times New Roman" w:eastAsia="Times New Roman" w:hAnsi="Times New Roman" w:cs="Times New Roman"/>
+          <w:b/>
+        </w:rPr>
+        <w:t xml:space="preserve">Revista Tecnologia Educacional </w:t>
+      </w:r>
+      <w:r>
+        <w:rPr>
+          <w:rFonts w:ascii="Times New Roman" w:eastAsia="Times New Roman" w:hAnsi="Times New Roman" w:cs="Times New Roman" w:hint="cs"/>
+          <w:b/>
+        </w:rPr>
+        <w:t>–</w:t>
+      </w:r>
+      <w:r>
+        <w:rPr>
+          <w:rFonts w:ascii="Times New Roman" w:eastAsia="Times New Roman" w:hAnsi="Times New Roman" w:cs="Times New Roman"/>
+          <w:b/>
+        </w:rPr>
+        <w:t xml:space="preserve"> Edi</w:t>
+      </w:r>
+      <w:r>
+        <w:rPr>
+          <w:rFonts w:ascii="Times New Roman" w:eastAsia="Times New Roman" w:hAnsi="Times New Roman" w:cs="Times New Roman" w:hint="cs"/>
+          <w:b/>
+        </w:rPr>
+        <w:t>çã</w:t>
+      </w:r>
+      <w:r>
+        <w:rPr>
+          <w:rFonts w:ascii="Times New Roman" w:eastAsia="Times New Roman" w:hAnsi="Times New Roman" w:cs="Times New Roman"/>
+          <w:b/>
+        </w:rPr>
+        <w:t>o 236.</w:t>
+      </w:r>
+      <w:r>
+        <w:rPr>
+          <w:rFonts w:ascii="Times New Roman" w:eastAsia="Times New Roman" w:hAnsi="Times New Roman" w:cs="Times New Roman"/>
+        </w:rPr>
+        <w:t xml:space="preserve"> </w:t>
+      </w:r>
+      <w:r>
+        <w:rPr>
+          <w:rFonts w:ascii="Times New Roman" w:eastAsia="Times New Roman" w:hAnsi="Times New Roman" w:cs="Times New Roman"/>
+        </w:rPr>
+        <w:t>Disponível em:</w:t>
+      </w:r>
+      <w:r>
+        <w:rPr>
+          <w:rFonts w:ascii="Times New Roman" w:eastAsia="Times New Roman" w:hAnsi="Times New Roman" w:cs="Times New Roman"/>
+        </w:rPr>
+        <w:t xml:space="preserve"> </w:t>
+      </w:r>
+      <w:r>
+        <w:t>https://abt-br.org.br/wp-content/uploads/2023/03/RTE_236.pdf</w:t>
+      </w:r>
+      <w:r>
+        <w:rPr>
+          <w:rFonts w:ascii="Times New Roman" w:eastAsia="Times New Roman" w:hAnsi="Times New Roman" w:cs="Times New Roman"/>
+        </w:rPr>
+        <w:t>. Acesso em: 0</w:t>
+      </w:r>
+      <w:r>
+        <w:rPr>
+          <w:rFonts w:ascii="Times New Roman" w:eastAsia="Times New Roman" w:hAnsi="Times New Roman" w:cs="Times New Roman"/>
+        </w:rPr>
+        <w:t>5</w:t>
+      </w:r>
+      <w:r>
+        <w:rPr>
+          <w:rFonts w:ascii="Times New Roman" w:eastAsia="Times New Roman" w:hAnsi="Times New Roman" w:cs="Times New Roman"/>
+        </w:rPr>
+        <w:t xml:space="preserve"> de abril 2026.</w:t>
+      </w:r>
+    </w:p>
+    <w:p>
+      <w:pPr>
+        <w:jc w:val="both"/>
+        <w:rPr>
+          <w:rFonts w:ascii="Times New Roman" w:eastAsia="Times New Roman" w:hAnsi="Times New Roman" w:cs="Times New Roman"/>
+        </w:rPr>
+      </w:pPr>
+      <w:r>
+        <w:rPr>
+          <w:rFonts w:ascii="Times New Roman" w:eastAsia="Times New Roman" w:hAnsi="Times New Roman" w:cs="Times New Roman"/>
+        </w:rPr>
+        <w:t>[</w:t>
+      </w:r>
+      <w:r>
+        <w:rPr>
+          <w:rFonts w:ascii="Times New Roman" w:eastAsia="Times New Roman" w:hAnsi="Times New Roman" w:cs="Times New Roman"/>
+        </w:rPr>
+        <w:t>4</w:t>
+      </w:r>
+      <w:r>
+        <w:rPr>
+          <w:rFonts w:ascii="Times New Roman" w:eastAsia="Times New Roman" w:hAnsi="Times New Roman" w:cs="Times New Roman"/>
+        </w:rPr>
+        <w:t xml:space="preserve">] </w:t>
+      </w:r>
+      <w:r>
+        <w:rPr>
+          <w:rFonts w:ascii="Times New Roman" w:eastAsia="Times New Roman" w:hAnsi="Times New Roman" w:cs="Times New Roman"/>
+        </w:rPr>
+        <w:t>Leandro Fleck, Maria Tavares, Eduardo Eyng, Andrieli Helmann e Minéia Andrade</w:t>
+      </w:r>
+      <w:r>
+        <w:rPr>
+          <w:rFonts w:ascii="Times New Roman" w:eastAsia="Times New Roman" w:hAnsi="Times New Roman" w:cs="Times New Roman"/>
+        </w:rPr>
+        <w:t xml:space="preserve">. </w:t>
+      </w:r>
+      <w:r>
+        <w:rPr>
+          <w:rFonts w:ascii="Times New Roman" w:eastAsia="Times New Roman" w:hAnsi="Times New Roman" w:cs="Times New Roman"/>
+          <w:b/>
+        </w:rPr>
+        <w:t>Redes Neurais Artificiais: Princípios Básicos</w:t>
+      </w:r>
+      <w:r>
+        <w:rPr>
+          <w:rFonts w:ascii="Times New Roman" w:eastAsia="Times New Roman" w:hAnsi="Times New Roman" w:cs="Times New Roman"/>
+          <w:b/>
+        </w:rPr>
+        <w:t>.</w:t>
+      </w:r>
+      <w:r>
+        <w:rPr>
+          <w:rFonts w:ascii="Times New Roman" w:eastAsia="Times New Roman" w:hAnsi="Times New Roman" w:cs="Times New Roman"/>
+        </w:rPr>
+        <w:t xml:space="preserve"> </w:t>
+      </w:r>
+      <w:r>
+        <w:rPr>
+          <w:rFonts w:ascii="Times New Roman" w:eastAsia="Times New Roman" w:hAnsi="Times New Roman" w:cs="Times New Roman"/>
+        </w:rPr>
+        <w:t>Disponível em:</w:t>
+      </w:r>
+      <w:r>
+        <w:rPr>
+          <w:rFonts w:ascii="Times New Roman" w:eastAsia="Times New Roman" w:hAnsi="Times New Roman" w:cs="Times New Roman"/>
+        </w:rPr>
+        <w:t xml:space="preserve"> </w:t>
+      </w:r>
+      <w:r>
+        <w:t>https://abt-br.org.br/wp-content/uploads/2023/03/RTE_236.pdf</w:t>
+      </w:r>
+      <w:r>
+        <w:rPr>
+          <w:rFonts w:ascii="Times New Roman" w:eastAsia="Times New Roman" w:hAnsi="Times New Roman" w:cs="Times New Roman"/>
+        </w:rPr>
+        <w:t>. Acesso em: 0</w:t>
+      </w:r>
+      <w:r>
+        <w:rPr>
+          <w:rFonts w:ascii="Times New Roman" w:eastAsia="Times New Roman" w:hAnsi="Times New Roman" w:cs="Times New Roman"/>
+        </w:rPr>
+        <w:t>5</w:t>
+      </w:r>
+      <w:r>
+        <w:rPr>
+          <w:rFonts w:ascii="Times New Roman" w:eastAsia="Times New Roman" w:hAnsi="Times New Roman" w:cs="Times New Roman"/>
+        </w:rPr>
+        <w:t xml:space="preserve"> de abril 2026.</w:t>
+      </w:r>
+    </w:p>
+    <w:p>
+      <w:pPr>
+        <w:jc w:val="both"/>
+        <w:rPr>
+          <w:rFonts w:ascii="Times New Roman" w:eastAsia="Times New Roman" w:hAnsi="Times New Roman" w:cs="Times New Roman"/>
           <w:lang w:val="en-US"/>
         </w:rPr>
-        <w:t>https://doi.org/10.1088/978-0-7503-6259-7</w:t>
-      </w:r>
-      <w:r>
-        <w:rPr>
-          <w:rFonts w:ascii="Times New Roman" w:hAnsi="Times New Roman" w:cs="Times New Roman"/>
+      </w:pPr>
+      <w:r>
+        <w:rPr>
+          <w:rFonts w:ascii="Times New Roman" w:eastAsia="Times New Roman" w:hAnsi="Times New Roman" w:cs="Times New Roman"/>
+        </w:rPr>
+        <w:t>[</w:t>
+      </w:r>
+      <w:r>
+        <w:rPr>
+          <w:rFonts w:ascii="Times New Roman" w:eastAsia="Times New Roman" w:hAnsi="Times New Roman" w:cs="Times New Roman"/>
+        </w:rPr>
+        <w:t>5</w:t>
+      </w:r>
+      <w:r>
+        <w:rPr>
+          <w:rFonts w:ascii="Times New Roman" w:eastAsia="Times New Roman" w:hAnsi="Times New Roman" w:cs="Times New Roman"/>
+        </w:rPr>
+        <w:t xml:space="preserve">] </w:t>
+      </w:r>
+      <w:r>
+        <w:rPr>
+          <w:rFonts w:ascii="Times New Roman" w:eastAsia="Times New Roman" w:hAnsi="Times New Roman" w:cs="Times New Roman"/>
+        </w:rPr>
+        <w:t>Kenichi Brumati, Igor Freitas e</w:t>
+      </w:r>
+      <w:r>
+        <w:rPr>
+          <w:rFonts w:ascii="Times New Roman" w:eastAsia="Times New Roman" w:hAnsi="Times New Roman" w:cs="Times New Roman"/>
+        </w:rPr>
+        <w:t xml:space="preserve"> Arthur F. Lorenzon</w:t>
+      </w:r>
+      <w:r>
+        <w:rPr>
+          <w:rFonts w:ascii="Times New Roman" w:eastAsia="Times New Roman" w:hAnsi="Times New Roman" w:cs="Times New Roman"/>
+        </w:rPr>
+        <w:t xml:space="preserve">. </w:t>
+      </w:r>
+      <w:r>
+        <w:rPr>
+          <w:rFonts w:ascii="Times New Roman" w:eastAsia="Times New Roman" w:hAnsi="Times New Roman" w:cs="Times New Roman"/>
+          <w:b/>
+        </w:rPr>
+        <w:t>Comparando o Desempenho da NPU Intel AI Boost com uma CPU de Propósito Geral</w:t>
+      </w:r>
+      <w:r>
+        <w:rPr>
+          <w:rFonts w:ascii="Times New Roman" w:eastAsia="Times New Roman" w:hAnsi="Times New Roman" w:cs="Times New Roman"/>
+          <w:b/>
+        </w:rPr>
+        <w:t>.</w:t>
+      </w:r>
+      <w:r>
+        <w:rPr>
+          <w:rFonts w:ascii="Times New Roman" w:eastAsia="Times New Roman" w:hAnsi="Times New Roman" w:cs="Times New Roman"/>
+        </w:rPr>
+        <w:t xml:space="preserve"> </w:t>
+      </w:r>
+      <w:r>
+        <w:rPr>
+          <w:rFonts w:ascii="Times New Roman" w:eastAsia="Times New Roman" w:hAnsi="Times New Roman" w:cs="Times New Roman"/>
+        </w:rPr>
+        <w:t>Disponível em:</w:t>
+      </w:r>
+      <w:r>
+        <w:rPr>
+          <w:rFonts w:ascii="Times New Roman" w:eastAsia="Times New Roman" w:hAnsi="Times New Roman" w:cs="Times New Roman"/>
+        </w:rPr>
+        <w:t xml:space="preserve"> </w:t>
+      </w:r>
+      <w:r>
+        <w:t>https://sol.sbc.org.br/index.php/eradrs/article/view/35357/35146</w:t>
+      </w:r>
+      <w:r>
+        <w:rPr>
+          <w:rFonts w:ascii="Times New Roman" w:eastAsia="Times New Roman" w:hAnsi="Times New Roman" w:cs="Times New Roman"/>
+        </w:rPr>
+        <w:t xml:space="preserve">. </w:t>
+      </w:r>
+      <w:r>
+        <w:rPr>
+          <w:rFonts w:ascii="Times New Roman" w:eastAsia="Times New Roman" w:hAnsi="Times New Roman" w:cs="Times New Roman"/>
           <w:lang w:val="en-US"/>
         </w:rPr>
-        <w:t>.</w:t>
-      </w:r>
+        <w:t>Acesso em: 05 de abril 2026.</w:t>
+      </w:r>
+    </w:p>
+    <w:p>
+      <w:pPr>
+        <w:jc w:val="both"/>
+        <w:rPr>
+          <w:rFonts w:ascii="Times New Roman" w:eastAsia="Times New Roman" w:hAnsi="Times New Roman" w:cs="Times New Roman"/>
+        </w:rPr>
+      </w:pPr>
+      <w:r>
+        <w:rPr>
+          <w:rFonts w:ascii="Times New Roman" w:eastAsia="Times New Roman" w:hAnsi="Times New Roman" w:cs="Times New Roman"/>
+          <w:lang w:val="en-US"/>
+        </w:rPr>
+        <w:t>[</w:t>
+      </w:r>
+      <w:r>
+        <w:rPr>
+          <w:rFonts w:ascii="Times New Roman" w:eastAsia="Times New Roman" w:hAnsi="Times New Roman" w:cs="Times New Roman"/>
+          <w:lang w:val="en-US"/>
+        </w:rPr>
+        <w:t>6</w:t>
+      </w:r>
+      <w:r>
+        <w:rPr>
+          <w:rFonts w:ascii="Times New Roman" w:eastAsia="Times New Roman" w:hAnsi="Times New Roman" w:cs="Times New Roman"/>
+          <w:lang w:val="en-US"/>
+        </w:rPr>
+        <w:t>]</w:t>
+      </w:r>
+      <w:r>
+        <w:rPr>
+          <w:rFonts w:ascii="Times New Roman" w:eastAsia="Times New Roman" w:hAnsi="Times New Roman" w:cs="Times New Roman"/>
+          <w:lang w:val="en-US"/>
+        </w:rPr>
+        <w:t xml:space="preserve"> </w:t>
+      </w:r>
+      <w:r>
+        <w:rPr>
+          <w:rFonts w:ascii="Times New Roman" w:hAnsi="Times New Roman" w:cs="Times New Roman"/>
+          <w:lang w:val="en-US"/>
+        </w:rPr>
+        <w:t xml:space="preserve">Manda Nihari, Priyadarsini K. and Badhri S. </w:t>
+      </w:r>
+      <w:r>
+        <w:rPr>
+          <w:rFonts w:ascii="Times New Roman" w:eastAsia="Times New Roman" w:hAnsi="Times New Roman" w:cs="Times New Roman"/>
+          <w:b/>
+          <w:lang w:val="en-US"/>
+        </w:rPr>
+        <w:t>MNIST Digit Classification using Machine Learning Algorithm.</w:t>
+      </w:r>
+      <w:r>
+        <w:rPr>
+          <w:rFonts w:ascii="Times New Roman" w:eastAsia="Times New Roman" w:hAnsi="Times New Roman" w:cs="Times New Roman"/>
+          <w:lang w:val="en-US"/>
+        </w:rPr>
+        <w:t xml:space="preserve"> </w:t>
+      </w:r>
+      <w:r>
+        <w:rPr>
+          <w:rFonts w:ascii="Times New Roman" w:eastAsia="Times New Roman" w:hAnsi="Times New Roman" w:cs="Times New Roman"/>
+        </w:rPr>
+        <w:t>Disponível em:</w:t>
+      </w:r>
+      <w:r>
+        <w:rPr>
+          <w:rFonts w:ascii="Times New Roman" w:eastAsia="Times New Roman" w:hAnsi="Times New Roman" w:cs="Times New Roman"/>
+        </w:rPr>
+        <w:t xml:space="preserve"> </w:t>
+      </w:r>
+      <w:hyperlink r:id="rId9" w:history="1">
+        <w:r>
+          <w:rPr>
+            <w:rStyle w:val="Hyperlink"/>
+            <w:rFonts w:ascii="Times New Roman" w:eastAsia="Times New Roman" w:hAnsi="Times New Roman" w:cs="Times New Roman"/>
+          </w:rPr>
+          <w:t>https://www.riverpublishers.com/pdf/ebook/chapter/RP</w:t>
+        </w:r>
+      </w:hyperlink>
+      <w:r>
+        <w:rPr>
+          <w:rFonts w:ascii="Times New Roman" w:eastAsia="Times New Roman" w:hAnsi="Times New Roman" w:cs="Times New Roman"/>
+        </w:rPr>
+        <w:t xml:space="preserve"> </w:t>
+      </w:r>
+      <w:r>
+        <w:rPr>
+          <w:rFonts w:ascii="Times New Roman" w:eastAsia="Times New Roman" w:hAnsi="Times New Roman" w:cs="Times New Roman"/>
+        </w:rPr>
+        <w:t>_9788770040723C7.pdf. Acesso em: 01 de abril 2026.</w:t>
+      </w:r>
+    </w:p>
+    <w:p>
+      <w:pPr>
+        <w:spacing w:after="240"/>
+        <w:jc w:val="both"/>
+        <w:rPr>
+          <w:lang w:val="en-US"/>
+        </w:rPr>
+      </w:pPr>
+      <w:r>
+        <w:rPr>
+          <w:rFonts w:ascii="Times New Roman" w:eastAsia="Times New Roman" w:hAnsi="Times New Roman" w:cs="Times New Roman"/>
+          <w:lang w:val="en-US"/>
+        </w:rPr>
+        <w:t xml:space="preserve">[7] </w:t>
+      </w:r>
+      <w:r>
+        <w:rPr>
+          <w:lang w:val="en-US"/>
+        </w:rPr>
+        <w:t xml:space="preserve">Donald Thomas e Philip Moorby. </w:t>
+      </w:r>
+      <w:r>
+        <w:rPr>
+          <w:b/>
+          <w:lang w:val="en-US"/>
+        </w:rPr>
+        <w:t>The Verilog</w:t>
+      </w:r>
+      <w:r>
+        <w:rPr>
+          <w:rFonts w:hint="cs"/>
+          <w:b/>
+          <w:lang w:val="en-US"/>
+        </w:rPr>
+        <w:t xml:space="preserve"> </w:t>
+      </w:r>
+      <w:r>
+        <w:rPr>
+          <w:b/>
+          <w:lang w:val="en-US"/>
+        </w:rPr>
+        <w:t>Hardware Description Language.</w:t>
+      </w:r>
+      <w:r>
+        <w:rPr>
+          <w:lang w:val="en-US"/>
+        </w:rPr>
+        <w:t xml:space="preserve"> Springer, 2002. ISBN:9781402070891, 978-1402070891.</w:t>
+      </w:r>
+    </w:p>
+    <w:p>
+      <w:pPr>
+        <w:jc w:val="both"/>
+        <w:rPr>
+          <w:rFonts w:ascii="Times New Roman" w:eastAsia="Times New Roman" w:hAnsi="Times New Roman" w:cs="Times New Roman"/>
+        </w:rPr>
+      </w:pPr>
     </w:p>
     <w:p>
       <w:pPr>
@@ -1743,6 +3844,304 @@
     </w:lvl>
   </w:abstractNum>
   <w:abstractNum w:abstractNumId="3" w15:restartNumberingAfterBreak="0">
+    <w:nsid w:val="0A7B438B"/>
+    <w:multiLevelType w:val="multilevel"/>
+    <w:tmpl w:val="D584E88A"/>
+    <w:lvl w:ilvl="0">
+      <w:start w:val="1"/>
+      <w:numFmt w:val="bullet"/>
+      <w:lvlText w:val=""/>
+      <w:lvlJc w:val="left"/>
+      <w:pPr>
+        <w:tabs>
+          <w:tab w:val="num" w:pos="720"/>
+        </w:tabs>
+        <w:ind w:left="720" w:hanging="360"/>
+      </w:pPr>
+      <w:rPr>
+        <w:rFonts w:ascii="Symbol" w:hAnsi="Symbol" w:hint="default"/>
+        <w:sz w:val="20"/>
+      </w:rPr>
+    </w:lvl>
+    <w:lvl w:ilvl="1">
+      <w:start w:val="1"/>
+      <w:numFmt w:val="bullet"/>
+      <w:lvlText w:val="o"/>
+      <w:lvlJc w:val="left"/>
+      <w:pPr>
+        <w:tabs>
+          <w:tab w:val="num" w:pos="1440"/>
+        </w:tabs>
+        <w:ind w:left="1440" w:hanging="360"/>
+      </w:pPr>
+      <w:rPr>
+        <w:rFonts w:ascii="Courier New" w:hAnsi="Courier New" w:hint="default"/>
+        <w:sz w:val="20"/>
+      </w:rPr>
+    </w:lvl>
+    <w:lvl w:ilvl="2" w:tentative="1">
+      <w:start w:val="1"/>
+      <w:numFmt w:val="bullet"/>
+      <w:lvlText w:val=""/>
+      <w:lvlJc w:val="left"/>
+      <w:pPr>
+        <w:tabs>
+          <w:tab w:val="num" w:pos="2160"/>
+        </w:tabs>
+        <w:ind w:left="2160" w:hanging="360"/>
+      </w:pPr>
+      <w:rPr>
+        <w:rFonts w:ascii="Wingdings" w:hAnsi="Wingdings" w:hint="default"/>
+        <w:sz w:val="20"/>
+      </w:rPr>
+    </w:lvl>
+    <w:lvl w:ilvl="3" w:tentative="1">
+      <w:start w:val="1"/>
+      <w:numFmt w:val="bullet"/>
+      <w:lvlText w:val=""/>
+      <w:lvlJc w:val="left"/>
+      <w:pPr>
+        <w:tabs>
+          <w:tab w:val="num" w:pos="2880"/>
+        </w:tabs>
+        <w:ind w:left="2880" w:hanging="360"/>
+      </w:pPr>
+      <w:rPr>
+        <w:rFonts w:ascii="Wingdings" w:hAnsi="Wingdings" w:hint="default"/>
+        <w:sz w:val="20"/>
+      </w:rPr>
+    </w:lvl>
+    <w:lvl w:ilvl="4" w:tentative="1">
+      <w:start w:val="1"/>
+      <w:numFmt w:val="bullet"/>
+      <w:lvlText w:val=""/>
+      <w:lvlJc w:val="left"/>
+      <w:pPr>
+        <w:tabs>
+          <w:tab w:val="num" w:pos="3600"/>
+        </w:tabs>
+        <w:ind w:left="3600" w:hanging="360"/>
+      </w:pPr>
+      <w:rPr>
+        <w:rFonts w:ascii="Wingdings" w:hAnsi="Wingdings" w:hint="default"/>
+        <w:sz w:val="20"/>
+      </w:rPr>
+    </w:lvl>
+    <w:lvl w:ilvl="5" w:tentative="1">
+      <w:start w:val="1"/>
+      <w:numFmt w:val="bullet"/>
+      <w:lvlText w:val=""/>
+      <w:lvlJc w:val="left"/>
+      <w:pPr>
+        <w:tabs>
+          <w:tab w:val="num" w:pos="4320"/>
+        </w:tabs>
+        <w:ind w:left="4320" w:hanging="360"/>
+      </w:pPr>
+      <w:rPr>
+        <w:rFonts w:ascii="Wingdings" w:hAnsi="Wingdings" w:hint="default"/>
+        <w:sz w:val="20"/>
+      </w:rPr>
+    </w:lvl>
+    <w:lvl w:ilvl="6" w:tentative="1">
+      <w:start w:val="1"/>
+      <w:numFmt w:val="bullet"/>
+      <w:lvlText w:val=""/>
+      <w:lvlJc w:val="left"/>
+      <w:pPr>
+        <w:tabs>
+          <w:tab w:val="num" w:pos="5040"/>
+        </w:tabs>
+        <w:ind w:left="5040" w:hanging="360"/>
+      </w:pPr>
+      <w:rPr>
+        <w:rFonts w:ascii="Wingdings" w:hAnsi="Wingdings" w:hint="default"/>
+        <w:sz w:val="20"/>
+      </w:rPr>
+    </w:lvl>
+    <w:lvl w:ilvl="7" w:tentative="1">
+      <w:start w:val="1"/>
+      <w:numFmt w:val="bullet"/>
+      <w:lvlText w:val=""/>
+      <w:lvlJc w:val="left"/>
+      <w:pPr>
+        <w:tabs>
+          <w:tab w:val="num" w:pos="5760"/>
+        </w:tabs>
+        <w:ind w:left="5760" w:hanging="360"/>
+      </w:pPr>
+      <w:rPr>
+        <w:rFonts w:ascii="Wingdings" w:hAnsi="Wingdings" w:hint="default"/>
+        <w:sz w:val="20"/>
+      </w:rPr>
+    </w:lvl>
+    <w:lvl w:ilvl="8" w:tentative="1">
+      <w:start w:val="1"/>
+      <w:numFmt w:val="bullet"/>
+      <w:lvlText w:val=""/>
+      <w:lvlJc w:val="left"/>
+      <w:pPr>
+        <w:tabs>
+          <w:tab w:val="num" w:pos="6480"/>
+        </w:tabs>
+        <w:ind w:left="6480" w:hanging="360"/>
+      </w:pPr>
+      <w:rPr>
+        <w:rFonts w:ascii="Wingdings" w:hAnsi="Wingdings" w:hint="default"/>
+        <w:sz w:val="20"/>
+      </w:rPr>
+    </w:lvl>
+  </w:abstractNum>
+  <w:abstractNum w:abstractNumId="4" w15:restartNumberingAfterBreak="0">
+    <w:nsid w:val="0B950BC9"/>
+    <w:multiLevelType w:val="multilevel"/>
+    <w:tmpl w:val="9C806454"/>
+    <w:lvl w:ilvl="0">
+      <w:start w:val="1"/>
+      <w:numFmt w:val="bullet"/>
+      <w:lvlText w:val=""/>
+      <w:lvlJc w:val="left"/>
+      <w:pPr>
+        <w:tabs>
+          <w:tab w:val="num" w:pos="720"/>
+        </w:tabs>
+        <w:ind w:left="720" w:hanging="360"/>
+      </w:pPr>
+      <w:rPr>
+        <w:rFonts w:ascii="Symbol" w:hAnsi="Symbol" w:hint="default"/>
+        <w:sz w:val="20"/>
+      </w:rPr>
+    </w:lvl>
+    <w:lvl w:ilvl="1" w:tentative="1">
+      <w:start w:val="1"/>
+      <w:numFmt w:val="bullet"/>
+      <w:lvlText w:val="o"/>
+      <w:lvlJc w:val="left"/>
+      <w:pPr>
+        <w:tabs>
+          <w:tab w:val="num" w:pos="1440"/>
+        </w:tabs>
+        <w:ind w:left="1440" w:hanging="360"/>
+      </w:pPr>
+      <w:rPr>
+        <w:rFonts w:ascii="Courier New" w:hAnsi="Courier New" w:hint="default"/>
+        <w:sz w:val="20"/>
+      </w:rPr>
+    </w:lvl>
+    <w:lvl w:ilvl="2" w:tentative="1">
+      <w:start w:val="1"/>
+      <w:numFmt w:val="bullet"/>
+      <w:lvlText w:val=""/>
+      <w:lvlJc w:val="left"/>
+      <w:pPr>
+        <w:tabs>
+          <w:tab w:val="num" w:pos="2160"/>
+        </w:tabs>
+        <w:ind w:left="2160" w:hanging="360"/>
+      </w:pPr>
+      <w:rPr>
+        <w:rFonts w:ascii="Wingdings" w:hAnsi="Wingdings" w:hint="default"/>
+        <w:sz w:val="20"/>
+      </w:rPr>
+    </w:lvl>
+    <w:lvl w:ilvl="3" w:tentative="1">
+      <w:start w:val="1"/>
+      <w:numFmt w:val="bullet"/>
+      <w:lvlText w:val=""/>
+      <w:lvlJc w:val="left"/>
+      <w:pPr>
+        <w:tabs>
+          <w:tab w:val="num" w:pos="2880"/>
+        </w:tabs>
+        <w:ind w:left="2880" w:hanging="360"/>
+      </w:pPr>
+      <w:rPr>
+        <w:rFonts w:ascii="Wingdings" w:hAnsi="Wingdings" w:hint="default"/>
+        <w:sz w:val="20"/>
+      </w:rPr>
+    </w:lvl>
+    <w:lvl w:ilvl="4" w:tentative="1">
+      <w:start w:val="1"/>
+      <w:numFmt w:val="bullet"/>
+      <w:lvlText w:val=""/>
+      <w:lvlJc w:val="left"/>
+      <w:pPr>
+        <w:tabs>
+          <w:tab w:val="num" w:pos="3600"/>
+        </w:tabs>
+        <w:ind w:left="3600" w:hanging="360"/>
+      </w:pPr>
+      <w:rPr>
+        <w:rFonts w:ascii="Wingdings" w:hAnsi="Wingdings" w:hint="default"/>
+        <w:sz w:val="20"/>
+      </w:rPr>
+    </w:lvl>
+    <w:lvl w:ilvl="5" w:tentative="1">
+      <w:start w:val="1"/>
+      <w:numFmt w:val="bullet"/>
+      <w:lvlText w:val=""/>
+      <w:lvlJc w:val="left"/>
+      <w:pPr>
+        <w:tabs>
+          <w:tab w:val="num" w:pos="4320"/>
+        </w:tabs>
+        <w:ind w:left="4320" w:hanging="360"/>
+      </w:pPr>
+      <w:rPr>
+        <w:rFonts w:ascii="Wingdings" w:hAnsi="Wingdings" w:hint="default"/>
+        <w:sz w:val="20"/>
+      </w:rPr>
+    </w:lvl>
+    <w:lvl w:ilvl="6" w:tentative="1">
+      <w:start w:val="1"/>
+      <w:numFmt w:val="bullet"/>
+      <w:lvlText w:val=""/>
+      <w:lvlJc w:val="left"/>
+      <w:pPr>
+        <w:tabs>
+          <w:tab w:val="num" w:pos="5040"/>
+        </w:tabs>
+        <w:ind w:left="5040" w:hanging="360"/>
+      </w:pPr>
+      <w:rPr>
+        <w:rFonts w:ascii="Wingdings" w:hAnsi="Wingdings" w:hint="default"/>
+        <w:sz w:val="20"/>
+      </w:rPr>
+    </w:lvl>
+    <w:lvl w:ilvl="7" w:tentative="1">
+      <w:start w:val="1"/>
+      <w:numFmt w:val="bullet"/>
+      <w:lvlText w:val=""/>
+      <w:lvlJc w:val="left"/>
+      <w:pPr>
+        <w:tabs>
+          <w:tab w:val="num" w:pos="5760"/>
+        </w:tabs>
+        <w:ind w:left="5760" w:hanging="360"/>
+      </w:pPr>
+      <w:rPr>
+        <w:rFonts w:ascii="Wingdings" w:hAnsi="Wingdings" w:hint="default"/>
+        <w:sz w:val="20"/>
+      </w:rPr>
+    </w:lvl>
+    <w:lvl w:ilvl="8" w:tentative="1">
+      <w:start w:val="1"/>
+      <w:numFmt w:val="bullet"/>
+      <w:lvlText w:val=""/>
+      <w:lvlJc w:val="left"/>
+      <w:pPr>
+        <w:tabs>
+          <w:tab w:val="num" w:pos="6480"/>
+        </w:tabs>
+        <w:ind w:left="6480" w:hanging="360"/>
+      </w:pPr>
+      <w:rPr>
+        <w:rFonts w:ascii="Wingdings" w:hAnsi="Wingdings" w:hint="default"/>
+        <w:sz w:val="20"/>
+      </w:rPr>
+    </w:lvl>
+  </w:abstractNum>
+  <w:abstractNum w:abstractNumId="5" w15:restartNumberingAfterBreak="0">
     <w:nsid w:val="0FBA8641"/>
     <w:multiLevelType w:val="hybridMultilevel"/>
     <w:tmpl w:val="5B764BCA"/>
@@ -1855,7 +4254,7 @@
       </w:rPr>
     </w:lvl>
   </w:abstractNum>
-  <w:abstractNum w:abstractNumId="4" w15:restartNumberingAfterBreak="0">
+  <w:abstractNum w:abstractNumId="6" w15:restartNumberingAfterBreak="0">
     <w:nsid w:val="108D1C16"/>
     <w:multiLevelType w:val="hybridMultilevel"/>
     <w:tmpl w:val="26943FB6"/>
@@ -1941,7 +4340,7 @@
       </w:pPr>
     </w:lvl>
   </w:abstractNum>
-  <w:abstractNum w:abstractNumId="5" w15:restartNumberingAfterBreak="0">
+  <w:abstractNum w:abstractNumId="7" w15:restartNumberingAfterBreak="0">
     <w:nsid w:val="13540325"/>
     <w:multiLevelType w:val="hybridMultilevel"/>
     <w:tmpl w:val="6518C9DC"/>
@@ -2054,7 +4453,7 @@
       </w:rPr>
     </w:lvl>
   </w:abstractNum>
-  <w:abstractNum w:abstractNumId="6" w15:restartNumberingAfterBreak="0">
+  <w:abstractNum w:abstractNumId="8" w15:restartNumberingAfterBreak="0">
     <w:nsid w:val="15CEE7BB"/>
     <w:multiLevelType w:val="hybridMultilevel"/>
     <w:tmpl w:val="E050F994"/>
@@ -2140,7 +4539,156 @@
       </w:pPr>
     </w:lvl>
   </w:abstractNum>
-  <w:abstractNum w:abstractNumId="7" w15:restartNumberingAfterBreak="0">
+  <w:abstractNum w:abstractNumId="9" w15:restartNumberingAfterBreak="0">
+    <w:nsid w:val="16BF5C54"/>
+    <w:multiLevelType w:val="multilevel"/>
+    <w:tmpl w:val="B9DCE4D2"/>
+    <w:lvl w:ilvl="0">
+      <w:start w:val="1"/>
+      <w:numFmt w:val="bullet"/>
+      <w:lvlText w:val=""/>
+      <w:lvlJc w:val="left"/>
+      <w:pPr>
+        <w:tabs>
+          <w:tab w:val="num" w:pos="720"/>
+        </w:tabs>
+        <w:ind w:left="720" w:hanging="360"/>
+      </w:pPr>
+      <w:rPr>
+        <w:rFonts w:ascii="Symbol" w:hAnsi="Symbol" w:hint="default"/>
+        <w:sz w:val="20"/>
+      </w:rPr>
+    </w:lvl>
+    <w:lvl w:ilvl="1" w:tentative="1">
+      <w:start w:val="1"/>
+      <w:numFmt w:val="bullet"/>
+      <w:lvlText w:val="o"/>
+      <w:lvlJc w:val="left"/>
+      <w:pPr>
+        <w:tabs>
+          <w:tab w:val="num" w:pos="1440"/>
+        </w:tabs>
+        <w:ind w:left="1440" w:hanging="360"/>
+      </w:pPr>
+      <w:rPr>
+        <w:rFonts w:ascii="Courier New" w:hAnsi="Courier New" w:hint="default"/>
+        <w:sz w:val="20"/>
+      </w:rPr>
+    </w:lvl>
+    <w:lvl w:ilvl="2" w:tentative="1">
+      <w:start w:val="1"/>
+      <w:numFmt w:val="bullet"/>
+      <w:lvlText w:val=""/>
+      <w:lvlJc w:val="left"/>
+      <w:pPr>
+        <w:tabs>
+          <w:tab w:val="num" w:pos="2160"/>
+        </w:tabs>
+        <w:ind w:left="2160" w:hanging="360"/>
+      </w:pPr>
+      <w:rPr>
+        <w:rFonts w:ascii="Wingdings" w:hAnsi="Wingdings" w:hint="default"/>
+        <w:sz w:val="20"/>
+      </w:rPr>
+    </w:lvl>
+    <w:lvl w:ilvl="3" w:tentative="1">
+      <w:start w:val="1"/>
+      <w:numFmt w:val="bullet"/>
+      <w:lvlText w:val=""/>
+      <w:lvlJc w:val="left"/>
+      <w:pPr>
+        <w:tabs>
+          <w:tab w:val="num" w:pos="2880"/>
+        </w:tabs>
+        <w:ind w:left="2880" w:hanging="360"/>
+      </w:pPr>
+      <w:rPr>
+        <w:rFonts w:ascii="Wingdings" w:hAnsi="Wingdings" w:hint="default"/>
+        <w:sz w:val="20"/>
+      </w:rPr>
+    </w:lvl>
+    <w:lvl w:ilvl="4" w:tentative="1">
+      <w:start w:val="1"/>
+      <w:numFmt w:val="bullet"/>
+      <w:lvlText w:val=""/>
+      <w:lvlJc w:val="left"/>
+      <w:pPr>
+        <w:tabs>
+          <w:tab w:val="num" w:pos="3600"/>
+        </w:tabs>
+        <w:ind w:left="3600" w:hanging="360"/>
+      </w:pPr>
+      <w:rPr>
+        <w:rFonts w:ascii="Wingdings" w:hAnsi="Wingdings" w:hint="default"/>
+        <w:sz w:val="20"/>
+      </w:rPr>
+    </w:lvl>
+    <w:lvl w:ilvl="5" w:tentative="1">
+      <w:start w:val="1"/>
+      <w:numFmt w:val="bullet"/>
+      <w:lvlText w:val=""/>
+      <w:lvlJc w:val="left"/>
+      <w:pPr>
+        <w:tabs>
+          <w:tab w:val="num" w:pos="4320"/>
+        </w:tabs>
+        <w:ind w:left="4320" w:hanging="360"/>
+      </w:pPr>
+      <w:rPr>
+        <w:rFonts w:ascii="Wingdings" w:hAnsi="Wingdings" w:hint="default"/>
+        <w:sz w:val="20"/>
+      </w:rPr>
+    </w:lvl>
+    <w:lvl w:ilvl="6" w:tentative="1">
+      <w:start w:val="1"/>
+      <w:numFmt w:val="bullet"/>
+      <w:lvlText w:val=""/>
+      <w:lvlJc w:val="left"/>
+      <w:pPr>
+        <w:tabs>
+          <w:tab w:val="num" w:pos="5040"/>
+        </w:tabs>
+        <w:ind w:left="5040" w:hanging="360"/>
+      </w:pPr>
+      <w:rPr>
+        <w:rFonts w:ascii="Wingdings" w:hAnsi="Wingdings" w:hint="default"/>
+        <w:sz w:val="20"/>
+      </w:rPr>
+    </w:lvl>
+    <w:lvl w:ilvl="7" w:tentative="1">
+      <w:start w:val="1"/>
+      <w:numFmt w:val="bullet"/>
+      <w:lvlText w:val=""/>
+      <w:lvlJc w:val="left"/>
+      <w:pPr>
+        <w:tabs>
+          <w:tab w:val="num" w:pos="5760"/>
+        </w:tabs>
+        <w:ind w:left="5760" w:hanging="360"/>
+      </w:pPr>
+      <w:rPr>
+        <w:rFonts w:ascii="Wingdings" w:hAnsi="Wingdings" w:hint="default"/>
+        <w:sz w:val="20"/>
+      </w:rPr>
+    </w:lvl>
+    <w:lvl w:ilvl="8" w:tentative="1">
+      <w:start w:val="1"/>
+      <w:numFmt w:val="bullet"/>
+      <w:lvlText w:val=""/>
+      <w:lvlJc w:val="left"/>
+      <w:pPr>
+        <w:tabs>
+          <w:tab w:val="num" w:pos="6480"/>
+        </w:tabs>
+        <w:ind w:left="6480" w:hanging="360"/>
+      </w:pPr>
+      <w:rPr>
+        <w:rFonts w:ascii="Wingdings" w:hAnsi="Wingdings" w:hint="default"/>
+        <w:sz w:val="20"/>
+      </w:rPr>
+    </w:lvl>
+  </w:abstractNum>
+  <w:abstractNum w:abstractNumId="10" w15:restartNumberingAfterBreak="0">
     <w:nsid w:val="1C3A5E05"/>
     <w:multiLevelType w:val="hybridMultilevel"/>
     <w:tmpl w:val="9086F2C4"/>
@@ -2253,7 +4801,7 @@
       </w:rPr>
     </w:lvl>
   </w:abstractNum>
-  <w:abstractNum w:abstractNumId="8" w15:restartNumberingAfterBreak="0">
+  <w:abstractNum w:abstractNumId="11" w15:restartNumberingAfterBreak="0">
     <w:nsid w:val="1EEDB41B"/>
     <w:multiLevelType w:val="hybridMultilevel"/>
     <w:tmpl w:val="0706F540"/>
@@ -2366,7 +4914,7 @@
       </w:rPr>
     </w:lvl>
   </w:abstractNum>
-  <w:abstractNum w:abstractNumId="9" w15:restartNumberingAfterBreak="0">
+  <w:abstractNum w:abstractNumId="12" w15:restartNumberingAfterBreak="0">
     <w:nsid w:val="25CF3F16"/>
     <w:multiLevelType w:val="hybridMultilevel"/>
     <w:tmpl w:val="8586C684"/>
@@ -2479,7 +5027,7 @@
       </w:rPr>
     </w:lvl>
   </w:abstractNum>
-  <w:abstractNum w:abstractNumId="10" w15:restartNumberingAfterBreak="0">
+  <w:abstractNum w:abstractNumId="13" w15:restartNumberingAfterBreak="0">
     <w:nsid w:val="2BBEBCBD"/>
     <w:multiLevelType w:val="hybridMultilevel"/>
     <w:tmpl w:val="937ED0F2"/>
@@ -2592,7 +5140,156 @@
       </w:rPr>
     </w:lvl>
   </w:abstractNum>
-  <w:abstractNum w:abstractNumId="11" w15:restartNumberingAfterBreak="0">
+  <w:abstractNum w:abstractNumId="14" w15:restartNumberingAfterBreak="0">
+    <w:nsid w:val="2CC52C15"/>
+    <w:multiLevelType w:val="multilevel"/>
+    <w:tmpl w:val="C3F2D4EC"/>
+    <w:lvl w:ilvl="0">
+      <w:start w:val="1"/>
+      <w:numFmt w:val="bullet"/>
+      <w:lvlText w:val=""/>
+      <w:lvlJc w:val="left"/>
+      <w:pPr>
+        <w:tabs>
+          <w:tab w:val="num" w:pos="720"/>
+        </w:tabs>
+        <w:ind w:left="720" w:hanging="360"/>
+      </w:pPr>
+      <w:rPr>
+        <w:rFonts w:ascii="Symbol" w:hAnsi="Symbol" w:hint="default"/>
+        <w:sz w:val="20"/>
+      </w:rPr>
+    </w:lvl>
+    <w:lvl w:ilvl="1" w:tentative="1">
+      <w:start w:val="1"/>
+      <w:numFmt w:val="bullet"/>
+      <w:lvlText w:val="o"/>
+      <w:lvlJc w:val="left"/>
+      <w:pPr>
+        <w:tabs>
+          <w:tab w:val="num" w:pos="1440"/>
+        </w:tabs>
+        <w:ind w:left="1440" w:hanging="360"/>
+      </w:pPr>
+      <w:rPr>
+        <w:rFonts w:ascii="Courier New" w:hAnsi="Courier New" w:hint="default"/>
+        <w:sz w:val="20"/>
+      </w:rPr>
+    </w:lvl>
+    <w:lvl w:ilvl="2" w:tentative="1">
+      <w:start w:val="1"/>
+      <w:numFmt w:val="bullet"/>
+      <w:lvlText w:val=""/>
+      <w:lvlJc w:val="left"/>
+      <w:pPr>
+        <w:tabs>
+          <w:tab w:val="num" w:pos="2160"/>
+        </w:tabs>
+        <w:ind w:left="2160" w:hanging="360"/>
+      </w:pPr>
+      <w:rPr>
+        <w:rFonts w:ascii="Wingdings" w:hAnsi="Wingdings" w:hint="default"/>
+        <w:sz w:val="20"/>
+      </w:rPr>
+    </w:lvl>
+    <w:lvl w:ilvl="3" w:tentative="1">
+      <w:start w:val="1"/>
+      <w:numFmt w:val="bullet"/>
+      <w:lvlText w:val=""/>
+      <w:lvlJc w:val="left"/>
+      <w:pPr>
+        <w:tabs>
+          <w:tab w:val="num" w:pos="2880"/>
+        </w:tabs>
+        <w:ind w:left="2880" w:hanging="360"/>
+      </w:pPr>
+      <w:rPr>
+        <w:rFonts w:ascii="Wingdings" w:hAnsi="Wingdings" w:hint="default"/>
+        <w:sz w:val="20"/>
+      </w:rPr>
+    </w:lvl>
+    <w:lvl w:ilvl="4" w:tentative="1">
+      <w:start w:val="1"/>
+      <w:numFmt w:val="bullet"/>
+      <w:lvlText w:val=""/>
+      <w:lvlJc w:val="left"/>
+      <w:pPr>
+        <w:tabs>
+          <w:tab w:val="num" w:pos="3600"/>
+        </w:tabs>
+        <w:ind w:left="3600" w:hanging="360"/>
+      </w:pPr>
+      <w:rPr>
+        <w:rFonts w:ascii="Wingdings" w:hAnsi="Wingdings" w:hint="default"/>
+        <w:sz w:val="20"/>
+      </w:rPr>
+    </w:lvl>
+    <w:lvl w:ilvl="5" w:tentative="1">
+      <w:start w:val="1"/>
+      <w:numFmt w:val="bullet"/>
+      <w:lvlText w:val=""/>
+      <w:lvlJc w:val="left"/>
+      <w:pPr>
+        <w:tabs>
+          <w:tab w:val="num" w:pos="4320"/>
+        </w:tabs>
+        <w:ind w:left="4320" w:hanging="360"/>
+      </w:pPr>
+      <w:rPr>
+        <w:rFonts w:ascii="Wingdings" w:hAnsi="Wingdings" w:hint="default"/>
+        <w:sz w:val="20"/>
+      </w:rPr>
+    </w:lvl>
+    <w:lvl w:ilvl="6" w:tentative="1">
+      <w:start w:val="1"/>
+      <w:numFmt w:val="bullet"/>
+      <w:lvlText w:val=""/>
+      <w:lvlJc w:val="left"/>
+      <w:pPr>
+        <w:tabs>
+          <w:tab w:val="num" w:pos="5040"/>
+        </w:tabs>
+        <w:ind w:left="5040" w:hanging="360"/>
+      </w:pPr>
+      <w:rPr>
+        <w:rFonts w:ascii="Wingdings" w:hAnsi="Wingdings" w:hint="default"/>
+        <w:sz w:val="20"/>
+      </w:rPr>
+    </w:lvl>
+    <w:lvl w:ilvl="7" w:tentative="1">
+      <w:start w:val="1"/>
+      <w:numFmt w:val="bullet"/>
+      <w:lvlText w:val=""/>
+      <w:lvlJc w:val="left"/>
+      <w:pPr>
+        <w:tabs>
+          <w:tab w:val="num" w:pos="5760"/>
+        </w:tabs>
+        <w:ind w:left="5760" w:hanging="360"/>
+      </w:pPr>
+      <w:rPr>
+        <w:rFonts w:ascii="Wingdings" w:hAnsi="Wingdings" w:hint="default"/>
+        <w:sz w:val="20"/>
+      </w:rPr>
+    </w:lvl>
+    <w:lvl w:ilvl="8" w:tentative="1">
+      <w:start w:val="1"/>
+      <w:numFmt w:val="bullet"/>
+      <w:lvlText w:val=""/>
+      <w:lvlJc w:val="left"/>
+      <w:pPr>
+        <w:tabs>
+          <w:tab w:val="num" w:pos="6480"/>
+        </w:tabs>
+        <w:ind w:left="6480" w:hanging="360"/>
+      </w:pPr>
+      <w:rPr>
+        <w:rFonts w:ascii="Wingdings" w:hAnsi="Wingdings" w:hint="default"/>
+        <w:sz w:val="20"/>
+      </w:rPr>
+    </w:lvl>
+  </w:abstractNum>
+  <w:abstractNum w:abstractNumId="15" w15:restartNumberingAfterBreak="0">
     <w:nsid w:val="2E4D600A"/>
     <w:multiLevelType w:val="hybridMultilevel"/>
     <w:tmpl w:val="12CC5E72"/>
@@ -2705,7 +5402,7 @@
       </w:rPr>
     </w:lvl>
   </w:abstractNum>
-  <w:abstractNum w:abstractNumId="12" w15:restartNumberingAfterBreak="0">
+  <w:abstractNum w:abstractNumId="16" w15:restartNumberingAfterBreak="0">
     <w:nsid w:val="2F3554B4"/>
     <w:multiLevelType w:val="hybridMultilevel"/>
     <w:tmpl w:val="D22ECEC4"/>
@@ -2818,7 +5515,7 @@
       </w:rPr>
     </w:lvl>
   </w:abstractNum>
-  <w:abstractNum w:abstractNumId="13" w15:restartNumberingAfterBreak="0">
+  <w:abstractNum w:abstractNumId="17" w15:restartNumberingAfterBreak="0">
     <w:nsid w:val="2F735A07"/>
     <w:multiLevelType w:val="hybridMultilevel"/>
     <w:tmpl w:val="759C7D72"/>
@@ -2931,7 +5628,7 @@
       </w:rPr>
     </w:lvl>
   </w:abstractNum>
-  <w:abstractNum w:abstractNumId="14" w15:restartNumberingAfterBreak="0">
+  <w:abstractNum w:abstractNumId="18" w15:restartNumberingAfterBreak="0">
     <w:nsid w:val="3C022996"/>
     <w:multiLevelType w:val="hybridMultilevel"/>
     <w:tmpl w:val="08ECA642"/>
@@ -3044,7 +5741,7 @@
       </w:rPr>
     </w:lvl>
   </w:abstractNum>
-  <w:abstractNum w:abstractNumId="15" w15:restartNumberingAfterBreak="0">
+  <w:abstractNum w:abstractNumId="19" w15:restartNumberingAfterBreak="0">
     <w:nsid w:val="3CF98809"/>
     <w:multiLevelType w:val="hybridMultilevel"/>
     <w:tmpl w:val="9D729E8E"/>
@@ -3157,7 +5854,7 @@
       </w:rPr>
     </w:lvl>
   </w:abstractNum>
-  <w:abstractNum w:abstractNumId="16" w15:restartNumberingAfterBreak="0">
+  <w:abstractNum w:abstractNumId="20" w15:restartNumberingAfterBreak="0">
     <w:nsid w:val="3DD5689E"/>
     <w:multiLevelType w:val="hybridMultilevel"/>
     <w:tmpl w:val="3A9CF598"/>
@@ -3270,7 +5967,7 @@
       </w:rPr>
     </w:lvl>
   </w:abstractNum>
-  <w:abstractNum w:abstractNumId="17" w15:restartNumberingAfterBreak="0">
+  <w:abstractNum w:abstractNumId="21" w15:restartNumberingAfterBreak="0">
     <w:nsid w:val="3E17CF1D"/>
     <w:multiLevelType w:val="hybridMultilevel"/>
     <w:tmpl w:val="79C865F4"/>
@@ -3383,7 +6080,156 @@
       </w:rPr>
     </w:lvl>
   </w:abstractNum>
-  <w:abstractNum w:abstractNumId="18" w15:restartNumberingAfterBreak="0">
+  <w:abstractNum w:abstractNumId="22" w15:restartNumberingAfterBreak="0">
+    <w:nsid w:val="3E922AA0"/>
+    <w:multiLevelType w:val="multilevel"/>
+    <w:tmpl w:val="D52A5C0C"/>
+    <w:lvl w:ilvl="0">
+      <w:start w:val="1"/>
+      <w:numFmt w:val="bullet"/>
+      <w:lvlText w:val=""/>
+      <w:lvlJc w:val="left"/>
+      <w:pPr>
+        <w:tabs>
+          <w:tab w:val="num" w:pos="720"/>
+        </w:tabs>
+        <w:ind w:left="720" w:hanging="360"/>
+      </w:pPr>
+      <w:rPr>
+        <w:rFonts w:ascii="Symbol" w:hAnsi="Symbol" w:hint="default"/>
+        <w:sz w:val="20"/>
+      </w:rPr>
+    </w:lvl>
+    <w:lvl w:ilvl="1" w:tentative="1">
+      <w:start w:val="1"/>
+      <w:numFmt w:val="bullet"/>
+      <w:lvlText w:val="o"/>
+      <w:lvlJc w:val="left"/>
+      <w:pPr>
+        <w:tabs>
+          <w:tab w:val="num" w:pos="1440"/>
+        </w:tabs>
+        <w:ind w:left="1440" w:hanging="360"/>
+      </w:pPr>
+      <w:rPr>
+        <w:rFonts w:ascii="Courier New" w:hAnsi="Courier New" w:hint="default"/>
+        <w:sz w:val="20"/>
+      </w:rPr>
+    </w:lvl>
+    <w:lvl w:ilvl="2" w:tentative="1">
+      <w:start w:val="1"/>
+      <w:numFmt w:val="bullet"/>
+      <w:lvlText w:val=""/>
+      <w:lvlJc w:val="left"/>
+      <w:pPr>
+        <w:tabs>
+          <w:tab w:val="num" w:pos="2160"/>
+        </w:tabs>
+        <w:ind w:left="2160" w:hanging="360"/>
+      </w:pPr>
+      <w:rPr>
+        <w:rFonts w:ascii="Wingdings" w:hAnsi="Wingdings" w:hint="default"/>
+        <w:sz w:val="20"/>
+      </w:rPr>
+    </w:lvl>
+    <w:lvl w:ilvl="3" w:tentative="1">
+      <w:start w:val="1"/>
+      <w:numFmt w:val="bullet"/>
+      <w:lvlText w:val=""/>
+      <w:lvlJc w:val="left"/>
+      <w:pPr>
+        <w:tabs>
+          <w:tab w:val="num" w:pos="2880"/>
+        </w:tabs>
+        <w:ind w:left="2880" w:hanging="360"/>
+      </w:pPr>
+      <w:rPr>
+        <w:rFonts w:ascii="Wingdings" w:hAnsi="Wingdings" w:hint="default"/>
+        <w:sz w:val="20"/>
+      </w:rPr>
+    </w:lvl>
+    <w:lvl w:ilvl="4" w:tentative="1">
+      <w:start w:val="1"/>
+      <w:numFmt w:val="bullet"/>
+      <w:lvlText w:val=""/>
+      <w:lvlJc w:val="left"/>
+      <w:pPr>
+        <w:tabs>
+          <w:tab w:val="num" w:pos="3600"/>
+        </w:tabs>
+        <w:ind w:left="3600" w:hanging="360"/>
+      </w:pPr>
+      <w:rPr>
+        <w:rFonts w:ascii="Wingdings" w:hAnsi="Wingdings" w:hint="default"/>
+        <w:sz w:val="20"/>
+      </w:rPr>
+    </w:lvl>
+    <w:lvl w:ilvl="5" w:tentative="1">
+      <w:start w:val="1"/>
+      <w:numFmt w:val="bullet"/>
+      <w:lvlText w:val=""/>
+      <w:lvlJc w:val="left"/>
+      <w:pPr>
+        <w:tabs>
+          <w:tab w:val="num" w:pos="4320"/>
+        </w:tabs>
+        <w:ind w:left="4320" w:hanging="360"/>
+      </w:pPr>
+      <w:rPr>
+        <w:rFonts w:ascii="Wingdings" w:hAnsi="Wingdings" w:hint="default"/>
+        <w:sz w:val="20"/>
+      </w:rPr>
+    </w:lvl>
+    <w:lvl w:ilvl="6" w:tentative="1">
+      <w:start w:val="1"/>
+      <w:numFmt w:val="bullet"/>
+      <w:lvlText w:val=""/>
+      <w:lvlJc w:val="left"/>
+      <w:pPr>
+        <w:tabs>
+          <w:tab w:val="num" w:pos="5040"/>
+        </w:tabs>
+        <w:ind w:left="5040" w:hanging="360"/>
+      </w:pPr>
+      <w:rPr>
+        <w:rFonts w:ascii="Wingdings" w:hAnsi="Wingdings" w:hint="default"/>
+        <w:sz w:val="20"/>
+      </w:rPr>
+    </w:lvl>
+    <w:lvl w:ilvl="7" w:tentative="1">
+      <w:start w:val="1"/>
+      <w:numFmt w:val="bullet"/>
+      <w:lvlText w:val=""/>
+      <w:lvlJc w:val="left"/>
+      <w:pPr>
+        <w:tabs>
+          <w:tab w:val="num" w:pos="5760"/>
+        </w:tabs>
+        <w:ind w:left="5760" w:hanging="360"/>
+      </w:pPr>
+      <w:rPr>
+        <w:rFonts w:ascii="Wingdings" w:hAnsi="Wingdings" w:hint="default"/>
+        <w:sz w:val="20"/>
+      </w:rPr>
+    </w:lvl>
+    <w:lvl w:ilvl="8" w:tentative="1">
+      <w:start w:val="1"/>
+      <w:numFmt w:val="bullet"/>
+      <w:lvlText w:val=""/>
+      <w:lvlJc w:val="left"/>
+      <w:pPr>
+        <w:tabs>
+          <w:tab w:val="num" w:pos="6480"/>
+        </w:tabs>
+        <w:ind w:left="6480" w:hanging="360"/>
+      </w:pPr>
+      <w:rPr>
+        <w:rFonts w:ascii="Wingdings" w:hAnsi="Wingdings" w:hint="default"/>
+        <w:sz w:val="20"/>
+      </w:rPr>
+    </w:lvl>
+  </w:abstractNum>
+  <w:abstractNum w:abstractNumId="23" w15:restartNumberingAfterBreak="0">
     <w:nsid w:val="4179E714"/>
     <w:multiLevelType w:val="hybridMultilevel"/>
     <w:tmpl w:val="62E8CF9C"/>
@@ -3496,7 +6342,156 @@
       </w:rPr>
     </w:lvl>
   </w:abstractNum>
-  <w:abstractNum w:abstractNumId="19" w15:restartNumberingAfterBreak="0">
+  <w:abstractNum w:abstractNumId="24" w15:restartNumberingAfterBreak="0">
+    <w:nsid w:val="46BB41ED"/>
+    <w:multiLevelType w:val="multilevel"/>
+    <w:tmpl w:val="DCFEB9FA"/>
+    <w:lvl w:ilvl="0">
+      <w:start w:val="1"/>
+      <w:numFmt w:val="bullet"/>
+      <w:lvlText w:val=""/>
+      <w:lvlJc w:val="left"/>
+      <w:pPr>
+        <w:tabs>
+          <w:tab w:val="num" w:pos="720"/>
+        </w:tabs>
+        <w:ind w:left="720" w:hanging="360"/>
+      </w:pPr>
+      <w:rPr>
+        <w:rFonts w:ascii="Symbol" w:hAnsi="Symbol" w:hint="default"/>
+        <w:sz w:val="20"/>
+      </w:rPr>
+    </w:lvl>
+    <w:lvl w:ilvl="1" w:tentative="1">
+      <w:start w:val="1"/>
+      <w:numFmt w:val="bullet"/>
+      <w:lvlText w:val="o"/>
+      <w:lvlJc w:val="left"/>
+      <w:pPr>
+        <w:tabs>
+          <w:tab w:val="num" w:pos="1440"/>
+        </w:tabs>
+        <w:ind w:left="1440" w:hanging="360"/>
+      </w:pPr>
+      <w:rPr>
+        <w:rFonts w:ascii="Courier New" w:hAnsi="Courier New" w:hint="default"/>
+        <w:sz w:val="20"/>
+      </w:rPr>
+    </w:lvl>
+    <w:lvl w:ilvl="2" w:tentative="1">
+      <w:start w:val="1"/>
+      <w:numFmt w:val="bullet"/>
+      <w:lvlText w:val=""/>
+      <w:lvlJc w:val="left"/>
+      <w:pPr>
+        <w:tabs>
+          <w:tab w:val="num" w:pos="2160"/>
+        </w:tabs>
+        <w:ind w:left="2160" w:hanging="360"/>
+      </w:pPr>
+      <w:rPr>
+        <w:rFonts w:ascii="Wingdings" w:hAnsi="Wingdings" w:hint="default"/>
+        <w:sz w:val="20"/>
+      </w:rPr>
+    </w:lvl>
+    <w:lvl w:ilvl="3" w:tentative="1">
+      <w:start w:val="1"/>
+      <w:numFmt w:val="bullet"/>
+      <w:lvlText w:val=""/>
+      <w:lvlJc w:val="left"/>
+      <w:pPr>
+        <w:tabs>
+          <w:tab w:val="num" w:pos="2880"/>
+        </w:tabs>
+        <w:ind w:left="2880" w:hanging="360"/>
+      </w:pPr>
+      <w:rPr>
+        <w:rFonts w:ascii="Wingdings" w:hAnsi="Wingdings" w:hint="default"/>
+        <w:sz w:val="20"/>
+      </w:rPr>
+    </w:lvl>
+    <w:lvl w:ilvl="4" w:tentative="1">
+      <w:start w:val="1"/>
+      <w:numFmt w:val="bullet"/>
+      <w:lvlText w:val=""/>
+      <w:lvlJc w:val="left"/>
+      <w:pPr>
+        <w:tabs>
+          <w:tab w:val="num" w:pos="3600"/>
+        </w:tabs>
+        <w:ind w:left="3600" w:hanging="360"/>
+      </w:pPr>
+      <w:rPr>
+        <w:rFonts w:ascii="Wingdings" w:hAnsi="Wingdings" w:hint="default"/>
+        <w:sz w:val="20"/>
+      </w:rPr>
+    </w:lvl>
+    <w:lvl w:ilvl="5" w:tentative="1">
+      <w:start w:val="1"/>
+      <w:numFmt w:val="bullet"/>
+      <w:lvlText w:val=""/>
+      <w:lvlJc w:val="left"/>
+      <w:pPr>
+        <w:tabs>
+          <w:tab w:val="num" w:pos="4320"/>
+        </w:tabs>
+        <w:ind w:left="4320" w:hanging="360"/>
+      </w:pPr>
+      <w:rPr>
+        <w:rFonts w:ascii="Wingdings" w:hAnsi="Wingdings" w:hint="default"/>
+        <w:sz w:val="20"/>
+      </w:rPr>
+    </w:lvl>
+    <w:lvl w:ilvl="6" w:tentative="1">
+      <w:start w:val="1"/>
+      <w:numFmt w:val="bullet"/>
+      <w:lvlText w:val=""/>
+      <w:lvlJc w:val="left"/>
+      <w:pPr>
+        <w:tabs>
+          <w:tab w:val="num" w:pos="5040"/>
+        </w:tabs>
+        <w:ind w:left="5040" w:hanging="360"/>
+      </w:pPr>
+      <w:rPr>
+        <w:rFonts w:ascii="Wingdings" w:hAnsi="Wingdings" w:hint="default"/>
+        <w:sz w:val="20"/>
+      </w:rPr>
+    </w:lvl>
+    <w:lvl w:ilvl="7" w:tentative="1">
+      <w:start w:val="1"/>
+      <w:numFmt w:val="bullet"/>
+      <w:lvlText w:val=""/>
+      <w:lvlJc w:val="left"/>
+      <w:pPr>
+        <w:tabs>
+          <w:tab w:val="num" w:pos="5760"/>
+        </w:tabs>
+        <w:ind w:left="5760" w:hanging="360"/>
+      </w:pPr>
+      <w:rPr>
+        <w:rFonts w:ascii="Wingdings" w:hAnsi="Wingdings" w:hint="default"/>
+        <w:sz w:val="20"/>
+      </w:rPr>
+    </w:lvl>
+    <w:lvl w:ilvl="8" w:tentative="1">
+      <w:start w:val="1"/>
+      <w:numFmt w:val="bullet"/>
+      <w:lvlText w:val=""/>
+      <w:lvlJc w:val="left"/>
+      <w:pPr>
+        <w:tabs>
+          <w:tab w:val="num" w:pos="6480"/>
+        </w:tabs>
+        <w:ind w:left="6480" w:hanging="360"/>
+      </w:pPr>
+      <w:rPr>
+        <w:rFonts w:ascii="Wingdings" w:hAnsi="Wingdings" w:hint="default"/>
+        <w:sz w:val="20"/>
+      </w:rPr>
+    </w:lvl>
+  </w:abstractNum>
+  <w:abstractNum w:abstractNumId="25" w15:restartNumberingAfterBreak="0">
     <w:nsid w:val="4B2C1177"/>
     <w:multiLevelType w:val="hybridMultilevel"/>
     <w:tmpl w:val="81B2F816"/>
@@ -3609,7 +6604,7 @@
       </w:rPr>
     </w:lvl>
   </w:abstractNum>
-  <w:abstractNum w:abstractNumId="20" w15:restartNumberingAfterBreak="0">
+  <w:abstractNum w:abstractNumId="26" w15:restartNumberingAfterBreak="0">
     <w:nsid w:val="4BF3A4AD"/>
     <w:multiLevelType w:val="hybridMultilevel"/>
     <w:tmpl w:val="A60ED518"/>
@@ -3722,7 +6717,7 @@
       </w:rPr>
     </w:lvl>
   </w:abstractNum>
-  <w:abstractNum w:abstractNumId="21" w15:restartNumberingAfterBreak="0">
+  <w:abstractNum w:abstractNumId="27" w15:restartNumberingAfterBreak="0">
     <w:nsid w:val="54438587"/>
     <w:multiLevelType w:val="hybridMultilevel"/>
     <w:tmpl w:val="DFCAF0AE"/>
@@ -3835,7 +6830,7 @@
       </w:rPr>
     </w:lvl>
   </w:abstractNum>
-  <w:abstractNum w:abstractNumId="22" w15:restartNumberingAfterBreak="0">
+  <w:abstractNum w:abstractNumId="28" w15:restartNumberingAfterBreak="0">
     <w:nsid w:val="57026F97"/>
     <w:multiLevelType w:val="hybridMultilevel"/>
     <w:tmpl w:val="DCE4A842"/>
@@ -3948,7 +6943,156 @@
       </w:rPr>
     </w:lvl>
   </w:abstractNum>
-  <w:abstractNum w:abstractNumId="23" w15:restartNumberingAfterBreak="0">
+  <w:abstractNum w:abstractNumId="29" w15:restartNumberingAfterBreak="0">
+    <w:nsid w:val="5958602C"/>
+    <w:multiLevelType w:val="multilevel"/>
+    <w:tmpl w:val="61A679E0"/>
+    <w:lvl w:ilvl="0">
+      <w:start w:val="1"/>
+      <w:numFmt w:val="bullet"/>
+      <w:lvlText w:val=""/>
+      <w:lvlJc w:val="left"/>
+      <w:pPr>
+        <w:tabs>
+          <w:tab w:val="num" w:pos="720"/>
+        </w:tabs>
+        <w:ind w:left="720" w:hanging="360"/>
+      </w:pPr>
+      <w:rPr>
+        <w:rFonts w:ascii="Symbol" w:hAnsi="Symbol" w:hint="default"/>
+        <w:sz w:val="20"/>
+      </w:rPr>
+    </w:lvl>
+    <w:lvl w:ilvl="1" w:tentative="1">
+      <w:start w:val="1"/>
+      <w:numFmt w:val="bullet"/>
+      <w:lvlText w:val="o"/>
+      <w:lvlJc w:val="left"/>
+      <w:pPr>
+        <w:tabs>
+          <w:tab w:val="num" w:pos="1440"/>
+        </w:tabs>
+        <w:ind w:left="1440" w:hanging="360"/>
+      </w:pPr>
+      <w:rPr>
+        <w:rFonts w:ascii="Courier New" w:hAnsi="Courier New" w:hint="default"/>
+        <w:sz w:val="20"/>
+      </w:rPr>
+    </w:lvl>
+    <w:lvl w:ilvl="2" w:tentative="1">
+      <w:start w:val="1"/>
+      <w:numFmt w:val="bullet"/>
+      <w:lvlText w:val=""/>
+      <w:lvlJc w:val="left"/>
+      <w:pPr>
+        <w:tabs>
+          <w:tab w:val="num" w:pos="2160"/>
+        </w:tabs>
+        <w:ind w:left="2160" w:hanging="360"/>
+      </w:pPr>
+      <w:rPr>
+        <w:rFonts w:ascii="Wingdings" w:hAnsi="Wingdings" w:hint="default"/>
+        <w:sz w:val="20"/>
+      </w:rPr>
+    </w:lvl>
+    <w:lvl w:ilvl="3" w:tentative="1">
+      <w:start w:val="1"/>
+      <w:numFmt w:val="bullet"/>
+      <w:lvlText w:val=""/>
+      <w:lvlJc w:val="left"/>
+      <w:pPr>
+        <w:tabs>
+          <w:tab w:val="num" w:pos="2880"/>
+        </w:tabs>
+        <w:ind w:left="2880" w:hanging="360"/>
+      </w:pPr>
+      <w:rPr>
+        <w:rFonts w:ascii="Wingdings" w:hAnsi="Wingdings" w:hint="default"/>
+        <w:sz w:val="20"/>
+      </w:rPr>
+    </w:lvl>
+    <w:lvl w:ilvl="4" w:tentative="1">
+      <w:start w:val="1"/>
+      <w:numFmt w:val="bullet"/>
+      <w:lvlText w:val=""/>
+      <w:lvlJc w:val="left"/>
+      <w:pPr>
+        <w:tabs>
+          <w:tab w:val="num" w:pos="3600"/>
+        </w:tabs>
+        <w:ind w:left="3600" w:hanging="360"/>
+      </w:pPr>
+      <w:rPr>
+        <w:rFonts w:ascii="Wingdings" w:hAnsi="Wingdings" w:hint="default"/>
+        <w:sz w:val="20"/>
+      </w:rPr>
+    </w:lvl>
+    <w:lvl w:ilvl="5" w:tentative="1">
+      <w:start w:val="1"/>
+      <w:numFmt w:val="bullet"/>
+      <w:lvlText w:val=""/>
+      <w:lvlJc w:val="left"/>
+      <w:pPr>
+        <w:tabs>
+          <w:tab w:val="num" w:pos="4320"/>
+        </w:tabs>
+        <w:ind w:left="4320" w:hanging="360"/>
+      </w:pPr>
+      <w:rPr>
+        <w:rFonts w:ascii="Wingdings" w:hAnsi="Wingdings" w:hint="default"/>
+        <w:sz w:val="20"/>
+      </w:rPr>
+    </w:lvl>
+    <w:lvl w:ilvl="6" w:tentative="1">
+      <w:start w:val="1"/>
+      <w:numFmt w:val="bullet"/>
+      <w:lvlText w:val=""/>
+      <w:lvlJc w:val="left"/>
+      <w:pPr>
+        <w:tabs>
+          <w:tab w:val="num" w:pos="5040"/>
+        </w:tabs>
+        <w:ind w:left="5040" w:hanging="360"/>
+      </w:pPr>
+      <w:rPr>
+        <w:rFonts w:ascii="Wingdings" w:hAnsi="Wingdings" w:hint="default"/>
+        <w:sz w:val="20"/>
+      </w:rPr>
+    </w:lvl>
+    <w:lvl w:ilvl="7" w:tentative="1">
+      <w:start w:val="1"/>
+      <w:numFmt w:val="bullet"/>
+      <w:lvlText w:val=""/>
+      <w:lvlJc w:val="left"/>
+      <w:pPr>
+        <w:tabs>
+          <w:tab w:val="num" w:pos="5760"/>
+        </w:tabs>
+        <w:ind w:left="5760" w:hanging="360"/>
+      </w:pPr>
+      <w:rPr>
+        <w:rFonts w:ascii="Wingdings" w:hAnsi="Wingdings" w:hint="default"/>
+        <w:sz w:val="20"/>
+      </w:rPr>
+    </w:lvl>
+    <w:lvl w:ilvl="8" w:tentative="1">
+      <w:start w:val="1"/>
+      <w:numFmt w:val="bullet"/>
+      <w:lvlText w:val=""/>
+      <w:lvlJc w:val="left"/>
+      <w:pPr>
+        <w:tabs>
+          <w:tab w:val="num" w:pos="6480"/>
+        </w:tabs>
+        <w:ind w:left="6480" w:hanging="360"/>
+      </w:pPr>
+      <w:rPr>
+        <w:rFonts w:ascii="Wingdings" w:hAnsi="Wingdings" w:hint="default"/>
+        <w:sz w:val="20"/>
+      </w:rPr>
+    </w:lvl>
+  </w:abstractNum>
+  <w:abstractNum w:abstractNumId="30" w15:restartNumberingAfterBreak="0">
     <w:nsid w:val="59CA3B7F"/>
     <w:multiLevelType w:val="hybridMultilevel"/>
     <w:tmpl w:val="CF78EDDA"/>
@@ -4061,7 +7205,7 @@
       </w:rPr>
     </w:lvl>
   </w:abstractNum>
-  <w:abstractNum w:abstractNumId="24" w15:restartNumberingAfterBreak="0">
+  <w:abstractNum w:abstractNumId="31" w15:restartNumberingAfterBreak="0">
     <w:nsid w:val="5C50A02C"/>
     <w:multiLevelType w:val="hybridMultilevel"/>
     <w:tmpl w:val="7F127C46"/>
@@ -4174,7 +7318,156 @@
       </w:rPr>
     </w:lvl>
   </w:abstractNum>
-  <w:abstractNum w:abstractNumId="25" w15:restartNumberingAfterBreak="0">
+  <w:abstractNum w:abstractNumId="32" w15:restartNumberingAfterBreak="0">
+    <w:nsid w:val="67643F7B"/>
+    <w:multiLevelType w:val="multilevel"/>
+    <w:tmpl w:val="21C62942"/>
+    <w:lvl w:ilvl="0">
+      <w:start w:val="1"/>
+      <w:numFmt w:val="bullet"/>
+      <w:lvlText w:val=""/>
+      <w:lvlJc w:val="left"/>
+      <w:pPr>
+        <w:tabs>
+          <w:tab w:val="num" w:pos="720"/>
+        </w:tabs>
+        <w:ind w:left="720" w:hanging="360"/>
+      </w:pPr>
+      <w:rPr>
+        <w:rFonts w:ascii="Symbol" w:hAnsi="Symbol" w:hint="default"/>
+        <w:sz w:val="20"/>
+      </w:rPr>
+    </w:lvl>
+    <w:lvl w:ilvl="1" w:tentative="1">
+      <w:start w:val="1"/>
+      <w:numFmt w:val="bullet"/>
+      <w:lvlText w:val="o"/>
+      <w:lvlJc w:val="left"/>
+      <w:pPr>
+        <w:tabs>
+          <w:tab w:val="num" w:pos="1440"/>
+        </w:tabs>
+        <w:ind w:left="1440" w:hanging="360"/>
+      </w:pPr>
+      <w:rPr>
+        <w:rFonts w:ascii="Courier New" w:hAnsi="Courier New" w:hint="default"/>
+        <w:sz w:val="20"/>
+      </w:rPr>
+    </w:lvl>
+    <w:lvl w:ilvl="2" w:tentative="1">
+      <w:start w:val="1"/>
+      <w:numFmt w:val="bullet"/>
+      <w:lvlText w:val=""/>
+      <w:lvlJc w:val="left"/>
+      <w:pPr>
+        <w:tabs>
+          <w:tab w:val="num" w:pos="2160"/>
+        </w:tabs>
+        <w:ind w:left="2160" w:hanging="360"/>
+      </w:pPr>
+      <w:rPr>
+        <w:rFonts w:ascii="Wingdings" w:hAnsi="Wingdings" w:hint="default"/>
+        <w:sz w:val="20"/>
+      </w:rPr>
+    </w:lvl>
+    <w:lvl w:ilvl="3" w:tentative="1">
+      <w:start w:val="1"/>
+      <w:numFmt w:val="bullet"/>
+      <w:lvlText w:val=""/>
+      <w:lvlJc w:val="left"/>
+      <w:pPr>
+        <w:tabs>
+          <w:tab w:val="num" w:pos="2880"/>
+        </w:tabs>
+        <w:ind w:left="2880" w:hanging="360"/>
+      </w:pPr>
+      <w:rPr>
+        <w:rFonts w:ascii="Wingdings" w:hAnsi="Wingdings" w:hint="default"/>
+        <w:sz w:val="20"/>
+      </w:rPr>
+    </w:lvl>
+    <w:lvl w:ilvl="4" w:tentative="1">
+      <w:start w:val="1"/>
+      <w:numFmt w:val="bullet"/>
+      <w:lvlText w:val=""/>
+      <w:lvlJc w:val="left"/>
+      <w:pPr>
+        <w:tabs>
+          <w:tab w:val="num" w:pos="3600"/>
+        </w:tabs>
+        <w:ind w:left="3600" w:hanging="360"/>
+      </w:pPr>
+      <w:rPr>
+        <w:rFonts w:ascii="Wingdings" w:hAnsi="Wingdings" w:hint="default"/>
+        <w:sz w:val="20"/>
+      </w:rPr>
+    </w:lvl>
+    <w:lvl w:ilvl="5" w:tentative="1">
+      <w:start w:val="1"/>
+      <w:numFmt w:val="bullet"/>
+      <w:lvlText w:val=""/>
+      <w:lvlJc w:val="left"/>
+      <w:pPr>
+        <w:tabs>
+          <w:tab w:val="num" w:pos="4320"/>
+        </w:tabs>
+        <w:ind w:left="4320" w:hanging="360"/>
+      </w:pPr>
+      <w:rPr>
+        <w:rFonts w:ascii="Wingdings" w:hAnsi="Wingdings" w:hint="default"/>
+        <w:sz w:val="20"/>
+      </w:rPr>
+    </w:lvl>
+    <w:lvl w:ilvl="6" w:tentative="1">
+      <w:start w:val="1"/>
+      <w:numFmt w:val="bullet"/>
+      <w:lvlText w:val=""/>
+      <w:lvlJc w:val="left"/>
+      <w:pPr>
+        <w:tabs>
+          <w:tab w:val="num" w:pos="5040"/>
+        </w:tabs>
+        <w:ind w:left="5040" w:hanging="360"/>
+      </w:pPr>
+      <w:rPr>
+        <w:rFonts w:ascii="Wingdings" w:hAnsi="Wingdings" w:hint="default"/>
+        <w:sz w:val="20"/>
+      </w:rPr>
+    </w:lvl>
+    <w:lvl w:ilvl="7" w:tentative="1">
+      <w:start w:val="1"/>
+      <w:numFmt w:val="bullet"/>
+      <w:lvlText w:val=""/>
+      <w:lvlJc w:val="left"/>
+      <w:pPr>
+        <w:tabs>
+          <w:tab w:val="num" w:pos="5760"/>
+        </w:tabs>
+        <w:ind w:left="5760" w:hanging="360"/>
+      </w:pPr>
+      <w:rPr>
+        <w:rFonts w:ascii="Wingdings" w:hAnsi="Wingdings" w:hint="default"/>
+        <w:sz w:val="20"/>
+      </w:rPr>
+    </w:lvl>
+    <w:lvl w:ilvl="8" w:tentative="1">
+      <w:start w:val="1"/>
+      <w:numFmt w:val="bullet"/>
+      <w:lvlText w:val=""/>
+      <w:lvlJc w:val="left"/>
+      <w:pPr>
+        <w:tabs>
+          <w:tab w:val="num" w:pos="6480"/>
+        </w:tabs>
+        <w:ind w:left="6480" w:hanging="360"/>
+      </w:pPr>
+      <w:rPr>
+        <w:rFonts w:ascii="Wingdings" w:hAnsi="Wingdings" w:hint="default"/>
+        <w:sz w:val="20"/>
+      </w:rPr>
+    </w:lvl>
+  </w:abstractNum>
+  <w:abstractNum w:abstractNumId="33" w15:restartNumberingAfterBreak="0">
     <w:nsid w:val="71A78A86"/>
     <w:multiLevelType w:val="multilevel"/>
     <w:tmpl w:val="26AAA81E"/>
@@ -4287,7 +7580,7 @@
       </w:rPr>
     </w:lvl>
   </w:abstractNum>
-  <w:abstractNum w:abstractNumId="26" w15:restartNumberingAfterBreak="0">
+  <w:abstractNum w:abstractNumId="34" w15:restartNumberingAfterBreak="0">
     <w:nsid w:val="73978CE7"/>
     <w:multiLevelType w:val="hybridMultilevel"/>
     <w:tmpl w:val="F1F25E58"/>
@@ -4400,7 +7693,7 @@
       </w:rPr>
     </w:lvl>
   </w:abstractNum>
-  <w:abstractNum w:abstractNumId="27" w15:restartNumberingAfterBreak="0">
+  <w:abstractNum w:abstractNumId="35" w15:restartNumberingAfterBreak="0">
     <w:nsid w:val="75A098AE"/>
     <w:multiLevelType w:val="hybridMultilevel"/>
     <w:tmpl w:val="C21AD030"/>
@@ -4513,7 +7806,7 @@
       </w:rPr>
     </w:lvl>
   </w:abstractNum>
-  <w:abstractNum w:abstractNumId="28" w15:restartNumberingAfterBreak="0">
+  <w:abstractNum w:abstractNumId="36" w15:restartNumberingAfterBreak="0">
     <w:nsid w:val="75ED35CC"/>
     <w:multiLevelType w:val="hybridMultilevel"/>
     <w:tmpl w:val="FFBC7C5A"/>
@@ -4626,7 +7919,7 @@
       </w:rPr>
     </w:lvl>
   </w:abstractNum>
-  <w:abstractNum w:abstractNumId="29" w15:restartNumberingAfterBreak="0">
+  <w:abstractNum w:abstractNumId="37" w15:restartNumberingAfterBreak="0">
     <w:nsid w:val="7877C787"/>
     <w:multiLevelType w:val="hybridMultilevel"/>
     <w:tmpl w:val="463E1D82"/>
@@ -4739,7 +8032,156 @@
       </w:rPr>
     </w:lvl>
   </w:abstractNum>
-  <w:abstractNum w:abstractNumId="30" w15:restartNumberingAfterBreak="0">
+  <w:abstractNum w:abstractNumId="38" w15:restartNumberingAfterBreak="0">
+    <w:nsid w:val="78B80D1E"/>
+    <w:multiLevelType w:val="multilevel"/>
+    <w:tmpl w:val="D7A45B58"/>
+    <w:lvl w:ilvl="0">
+      <w:start w:val="1"/>
+      <w:numFmt w:val="bullet"/>
+      <w:lvlText w:val=""/>
+      <w:lvlJc w:val="left"/>
+      <w:pPr>
+        <w:tabs>
+          <w:tab w:val="num" w:pos="720"/>
+        </w:tabs>
+        <w:ind w:left="720" w:hanging="360"/>
+      </w:pPr>
+      <w:rPr>
+        <w:rFonts w:ascii="Symbol" w:hAnsi="Symbol" w:hint="default"/>
+        <w:sz w:val="20"/>
+      </w:rPr>
+    </w:lvl>
+    <w:lvl w:ilvl="1">
+      <w:start w:val="1"/>
+      <w:numFmt w:val="bullet"/>
+      <w:lvlText w:val="o"/>
+      <w:lvlJc w:val="left"/>
+      <w:pPr>
+        <w:tabs>
+          <w:tab w:val="num" w:pos="1440"/>
+        </w:tabs>
+        <w:ind w:left="1440" w:hanging="360"/>
+      </w:pPr>
+      <w:rPr>
+        <w:rFonts w:ascii="Courier New" w:hAnsi="Courier New" w:hint="default"/>
+        <w:sz w:val="20"/>
+      </w:rPr>
+    </w:lvl>
+    <w:lvl w:ilvl="2" w:tentative="1">
+      <w:start w:val="1"/>
+      <w:numFmt w:val="bullet"/>
+      <w:lvlText w:val=""/>
+      <w:lvlJc w:val="left"/>
+      <w:pPr>
+        <w:tabs>
+          <w:tab w:val="num" w:pos="2160"/>
+        </w:tabs>
+        <w:ind w:left="2160" w:hanging="360"/>
+      </w:pPr>
+      <w:rPr>
+        <w:rFonts w:ascii="Wingdings" w:hAnsi="Wingdings" w:hint="default"/>
+        <w:sz w:val="20"/>
+      </w:rPr>
+    </w:lvl>
+    <w:lvl w:ilvl="3" w:tentative="1">
+      <w:start w:val="1"/>
+      <w:numFmt w:val="bullet"/>
+      <w:lvlText w:val=""/>
+      <w:lvlJc w:val="left"/>
+      <w:pPr>
+        <w:tabs>
+          <w:tab w:val="num" w:pos="2880"/>
+        </w:tabs>
+        <w:ind w:left="2880" w:hanging="360"/>
+      </w:pPr>
+      <w:rPr>
+        <w:rFonts w:ascii="Wingdings" w:hAnsi="Wingdings" w:hint="default"/>
+        <w:sz w:val="20"/>
+      </w:rPr>
+    </w:lvl>
+    <w:lvl w:ilvl="4" w:tentative="1">
+      <w:start w:val="1"/>
+      <w:numFmt w:val="bullet"/>
+      <w:lvlText w:val=""/>
+      <w:lvlJc w:val="left"/>
+      <w:pPr>
+        <w:tabs>
+          <w:tab w:val="num" w:pos="3600"/>
+        </w:tabs>
+        <w:ind w:left="3600" w:hanging="360"/>
+      </w:pPr>
+      <w:rPr>
+        <w:rFonts w:ascii="Wingdings" w:hAnsi="Wingdings" w:hint="default"/>
+        <w:sz w:val="20"/>
+      </w:rPr>
+    </w:lvl>
+    <w:lvl w:ilvl="5" w:tentative="1">
+      <w:start w:val="1"/>
+      <w:numFmt w:val="bullet"/>
+      <w:lvlText w:val=""/>
+      <w:lvlJc w:val="left"/>
+      <w:pPr>
+        <w:tabs>
+          <w:tab w:val="num" w:pos="4320"/>
+        </w:tabs>
+        <w:ind w:left="4320" w:hanging="360"/>
+      </w:pPr>
+      <w:rPr>
+        <w:rFonts w:ascii="Wingdings" w:hAnsi="Wingdings" w:hint="default"/>
+        <w:sz w:val="20"/>
+      </w:rPr>
+    </w:lvl>
+    <w:lvl w:ilvl="6" w:tentative="1">
+      <w:start w:val="1"/>
+      <w:numFmt w:val="bullet"/>
+      <w:lvlText w:val=""/>
+      <w:lvlJc w:val="left"/>
+      <w:pPr>
+        <w:tabs>
+          <w:tab w:val="num" w:pos="5040"/>
+        </w:tabs>
+        <w:ind w:left="5040" w:hanging="360"/>
+      </w:pPr>
+      <w:rPr>
+        <w:rFonts w:ascii="Wingdings" w:hAnsi="Wingdings" w:hint="default"/>
+        <w:sz w:val="20"/>
+      </w:rPr>
+    </w:lvl>
+    <w:lvl w:ilvl="7" w:tentative="1">
+      <w:start w:val="1"/>
+      <w:numFmt w:val="bullet"/>
+      <w:lvlText w:val=""/>
+      <w:lvlJc w:val="left"/>
+      <w:pPr>
+        <w:tabs>
+          <w:tab w:val="num" w:pos="5760"/>
+        </w:tabs>
+        <w:ind w:left="5760" w:hanging="360"/>
+      </w:pPr>
+      <w:rPr>
+        <w:rFonts w:ascii="Wingdings" w:hAnsi="Wingdings" w:hint="default"/>
+        <w:sz w:val="20"/>
+      </w:rPr>
+    </w:lvl>
+    <w:lvl w:ilvl="8" w:tentative="1">
+      <w:start w:val="1"/>
+      <w:numFmt w:val="bullet"/>
+      <w:lvlText w:val=""/>
+      <w:lvlJc w:val="left"/>
+      <w:pPr>
+        <w:tabs>
+          <w:tab w:val="num" w:pos="6480"/>
+        </w:tabs>
+        <w:ind w:left="6480" w:hanging="360"/>
+      </w:pPr>
+      <w:rPr>
+        <w:rFonts w:ascii="Wingdings" w:hAnsi="Wingdings" w:hint="default"/>
+        <w:sz w:val="20"/>
+      </w:rPr>
+    </w:lvl>
+  </w:abstractNum>
+  <w:abstractNum w:abstractNumId="39" w15:restartNumberingAfterBreak="0">
     <w:nsid w:val="79A27DAE"/>
     <w:multiLevelType w:val="hybridMultilevel"/>
     <w:tmpl w:val="FFFFFFFF"/>
@@ -4826,97 +8268,124 @@
     </w:lvl>
   </w:abstractNum>
   <w:num w:numId="1">
-    <w:abstractNumId w:val="24"/>
+    <w:abstractNumId w:val="31"/>
   </w:num>
   <w:num w:numId="2">
+    <w:abstractNumId w:val="33"/>
+  </w:num>
+  <w:num w:numId="3">
     <w:abstractNumId w:val="25"/>
   </w:num>
-  <w:num w:numId="3">
-    <w:abstractNumId w:val="19"/>
-  </w:num>
   <w:num w:numId="4">
-    <w:abstractNumId w:val="17"/>
+    <w:abstractNumId w:val="21"/>
   </w:num>
   <w:num w:numId="5">
-    <w:abstractNumId w:val="23"/>
+    <w:abstractNumId w:val="30"/>
   </w:num>
   <w:num w:numId="6">
     <w:abstractNumId w:val="2"/>
   </w:num>
   <w:num w:numId="7">
+    <w:abstractNumId w:val="36"/>
+  </w:num>
+  <w:num w:numId="8">
     <w:abstractNumId w:val="28"/>
   </w:num>
-  <w:num w:numId="8">
-    <w:abstractNumId w:val="22"/>
-  </w:num>
   <w:num w:numId="9">
-    <w:abstractNumId w:val="15"/>
+    <w:abstractNumId w:val="19"/>
   </w:num>
   <w:num w:numId="10">
-    <w:abstractNumId w:val="5"/>
+    <w:abstractNumId w:val="7"/>
   </w:num>
   <w:num w:numId="11">
-    <w:abstractNumId w:val="6"/>
+    <w:abstractNumId w:val="8"/>
   </w:num>
   <w:num w:numId="12">
-    <w:abstractNumId w:val="30"/>
+    <w:abstractNumId w:val="39"/>
   </w:num>
   <w:num w:numId="13">
-    <w:abstractNumId w:val="27"/>
+    <w:abstractNumId w:val="35"/>
   </w:num>
   <w:num w:numId="14">
-    <w:abstractNumId w:val="12"/>
+    <w:abstractNumId w:val="16"/>
   </w:num>
   <w:num w:numId="15">
-    <w:abstractNumId w:val="3"/>
+    <w:abstractNumId w:val="5"/>
   </w:num>
   <w:num w:numId="16">
     <w:abstractNumId w:val="0"/>
   </w:num>
   <w:num w:numId="17">
-    <w:abstractNumId w:val="10"/>
+    <w:abstractNumId w:val="13"/>
   </w:num>
   <w:num w:numId="18">
-    <w:abstractNumId w:val="13"/>
+    <w:abstractNumId w:val="17"/>
   </w:num>
   <w:num w:numId="19">
-    <w:abstractNumId w:val="16"/>
+    <w:abstractNumId w:val="20"/>
   </w:num>
   <w:num w:numId="20">
-    <w:abstractNumId w:val="14"/>
+    <w:abstractNumId w:val="18"/>
   </w:num>
   <w:num w:numId="21">
-    <w:abstractNumId w:val="9"/>
+    <w:abstractNumId w:val="12"/>
   </w:num>
   <w:num w:numId="22">
-    <w:abstractNumId w:val="11"/>
+    <w:abstractNumId w:val="15"/>
   </w:num>
   <w:num w:numId="23">
     <w:abstractNumId w:val="1"/>
   </w:num>
   <w:num w:numId="24">
+    <w:abstractNumId w:val="34"/>
+  </w:num>
+  <w:num w:numId="25">
+    <w:abstractNumId w:val="11"/>
+  </w:num>
+  <w:num w:numId="26">
+    <w:abstractNumId w:val="10"/>
+  </w:num>
+  <w:num w:numId="27">
+    <w:abstractNumId w:val="23"/>
+  </w:num>
+  <w:num w:numId="28">
+    <w:abstractNumId w:val="6"/>
+  </w:num>
+  <w:num w:numId="29">
+    <w:abstractNumId w:val="37"/>
+  </w:num>
+  <w:num w:numId="30">
     <w:abstractNumId w:val="26"/>
   </w:num>
-  <w:num w:numId="25">
-    <w:abstractNumId w:val="8"/>
+  <w:num w:numId="31">
+    <w:abstractNumId w:val="27"/>
   </w:num>
-  <w:num w:numId="26">
-    <w:abstractNumId w:val="7"/>
+  <w:num w:numId="32">
+    <w:abstractNumId w:val="3"/>
   </w:num>
-  <w:num w:numId="27">
-    <w:abstractNumId w:val="18"/>
+  <w:num w:numId="33">
+    <w:abstractNumId w:val="22"/>
   </w:num>
-  <w:num w:numId="28">
+  <w:num w:numId="34">
+    <w:abstractNumId w:val="32"/>
+  </w:num>
+  <w:num w:numId="35">
+    <w:abstractNumId w:val="9"/>
+  </w:num>
+  <w:num w:numId="36">
+    <w:abstractNumId w:val="29"/>
+  </w:num>
+  <w:num w:numId="37">
     <w:abstractNumId w:val="4"/>
   </w:num>
-  <w:num w:numId="29">
-    <w:abstractNumId w:val="29"/>
+  <w:num w:numId="38">
+    <w:abstractNumId w:val="14"/>
   </w:num>
-  <w:num w:numId="30">
-    <w:abstractNumId w:val="20"/>
+  <w:num w:numId="39">
+    <w:abstractNumId w:val="38"/>
   </w:num>
-  <w:num w:numId="31">
-    <w:abstractNumId w:val="21"/>
+  <w:num w:numId="40">
+    <w:abstractNumId w:val="24"/>
   </w:num>
 </w:numbering>
 </file>
@@ -5314,7 +8783,7 @@
   <w:style w:type="paragraph" w:default="1" w:styleId="Normal">
     <w:name w:val="Normal"/>
     <w:qFormat/>
-    <w:rsid w:val="00F86553"/>
+    <w:rsid w:val="00730C60"/>
   </w:style>
   <w:style w:type="paragraph" w:styleId="Heading1">
     <w:name w:val="heading 1"/>
@@ -5554,6 +9023,51 @@
       <w:color w:val="96607D" w:themeColor="followedHyperlink"/>
       <w:u w:val="single"/>
     </w:rPr>
+  </w:style>
+  <w:style w:type="character" w:customStyle="1" w:styleId="katex-mathml">
+    <w:name w:val="katex-mathml"/>
+    <w:basedOn w:val="DefaultParagraphFont"/>
+    <w:rsid w:val="001C70E3"/>
+  </w:style>
+  <w:style w:type="character" w:customStyle="1" w:styleId="mord">
+    <w:name w:val="mord"/>
+    <w:basedOn w:val="DefaultParagraphFont"/>
+    <w:rsid w:val="001C70E3"/>
+  </w:style>
+  <w:style w:type="character" w:customStyle="1" w:styleId="vlist-s">
+    <w:name w:val="vlist-s"/>
+    <w:basedOn w:val="DefaultParagraphFont"/>
+    <w:rsid w:val="001C70E3"/>
+  </w:style>
+  <w:style w:type="character" w:customStyle="1" w:styleId="mrel">
+    <w:name w:val="mrel"/>
+    <w:basedOn w:val="DefaultParagraphFont"/>
+    <w:rsid w:val="001C70E3"/>
+  </w:style>
+  <w:style w:type="character" w:customStyle="1" w:styleId="delimsizing">
+    <w:name w:val="delimsizing"/>
+    <w:basedOn w:val="DefaultParagraphFont"/>
+    <w:rsid w:val="001C70E3"/>
+  </w:style>
+  <w:style w:type="character" w:customStyle="1" w:styleId="mop">
+    <w:name w:val="mop"/>
+    <w:basedOn w:val="DefaultParagraphFont"/>
+    <w:rsid w:val="001C70E3"/>
+  </w:style>
+  <w:style w:type="character" w:customStyle="1" w:styleId="mbin">
+    <w:name w:val="mbin"/>
+    <w:basedOn w:val="DefaultParagraphFont"/>
+    <w:rsid w:val="001C70E3"/>
+  </w:style>
+  <w:style w:type="character" w:customStyle="1" w:styleId="mopen">
+    <w:name w:val="mopen"/>
+    <w:basedOn w:val="DefaultParagraphFont"/>
+    <w:rsid w:val="001C70E3"/>
+  </w:style>
+  <w:style w:type="character" w:customStyle="1" w:styleId="mclose">
+    <w:name w:val="mclose"/>
+    <w:basedOn w:val="DefaultParagraphFont"/>
+    <w:rsid w:val="001C70E3"/>
   </w:style>
 </w:styles>
 </file>
@@ -5824,7 +9338,7 @@
 </file>
 
 <file path=customXml/itemProps1.xml><?xml version="1.0" encoding="utf-8"?>
-<ds:datastoreItem xmlns:ds="http://schemas.openxmlformats.org/officeDocument/2006/customXml" ds:itemID="{4D658736-A096-427E-A44F-CD51B714D9EA}">
+<ds:datastoreItem xmlns:ds="http://schemas.openxmlformats.org/officeDocument/2006/customXml" ds:itemID="{B0BCB8EE-53E7-4A2B-B892-23067EA29A22}">
   <ds:schemaRefs>
     <ds:schemaRef ds:uri="http://schemas.openxmlformats.org/officeDocument/2006/bibliography"/>
   </ds:schemaRefs>

</xml_diff>

<commit_message>
Gerando novos valores de entrada
</commit_message>
<xml_diff>
--- a/relatorio.docx
+++ b/relatorio.docx
@@ -592,7 +592,7 @@
               <w:tab w:val="right" w:leader="dot" w:pos="9016"/>
             </w:tabs>
             <w:rPr>
-              <w:rFonts w:eastAsiaTheme="minorEastAsia"/>
+              <w:rFonts w:eastAsiaTheme="minorEastAsia" w:hint="eastAsia"/>
               <w:noProof/>
               <w:sz w:val="22"/>
               <w:szCs w:val="22"/>
@@ -665,7 +665,7 @@
               <w:tab w:val="right" w:leader="dot" w:pos="9016"/>
             </w:tabs>
             <w:rPr>
-              <w:rFonts w:eastAsiaTheme="minorEastAsia"/>
+              <w:rFonts w:eastAsiaTheme="minorEastAsia" w:hint="eastAsia"/>
               <w:noProof/>
               <w:sz w:val="22"/>
               <w:szCs w:val="22"/>
@@ -738,7 +738,7 @@
               <w:tab w:val="right" w:leader="dot" w:pos="9016"/>
             </w:tabs>
             <w:rPr>
-              <w:rFonts w:eastAsiaTheme="minorEastAsia"/>
+              <w:rFonts w:eastAsiaTheme="minorEastAsia" w:hint="eastAsia"/>
               <w:noProof/>
               <w:sz w:val="22"/>
               <w:szCs w:val="22"/>
@@ -811,7 +811,7 @@
               <w:tab w:val="right" w:leader="dot" w:pos="9016"/>
             </w:tabs>
             <w:rPr>
-              <w:rFonts w:eastAsiaTheme="minorEastAsia"/>
+              <w:rFonts w:eastAsiaTheme="minorEastAsia" w:hint="eastAsia"/>
               <w:noProof/>
               <w:sz w:val="22"/>
               <w:szCs w:val="22"/>
@@ -908,10 +908,6 @@
       <w:bookmarkStart w:id="14" w:name="_Toc226397506"/>
     </w:p>
     <w:p/>
-    <w:p>
-      <w:bookmarkStart w:id="15" w:name="_GoBack"/>
-      <w:bookmarkEnd w:id="15"/>
-    </w:p>
     <w:p/>
     <w:p/>
     <w:p/>
@@ -928,12 +924,21 @@
       <w:pPr>
         <w:pStyle w:val="Heading1"/>
         <w:rPr>
-          <w:rFonts w:ascii="Times New Roman" w:hAnsi="Times New Roman" w:cs="Times New Roman"/>
+          <w:rFonts w:asciiTheme="minorHAnsi" w:eastAsiaTheme="minorHAnsi" w:hAnsiTheme="minorHAnsi" w:cstheme="minorBidi"/>
+          <w:color w:val="auto"/>
           <w:sz w:val="24"/>
           <w:szCs w:val="24"/>
         </w:rPr>
       </w:pPr>
     </w:p>
+    <w:p/>
+    <w:p/>
+    <w:p/>
+    <w:p/>
+    <w:p>
+      <w:bookmarkStart w:id="15" w:name="_GoBack"/>
+      <w:bookmarkEnd w:id="15"/>
+    </w:p>
     <w:p>
       <w:pPr>
         <w:pStyle w:val="Heading1"/>
@@ -943,42 +948,13 @@
           <w:szCs w:val="24"/>
         </w:rPr>
       </w:pPr>
-    </w:p>
-    <w:p>
-      <w:pPr>
-        <w:pStyle w:val="Heading1"/>
+      <w:r>
         <w:rPr>
           <w:rFonts w:ascii="Times New Roman" w:hAnsi="Times New Roman" w:cs="Times New Roman"/>
           <w:sz w:val="24"/>
           <w:szCs w:val="24"/>
         </w:rPr>
-      </w:pPr>
-    </w:p>
-    <w:p>
-      <w:pPr>
-        <w:pStyle w:val="Heading1"/>
-        <w:rPr>
-          <w:rFonts w:ascii="Times New Roman" w:hAnsi="Times New Roman" w:cs="Times New Roman"/>
-          <w:sz w:val="24"/>
-          <w:szCs w:val="24"/>
-        </w:rPr>
-      </w:pPr>
-    </w:p>
-    <w:p>
-      <w:pPr>
-        <w:pStyle w:val="Heading1"/>
-        <w:rPr>
-          <w:rFonts w:ascii="Times New Roman" w:hAnsi="Times New Roman" w:cs="Times New Roman"/>
-          <w:sz w:val="24"/>
-          <w:szCs w:val="24"/>
-        </w:rPr>
-      </w:pPr>
-      <w:r>
-        <w:rPr>
-          <w:rFonts w:ascii="Times New Roman" w:hAnsi="Times New Roman" w:cs="Times New Roman"/>
-          <w:sz w:val="24"/>
-          <w:szCs w:val="24"/>
-        </w:rPr>
+        <w:lastRenderedPageBreak/>
         <w:t>1 Introdução</w:t>
       </w:r>
       <w:bookmarkEnd w:id="14"/>
@@ -1211,14 +1187,7 @@
         <w:rPr>
           <w:rFonts w:ascii="Times New Roman" w:hAnsi="Times New Roman" w:cs="Times New Roman"/>
         </w:rPr>
-        <w:t xml:space="preserve"> sistemas capazes de simular habilidades cognitivas humanas, como raciocínio, aprendizado e </w:t>
-      </w:r>
-      <w:r>
-        <w:rPr>
-          <w:rFonts w:ascii="Times New Roman" w:hAnsi="Times New Roman" w:cs="Times New Roman"/>
-        </w:rPr>
-        <w:lastRenderedPageBreak/>
-        <w:t xml:space="preserve">tomada de decisão. </w:t>
+        <w:t xml:space="preserve"> sistemas capazes de simular habilidades cognitivas humanas, como raciocínio, aprendizado e tomada de decisão. </w:t>
       </w:r>
       <w:r>
         <w:rPr>
@@ -1474,6 +1443,7 @@
           <w:rFonts w:ascii="Times New Roman" w:eastAsia="Times New Roman" w:hAnsi="Times New Roman" w:cs="Times New Roman"/>
           <w:lang w:eastAsia="pt-BR"/>
         </w:rPr>
+        <w:lastRenderedPageBreak/>
         <w:t xml:space="preserve">De forma geral, uma RNA é constituída por camadas de neurônios organizadas em três tipos principais: camada de entrada, camadas ocultas e camada de saída. </w:t>
       </w:r>
       <w:r>
@@ -2426,11 +2396,7 @@
         <w:t>Hardware Description Languages</w:t>
       </w:r>
       <w:r>
-        <w:t xml:space="preserve"> – HDLs) desempenham um papel fundamental, sendo utilizadas para </w:t>
-      </w:r>
-      <w:r>
-        <w:lastRenderedPageBreak/>
-        <w:t xml:space="preserve">modelar circuitos digitais em diferentes níveis de abstração. Entre essas linguagens, destaca-se o Verilog, amplamente adotado na indústria e na academia para o desenvolvimento de sistemas </w:t>
+        <w:t xml:space="preserve"> – HDLs) desempenham um papel fundamental, sendo utilizadas para modelar circuitos digitais em diferentes níveis de abstração. Entre essas linguagens, destaca-se o Verilog, amplamente adotado na indústria e na academia para o desenvolvimento de sistemas </w:t>
       </w:r>
       <w:r>
         <w:t>digitais e circuitos integrados, permitindo</w:t>
@@ -2463,7 +2429,11 @@
         <w:t>hardware</w:t>
       </w:r>
       <w:r>
-        <w:t xml:space="preserve"> e a implementação em linguagem Verilog possibilita o desenvolvimento de sistemas capazes de executar tarefas de IA com maior eficiência, desempenho e baixo consumo energético. A adoção de arquiteturas especializadas, como as NPUs, aliada ao uso do </w:t>
+        <w:t xml:space="preserve"> e a implementação em linguagem Verilog possibilita o desenvolvimento de sistemas capazes de executar tarefas de IA com maior eficiência, desempenho e baixo consumo energético. A adoção de arquiteturas </w:t>
+      </w:r>
+      <w:r>
+        <w:lastRenderedPageBreak/>
+        <w:t xml:space="preserve">especializadas, como as NPUs, aliada ao uso do </w:t>
       </w:r>
       <w:r>
         <w:rPr>
@@ -2823,6 +2793,7 @@
           <w:sz w:val="24"/>
           <w:szCs w:val="24"/>
         </w:rPr>
+        <w:lastRenderedPageBreak/>
         <w:t>Referências bibliográficas</w:t>
       </w:r>
       <w:bookmarkEnd w:id="18"/>
@@ -9338,7 +9309,7 @@
 </file>
 
 <file path=customXml/itemProps1.xml><?xml version="1.0" encoding="utf-8"?>
-<ds:datastoreItem xmlns:ds="http://schemas.openxmlformats.org/officeDocument/2006/customXml" ds:itemID="{B0BCB8EE-53E7-4A2B-B892-23067EA29A22}">
+<ds:datastoreItem xmlns:ds="http://schemas.openxmlformats.org/officeDocument/2006/customXml" ds:itemID="{34B1C14A-6EDC-42A7-9CF7-EA2292785E28}">
   <ds:schemaRefs>
     <ds:schemaRef ds:uri="http://schemas.openxmlformats.org/officeDocument/2006/bibliography"/>
   </ds:schemaRefs>

</xml_diff>